<commit_message>
fix: lab2 report fix 2
</commit_message>
<xml_diff>
--- a/РСХД/Лаб2/P3331_P3332_Исупов_Никита_Александрович_Ястребов-Амирханов_Алекси_ЛР2.docx
+++ b/РСХД/Лаб2/P3331_P3332_Исупов_Никита_Александрович_Ястребов-Амирханов_Алекси_ЛР2.docx
@@ -3917,7 +3917,7 @@
           <w:rFonts w:ascii="Times New Roman" w:eastAsia="Times New Roman" w:hAnsi="Times New Roman" w:cs="Times New Roman"/>
           <w:sz w:val="28"/>
           <w:szCs w:val="28"/>
-          <w:lang w:val="ru-RU"/>
+          <w:lang w:val="en-US"/>
         </w:rPr>
       </w:pPr>
     </w:p>
@@ -3937,7 +3937,68 @@
           <w:szCs w:val="24"/>
           <w:lang w:val="ru-RU"/>
         </w:rPr>
-        <w:t>Для автоматического запуска дважды в сутки (в 00:00 и 12:00) в планировщик добавлена задача:</w:t>
+        <w:t xml:space="preserve">Для автоматического выполнения резервного копирования без ввода пароля используется </w:t>
+      </w:r>
+      <w:proofErr w:type="gramStart"/>
+      <w:r>
+        <w:rPr>
+          <w:rFonts w:ascii="Times New Roman" w:eastAsia="Times New Roman" w:hAnsi="Times New Roman" w:cs="Times New Roman"/>
+          <w:sz w:val="24"/>
+          <w:szCs w:val="24"/>
+          <w:lang w:val="ru-RU"/>
+        </w:rPr>
+        <w:t>файл .</w:t>
+      </w:r>
+      <w:proofErr w:type="spellStart"/>
+      <w:r>
+        <w:rPr>
+          <w:rFonts w:ascii="Times New Roman" w:eastAsia="Times New Roman" w:hAnsi="Times New Roman" w:cs="Times New Roman"/>
+          <w:sz w:val="24"/>
+          <w:szCs w:val="24"/>
+          <w:lang w:val="ru-RU"/>
+        </w:rPr>
+        <w:t>pgpass</w:t>
+      </w:r>
+      <w:proofErr w:type="spellEnd"/>
+      <w:proofErr w:type="gramEnd"/>
+      <w:r>
+        <w:rPr>
+          <w:rFonts w:ascii="Times New Roman" w:eastAsia="Times New Roman" w:hAnsi="Times New Roman" w:cs="Times New Roman"/>
+          <w:sz w:val="24"/>
+          <w:szCs w:val="24"/>
+          <w:lang w:val="ru-RU"/>
+        </w:rPr>
+        <w:t>.</w:t>
+      </w:r>
+      <w:r>
+        <w:rPr>
+          <w:rFonts w:ascii="Times New Roman" w:eastAsia="Times New Roman" w:hAnsi="Times New Roman" w:cs="Times New Roman"/>
+          <w:sz w:val="24"/>
+          <w:szCs w:val="24"/>
+          <w:lang w:val="ru-RU"/>
+        </w:rPr>
+        <w:br/>
+        <w:t>На основном сервере создан файл ~/.</w:t>
+      </w:r>
+      <w:proofErr w:type="spellStart"/>
+      <w:r>
+        <w:rPr>
+          <w:rFonts w:ascii="Times New Roman" w:eastAsia="Times New Roman" w:hAnsi="Times New Roman" w:cs="Times New Roman"/>
+          <w:sz w:val="24"/>
+          <w:szCs w:val="24"/>
+          <w:lang w:val="ru-RU"/>
+        </w:rPr>
+        <w:t>pgpass</w:t>
+      </w:r>
+      <w:proofErr w:type="spellEnd"/>
+      <w:r>
+        <w:rPr>
+          <w:rFonts w:ascii="Times New Roman" w:eastAsia="Times New Roman" w:hAnsi="Times New Roman" w:cs="Times New Roman"/>
+          <w:sz w:val="24"/>
+          <w:szCs w:val="24"/>
+          <w:lang w:val="ru-RU"/>
+        </w:rPr>
+        <w:t xml:space="preserve"> со строкой:</w:t>
       </w:r>
     </w:p>
     <w:tbl>
@@ -3956,6 +4017,7 @@
           </w:tcPr>
           <w:p>
             <w:pPr>
+              <w:spacing w:line="259" w:lineRule="auto"/>
               <w:rPr>
                 <w:rFonts w:ascii="Times New Roman" w:eastAsia="Times New Roman" w:hAnsi="Times New Roman" w:cs="Times New Roman"/>
                 <w:sz w:val="28"/>
@@ -3972,25 +4034,34 @@
               </w:rPr>
               <w:br/>
             </w:r>
-            <w:proofErr w:type="spellStart"/>
-            <w:r>
-              <w:rPr>
-                <w:rFonts w:ascii="Times New Roman" w:eastAsia="Times New Roman" w:hAnsi="Times New Roman" w:cs="Times New Roman"/>
-                <w:sz w:val="28"/>
-                <w:szCs w:val="28"/>
-                <w:lang w:val="ru-RU"/>
-              </w:rPr>
-              <w:t>crontab</w:t>
-            </w:r>
-            <w:proofErr w:type="spellEnd"/>
-            <w:r>
-              <w:rPr>
-                <w:rFonts w:ascii="Times New Roman" w:eastAsia="Times New Roman" w:hAnsi="Times New Roman" w:cs="Times New Roman"/>
-                <w:sz w:val="28"/>
-                <w:szCs w:val="28"/>
-                <w:lang w:val="ru-RU"/>
-              </w:rPr>
-              <w:t xml:space="preserve"> -e</w:t>
+            <w:r>
+              <w:rPr>
+                <w:rFonts w:ascii="Times New Roman" w:eastAsia="Times New Roman" w:hAnsi="Times New Roman" w:cs="Times New Roman"/>
+                <w:sz w:val="28"/>
+                <w:szCs w:val="28"/>
+                <w:lang w:val="en-US"/>
+              </w:rPr>
+              <w:t>pg</w:t>
+            </w:r>
+            <w:proofErr w:type="gramStart"/>
+            <w:r>
+              <w:rPr>
+                <w:rFonts w:ascii="Times New Roman" w:eastAsia="Times New Roman" w:hAnsi="Times New Roman" w:cs="Times New Roman"/>
+                <w:sz w:val="28"/>
+                <w:szCs w:val="28"/>
+                <w:lang w:val="en-US"/>
+              </w:rPr>
+              <w:t>197:9706:*</w:t>
+            </w:r>
+            <w:proofErr w:type="gramEnd"/>
+            <w:r>
+              <w:rPr>
+                <w:rFonts w:ascii="Times New Roman" w:eastAsia="Times New Roman" w:hAnsi="Times New Roman" w:cs="Times New Roman"/>
+                <w:sz w:val="28"/>
+                <w:szCs w:val="28"/>
+                <w:lang w:val="en-US"/>
+              </w:rPr>
+              <w:t>:postgres0:1234</w:t>
             </w:r>
             <w:r>
               <w:rPr>
@@ -4000,6 +4071,7 @@
                 <w:lang w:val="ru-RU"/>
               </w:rPr>
               <w:br/>
+              <w:t xml:space="preserve"> </w:t>
             </w:r>
           </w:p>
         </w:tc>
@@ -4009,56 +4081,128 @@
       <w:pPr>
         <w:rPr>
           <w:rFonts w:ascii="Times New Roman" w:eastAsia="Times New Roman" w:hAnsi="Times New Roman" w:cs="Times New Roman"/>
+          <w:sz w:val="24"/>
+          <w:szCs w:val="24"/>
+          <w:lang w:val="ru-RU"/>
+        </w:rPr>
+      </w:pPr>
+      <w:r>
+        <w:rPr>
+          <w:rFonts w:ascii="Times New Roman" w:eastAsia="Times New Roman" w:hAnsi="Times New Roman" w:cs="Times New Roman"/>
           <w:sz w:val="28"/>
           <w:szCs w:val="28"/>
-          <w:lang w:val="ru-RU"/>
-        </w:rPr>
-      </w:pPr>
+          <w:lang w:val="en-US"/>
+        </w:rPr>
+        <w:br/>
+      </w:r>
+      <w:r>
+        <w:rPr>
+          <w:rFonts w:ascii="Times New Roman" w:eastAsia="Times New Roman" w:hAnsi="Times New Roman" w:cs="Times New Roman"/>
+          <w:sz w:val="24"/>
+          <w:szCs w:val="24"/>
+          <w:lang w:val="ru-RU"/>
+        </w:rPr>
+        <w:t xml:space="preserve">После создания файла установлены права доступа </w:t>
+      </w:r>
+      <w:proofErr w:type="spellStart"/>
+      <w:r>
+        <w:rPr>
+          <w:rFonts w:ascii="Times New Roman" w:eastAsia="Times New Roman" w:hAnsi="Times New Roman" w:cs="Times New Roman"/>
+          <w:sz w:val="24"/>
+          <w:szCs w:val="24"/>
+          <w:lang w:val="ru-RU"/>
+        </w:rPr>
+        <w:t>chmod</w:t>
+      </w:r>
+      <w:proofErr w:type="spellEnd"/>
+      <w:r>
+        <w:rPr>
+          <w:rFonts w:ascii="Times New Roman" w:eastAsia="Times New Roman" w:hAnsi="Times New Roman" w:cs="Times New Roman"/>
+          <w:sz w:val="24"/>
+          <w:szCs w:val="24"/>
+          <w:lang w:val="ru-RU"/>
+        </w:rPr>
+        <w:t xml:space="preserve"> 600 ~</w:t>
+      </w:r>
+      <w:proofErr w:type="gramStart"/>
+      <w:r>
+        <w:rPr>
+          <w:rFonts w:ascii="Times New Roman" w:eastAsia="Times New Roman" w:hAnsi="Times New Roman" w:cs="Times New Roman"/>
+          <w:sz w:val="24"/>
+          <w:szCs w:val="24"/>
+          <w:lang w:val="ru-RU"/>
+        </w:rPr>
+        <w:t>/.</w:t>
+      </w:r>
+      <w:proofErr w:type="spellStart"/>
+      <w:r>
+        <w:rPr>
+          <w:rFonts w:ascii="Times New Roman" w:eastAsia="Times New Roman" w:hAnsi="Times New Roman" w:cs="Times New Roman"/>
+          <w:sz w:val="24"/>
+          <w:szCs w:val="24"/>
+          <w:lang w:val="ru-RU"/>
+        </w:rPr>
+        <w:t>pgpass</w:t>
+      </w:r>
+      <w:proofErr w:type="spellEnd"/>
+      <w:proofErr w:type="gramEnd"/>
+      <w:r>
+        <w:rPr>
+          <w:rFonts w:ascii="Times New Roman" w:eastAsia="Times New Roman" w:hAnsi="Times New Roman" w:cs="Times New Roman"/>
+          <w:sz w:val="24"/>
+          <w:szCs w:val="24"/>
+          <w:lang w:val="ru-RU"/>
+        </w:rPr>
+        <w:t xml:space="preserve">, иначе </w:t>
+      </w:r>
+      <w:proofErr w:type="spellStart"/>
+      <w:r>
+        <w:rPr>
+          <w:rFonts w:ascii="Times New Roman" w:eastAsia="Times New Roman" w:hAnsi="Times New Roman" w:cs="Times New Roman"/>
+          <w:sz w:val="24"/>
+          <w:szCs w:val="24"/>
+          <w:lang w:val="ru-RU"/>
+        </w:rPr>
+        <w:t>PostgreSQL</w:t>
+      </w:r>
+      <w:proofErr w:type="spellEnd"/>
+      <w:r>
+        <w:rPr>
+          <w:rFonts w:ascii="Times New Roman" w:eastAsia="Times New Roman" w:hAnsi="Times New Roman" w:cs="Times New Roman"/>
+          <w:sz w:val="24"/>
+          <w:szCs w:val="24"/>
+          <w:lang w:val="ru-RU"/>
+        </w:rPr>
+        <w:t xml:space="preserve"> его не использует.</w:t>
+      </w:r>
     </w:p>
     <w:p>
       <w:pPr>
         <w:rPr>
           <w:rFonts w:ascii="Times New Roman" w:eastAsia="Times New Roman" w:hAnsi="Times New Roman" w:cs="Times New Roman"/>
-          <w:sz w:val="24"/>
-          <w:szCs w:val="24"/>
-          <w:lang w:val="en-US"/>
-        </w:rPr>
-      </w:pPr>
-      <w:proofErr w:type="spellStart"/>
-      <w:r>
-        <w:rPr>
-          <w:rFonts w:ascii="Times New Roman" w:eastAsia="Times New Roman" w:hAnsi="Times New Roman" w:cs="Times New Roman"/>
-          <w:sz w:val="24"/>
-          <w:szCs w:val="24"/>
-        </w:rPr>
-        <w:t>Добавлена</w:t>
-      </w:r>
-      <w:proofErr w:type="spellEnd"/>
-      <w:r>
-        <w:rPr>
-          <w:rFonts w:ascii="Times New Roman" w:eastAsia="Times New Roman" w:hAnsi="Times New Roman" w:cs="Times New Roman"/>
-          <w:sz w:val="24"/>
-          <w:szCs w:val="24"/>
-        </w:rPr>
-        <w:t xml:space="preserve"> </w:t>
-      </w:r>
-      <w:proofErr w:type="spellStart"/>
-      <w:r>
-        <w:rPr>
-          <w:rFonts w:ascii="Times New Roman" w:eastAsia="Times New Roman" w:hAnsi="Times New Roman" w:cs="Times New Roman"/>
-          <w:sz w:val="24"/>
-          <w:szCs w:val="24"/>
-        </w:rPr>
-        <w:t>строка</w:t>
-      </w:r>
-      <w:proofErr w:type="spellEnd"/>
-      <w:r>
-        <w:rPr>
-          <w:rFonts w:ascii="Times New Roman" w:eastAsia="Times New Roman" w:hAnsi="Times New Roman" w:cs="Times New Roman"/>
-          <w:sz w:val="24"/>
-          <w:szCs w:val="24"/>
-        </w:rPr>
-        <w:t>:</w:t>
+          <w:sz w:val="28"/>
+          <w:szCs w:val="28"/>
+          <w:lang w:val="ru-RU"/>
+        </w:rPr>
+      </w:pPr>
+    </w:p>
+    <w:p>
+      <w:pPr>
+        <w:rPr>
+          <w:rFonts w:ascii="Times New Roman" w:eastAsia="Times New Roman" w:hAnsi="Times New Roman" w:cs="Times New Roman"/>
+          <w:sz w:val="24"/>
+          <w:szCs w:val="24"/>
+          <w:lang w:val="ru-RU"/>
+        </w:rPr>
+      </w:pPr>
+      <w:r>
+        <w:rPr>
+          <w:rFonts w:ascii="Times New Roman" w:eastAsia="Times New Roman" w:hAnsi="Times New Roman" w:cs="Times New Roman"/>
+          <w:sz w:val="24"/>
+          <w:szCs w:val="24"/>
+          <w:lang w:val="ru-RU"/>
+        </w:rPr>
+        <w:t>Для автоматического запуска дважды в сутки (в 00:00 и 12:00) в планировщик добавлена задача:</w:t>
       </w:r>
     </w:p>
     <w:tbl>
@@ -4081,37 +4225,17 @@
                 <w:rFonts w:ascii="Times New Roman" w:eastAsia="Times New Roman" w:hAnsi="Times New Roman" w:cs="Times New Roman"/>
                 <w:sz w:val="28"/>
                 <w:szCs w:val="28"/>
-                <w:lang w:val="en-US"/>
-              </w:rPr>
-            </w:pPr>
-            <w:r>
-              <w:rPr>
-                <w:rFonts w:ascii="Times New Roman" w:eastAsia="Times New Roman" w:hAnsi="Times New Roman" w:cs="Times New Roman"/>
-                <w:sz w:val="28"/>
-                <w:szCs w:val="28"/>
-                <w:lang w:val="en-US"/>
+                <w:lang w:val="ru-RU"/>
+              </w:rPr>
+            </w:pPr>
+            <w:r>
+              <w:rPr>
+                <w:rFonts w:ascii="Times New Roman" w:eastAsia="Times New Roman" w:hAnsi="Times New Roman" w:cs="Times New Roman"/>
+                <w:sz w:val="28"/>
+                <w:szCs w:val="28"/>
+                <w:lang w:val="ru-RU"/>
               </w:rPr>
               <w:br/>
-              <w:t xml:space="preserve">0 0,12 * * </w:t>
-            </w:r>
-            <w:r>
-              <w:rPr>
-                <w:rFonts w:ascii="Times New Roman" w:eastAsia="Times New Roman" w:hAnsi="Times New Roman" w:cs="Times New Roman"/>
-                <w:color w:val="000000" w:themeColor="text1"/>
-                <w:sz w:val="28"/>
-                <w:szCs w:val="28"/>
-                <w:lang w:val="en-US"/>
-              </w:rPr>
-              <w:t>*</w:t>
-            </w:r>
-            <w:r>
-              <w:rPr>
-                <w:rFonts w:ascii="Times New Roman" w:eastAsia="Times New Roman" w:hAnsi="Times New Roman" w:cs="Times New Roman"/>
-                <w:sz w:val="28"/>
-                <w:szCs w:val="28"/>
-                <w:lang w:val="en-US"/>
-              </w:rPr>
-              <w:t xml:space="preserve"> ~/</w:t>
             </w:r>
             <w:proofErr w:type="spellStart"/>
             <w:r>
@@ -4119,45 +4243,9 @@
                 <w:rFonts w:ascii="Times New Roman" w:eastAsia="Times New Roman" w:hAnsi="Times New Roman" w:cs="Times New Roman"/>
                 <w:sz w:val="28"/>
                 <w:szCs w:val="28"/>
-                <w:lang w:val="en-US"/>
-              </w:rPr>
-              <w:t>pg</w:t>
-            </w:r>
-            <w:r>
-              <w:rPr>
-                <w:rFonts w:ascii="Times New Roman" w:eastAsia="Times New Roman" w:hAnsi="Times New Roman" w:cs="Times New Roman"/>
-                <w:sz w:val="28"/>
-                <w:szCs w:val="28"/>
-                <w:lang w:val="en-US"/>
-              </w:rPr>
-              <w:t>_</w:t>
-            </w:r>
-            <w:r>
-              <w:rPr>
-                <w:rFonts w:ascii="Times New Roman" w:eastAsia="Times New Roman" w:hAnsi="Times New Roman" w:cs="Times New Roman"/>
-                <w:sz w:val="28"/>
-                <w:szCs w:val="28"/>
-                <w:lang w:val="en-US"/>
-              </w:rPr>
-              <w:t>backup</w:t>
-            </w:r>
-            <w:r>
-              <w:rPr>
-                <w:rFonts w:ascii="Times New Roman" w:eastAsia="Times New Roman" w:hAnsi="Times New Roman" w:cs="Times New Roman"/>
-                <w:sz w:val="28"/>
-                <w:szCs w:val="28"/>
-                <w:lang w:val="en-US"/>
-              </w:rPr>
-              <w:t>_</w:t>
-            </w:r>
-            <w:r>
-              <w:rPr>
-                <w:rFonts w:ascii="Times New Roman" w:eastAsia="Times New Roman" w:hAnsi="Times New Roman" w:cs="Times New Roman"/>
-                <w:sz w:val="28"/>
-                <w:szCs w:val="28"/>
-                <w:lang w:val="en-US"/>
-              </w:rPr>
-              <w:t>full</w:t>
+                <w:lang w:val="ru-RU"/>
+              </w:rPr>
+              <w:t>crontab</w:t>
             </w:r>
             <w:proofErr w:type="spellEnd"/>
             <w:r>
@@ -4165,52 +4253,16 @@
                 <w:rFonts w:ascii="Times New Roman" w:eastAsia="Times New Roman" w:hAnsi="Times New Roman" w:cs="Times New Roman"/>
                 <w:sz w:val="28"/>
                 <w:szCs w:val="28"/>
-                <w:lang w:val="en-US"/>
-              </w:rPr>
-              <w:t xml:space="preserve"> &gt;&gt; ~/</w:t>
-            </w:r>
-            <w:r>
-              <w:rPr>
-                <w:rFonts w:ascii="Times New Roman" w:eastAsia="Times New Roman" w:hAnsi="Times New Roman" w:cs="Times New Roman"/>
-                <w:sz w:val="28"/>
-                <w:szCs w:val="28"/>
-                <w:lang w:val="en-US"/>
-              </w:rPr>
-              <w:t>backup</w:t>
-            </w:r>
-            <w:r>
-              <w:rPr>
-                <w:rFonts w:ascii="Times New Roman" w:eastAsia="Times New Roman" w:hAnsi="Times New Roman" w:cs="Times New Roman"/>
-                <w:sz w:val="28"/>
-                <w:szCs w:val="28"/>
-                <w:lang w:val="en-US"/>
-              </w:rPr>
-              <w:t>.</w:t>
-            </w:r>
-            <w:r>
-              <w:rPr>
-                <w:rFonts w:ascii="Times New Roman" w:eastAsia="Times New Roman" w:hAnsi="Times New Roman" w:cs="Times New Roman"/>
-                <w:sz w:val="28"/>
-                <w:szCs w:val="28"/>
-                <w:lang w:val="en-US"/>
-              </w:rPr>
-              <w:t>log</w:t>
-            </w:r>
-            <w:r>
-              <w:rPr>
-                <w:rFonts w:ascii="Times New Roman" w:eastAsia="Times New Roman" w:hAnsi="Times New Roman" w:cs="Times New Roman"/>
-                <w:sz w:val="28"/>
-                <w:szCs w:val="28"/>
-                <w:lang w:val="en-US"/>
-              </w:rPr>
-              <w:t xml:space="preserve"> 2&gt;&amp;1</w:t>
-            </w:r>
-            <w:r>
-              <w:rPr>
-                <w:rFonts w:ascii="Times New Roman" w:eastAsia="Times New Roman" w:hAnsi="Times New Roman" w:cs="Times New Roman"/>
-                <w:sz w:val="28"/>
-                <w:szCs w:val="28"/>
-                <w:lang w:val="en-US"/>
+                <w:lang w:val="ru-RU"/>
+              </w:rPr>
+              <w:t xml:space="preserve"> -e</w:t>
+            </w:r>
+            <w:r>
+              <w:rPr>
+                <w:rFonts w:ascii="Times New Roman" w:eastAsia="Times New Roman" w:hAnsi="Times New Roman" w:cs="Times New Roman"/>
+                <w:sz w:val="28"/>
+                <w:szCs w:val="28"/>
+                <w:lang w:val="ru-RU"/>
               </w:rPr>
               <w:br/>
             </w:r>
@@ -4224,6 +4276,219 @@
           <w:rFonts w:ascii="Times New Roman" w:eastAsia="Times New Roman" w:hAnsi="Times New Roman" w:cs="Times New Roman"/>
           <w:sz w:val="28"/>
           <w:szCs w:val="28"/>
+          <w:lang w:val="ru-RU"/>
+        </w:rPr>
+      </w:pPr>
+    </w:p>
+    <w:p>
+      <w:pPr>
+        <w:rPr>
+          <w:rFonts w:ascii="Times New Roman" w:eastAsia="Times New Roman" w:hAnsi="Times New Roman" w:cs="Times New Roman"/>
+          <w:sz w:val="24"/>
+          <w:szCs w:val="24"/>
+          <w:lang w:val="en-US"/>
+        </w:rPr>
+      </w:pPr>
+      <w:proofErr w:type="spellStart"/>
+      <w:r>
+        <w:rPr>
+          <w:rFonts w:ascii="Times New Roman" w:eastAsia="Times New Roman" w:hAnsi="Times New Roman" w:cs="Times New Roman"/>
+          <w:sz w:val="24"/>
+          <w:szCs w:val="24"/>
+        </w:rPr>
+        <w:t>Добавлена</w:t>
+      </w:r>
+      <w:proofErr w:type="spellEnd"/>
+      <w:r>
+        <w:rPr>
+          <w:rFonts w:ascii="Times New Roman" w:eastAsia="Times New Roman" w:hAnsi="Times New Roman" w:cs="Times New Roman"/>
+          <w:sz w:val="24"/>
+          <w:szCs w:val="24"/>
+        </w:rPr>
+        <w:t xml:space="preserve"> </w:t>
+      </w:r>
+      <w:proofErr w:type="spellStart"/>
+      <w:r>
+        <w:rPr>
+          <w:rFonts w:ascii="Times New Roman" w:eastAsia="Times New Roman" w:hAnsi="Times New Roman" w:cs="Times New Roman"/>
+          <w:sz w:val="24"/>
+          <w:szCs w:val="24"/>
+        </w:rPr>
+        <w:t>строка</w:t>
+      </w:r>
+      <w:proofErr w:type="spellEnd"/>
+      <w:r>
+        <w:rPr>
+          <w:rFonts w:ascii="Times New Roman" w:eastAsia="Times New Roman" w:hAnsi="Times New Roman" w:cs="Times New Roman"/>
+          <w:sz w:val="24"/>
+          <w:szCs w:val="24"/>
+        </w:rPr>
+        <w:t>:</w:t>
+      </w:r>
+    </w:p>
+    <w:tbl>
+      <w:tblPr>
+        <w:tblStyle w:val="ad"/>
+        <w:tblW w:w="0" w:type="auto"/>
+        <w:tblLook w:val="04A0" w:firstRow="1" w:lastRow="0" w:firstColumn="1" w:lastColumn="0" w:noHBand="0" w:noVBand="1"/>
+      </w:tblPr>
+      <w:tblGrid>
+        <w:gridCol w:w="11328"/>
+      </w:tblGrid>
+      <w:tr>
+        <w:tc>
+          <w:tcPr>
+            <w:tcW w:w="11328" w:type="dxa"/>
+          </w:tcPr>
+          <w:p>
+            <w:pPr>
+              <w:rPr>
+                <w:rFonts w:ascii="Times New Roman" w:eastAsia="Times New Roman" w:hAnsi="Times New Roman" w:cs="Times New Roman"/>
+                <w:sz w:val="28"/>
+                <w:szCs w:val="28"/>
+                <w:lang w:val="en-US"/>
+              </w:rPr>
+            </w:pPr>
+            <w:r>
+              <w:rPr>
+                <w:rFonts w:ascii="Times New Roman" w:eastAsia="Times New Roman" w:hAnsi="Times New Roman" w:cs="Times New Roman"/>
+                <w:sz w:val="28"/>
+                <w:szCs w:val="28"/>
+                <w:lang w:val="en-US"/>
+              </w:rPr>
+              <w:br/>
+              <w:t xml:space="preserve">0 0,12 * * </w:t>
+            </w:r>
+            <w:r>
+              <w:rPr>
+                <w:rFonts w:ascii="Times New Roman" w:eastAsia="Times New Roman" w:hAnsi="Times New Roman" w:cs="Times New Roman"/>
+                <w:color w:val="000000" w:themeColor="text1"/>
+                <w:sz w:val="28"/>
+                <w:szCs w:val="28"/>
+                <w:lang w:val="en-US"/>
+              </w:rPr>
+              <w:t>*</w:t>
+            </w:r>
+            <w:r>
+              <w:rPr>
+                <w:rFonts w:ascii="Times New Roman" w:eastAsia="Times New Roman" w:hAnsi="Times New Roman" w:cs="Times New Roman"/>
+                <w:sz w:val="28"/>
+                <w:szCs w:val="28"/>
+                <w:lang w:val="en-US"/>
+              </w:rPr>
+              <w:t xml:space="preserve"> ~/</w:t>
+            </w:r>
+            <w:proofErr w:type="spellStart"/>
+            <w:r>
+              <w:rPr>
+                <w:rFonts w:ascii="Times New Roman" w:eastAsia="Times New Roman" w:hAnsi="Times New Roman" w:cs="Times New Roman"/>
+                <w:sz w:val="28"/>
+                <w:szCs w:val="28"/>
+                <w:lang w:val="en-US"/>
+              </w:rPr>
+              <w:t>pg</w:t>
+            </w:r>
+            <w:r>
+              <w:rPr>
+                <w:rFonts w:ascii="Times New Roman" w:eastAsia="Times New Roman" w:hAnsi="Times New Roman" w:cs="Times New Roman"/>
+                <w:sz w:val="28"/>
+                <w:szCs w:val="28"/>
+                <w:lang w:val="en-US"/>
+              </w:rPr>
+              <w:t>_</w:t>
+            </w:r>
+            <w:r>
+              <w:rPr>
+                <w:rFonts w:ascii="Times New Roman" w:eastAsia="Times New Roman" w:hAnsi="Times New Roman" w:cs="Times New Roman"/>
+                <w:sz w:val="28"/>
+                <w:szCs w:val="28"/>
+                <w:lang w:val="en-US"/>
+              </w:rPr>
+              <w:t>backup</w:t>
+            </w:r>
+            <w:r>
+              <w:rPr>
+                <w:rFonts w:ascii="Times New Roman" w:eastAsia="Times New Roman" w:hAnsi="Times New Roman" w:cs="Times New Roman"/>
+                <w:sz w:val="28"/>
+                <w:szCs w:val="28"/>
+                <w:lang w:val="en-US"/>
+              </w:rPr>
+              <w:t>_</w:t>
+            </w:r>
+            <w:r>
+              <w:rPr>
+                <w:rFonts w:ascii="Times New Roman" w:eastAsia="Times New Roman" w:hAnsi="Times New Roman" w:cs="Times New Roman"/>
+                <w:sz w:val="28"/>
+                <w:szCs w:val="28"/>
+                <w:lang w:val="en-US"/>
+              </w:rPr>
+              <w:t>full</w:t>
+            </w:r>
+            <w:proofErr w:type="spellEnd"/>
+            <w:r>
+              <w:rPr>
+                <w:rFonts w:ascii="Times New Roman" w:eastAsia="Times New Roman" w:hAnsi="Times New Roman" w:cs="Times New Roman"/>
+                <w:sz w:val="28"/>
+                <w:szCs w:val="28"/>
+                <w:lang w:val="en-US"/>
+              </w:rPr>
+              <w:t xml:space="preserve"> &gt;&gt; ~/</w:t>
+            </w:r>
+            <w:r>
+              <w:rPr>
+                <w:rFonts w:ascii="Times New Roman" w:eastAsia="Times New Roman" w:hAnsi="Times New Roman" w:cs="Times New Roman"/>
+                <w:sz w:val="28"/>
+                <w:szCs w:val="28"/>
+                <w:lang w:val="en-US"/>
+              </w:rPr>
+              <w:t>backup</w:t>
+            </w:r>
+            <w:r>
+              <w:rPr>
+                <w:rFonts w:ascii="Times New Roman" w:eastAsia="Times New Roman" w:hAnsi="Times New Roman" w:cs="Times New Roman"/>
+                <w:sz w:val="28"/>
+                <w:szCs w:val="28"/>
+                <w:lang w:val="en-US"/>
+              </w:rPr>
+              <w:t>.</w:t>
+            </w:r>
+            <w:r>
+              <w:rPr>
+                <w:rFonts w:ascii="Times New Roman" w:eastAsia="Times New Roman" w:hAnsi="Times New Roman" w:cs="Times New Roman"/>
+                <w:sz w:val="28"/>
+                <w:szCs w:val="28"/>
+                <w:lang w:val="en-US"/>
+              </w:rPr>
+              <w:t>log</w:t>
+            </w:r>
+            <w:r>
+              <w:rPr>
+                <w:rFonts w:ascii="Times New Roman" w:eastAsia="Times New Roman" w:hAnsi="Times New Roman" w:cs="Times New Roman"/>
+                <w:sz w:val="28"/>
+                <w:szCs w:val="28"/>
+                <w:lang w:val="en-US"/>
+              </w:rPr>
+              <w:t xml:space="preserve"> 2&gt;&amp;1</w:t>
+            </w:r>
+            <w:r>
+              <w:rPr>
+                <w:rFonts w:ascii="Times New Roman" w:eastAsia="Times New Roman" w:hAnsi="Times New Roman" w:cs="Times New Roman"/>
+                <w:sz w:val="28"/>
+                <w:szCs w:val="28"/>
+                <w:lang w:val="en-US"/>
+              </w:rPr>
+              <w:br/>
+            </w:r>
+          </w:p>
+        </w:tc>
+      </w:tr>
+    </w:tbl>
+    <w:p>
+      <w:pPr>
+        <w:rPr>
+          <w:rFonts w:ascii="Times New Roman" w:eastAsia="Times New Roman" w:hAnsi="Times New Roman" w:cs="Times New Roman"/>
+          <w:sz w:val="28"/>
+          <w:szCs w:val="28"/>
           <w:lang w:val="en-US"/>
         </w:rPr>
       </w:pPr>
@@ -4314,6 +4579,7 @@
           <w:szCs w:val="24"/>
           <w:lang w:val="ru-RU"/>
         </w:rPr>
+        <w:lastRenderedPageBreak/>
         <w:t>Средний объём изменённых данных за сутки: </w:t>
       </w:r>
       <w:r>
@@ -4512,7 +4778,6 @@
           <w:szCs w:val="24"/>
           <w:lang w:val="ru-RU"/>
         </w:rPr>
-        <w:lastRenderedPageBreak/>
         <w:t>Рост базы линейный: каждые сутки добавляется 300 МБ, значит между двумя последовательными бэкапами (с интервалом 12 часов) размер увеличивается на </w:t>
       </w:r>
       <w:r>
@@ -5713,6 +5978,7 @@
         <w:rPr>
           <w:noProof/>
         </w:rPr>
+        <w:lastRenderedPageBreak/>
         <w:drawing>
           <wp:inline distT="0" distB="0" distL="0" distR="0" wp14:anchorId="11A71496" wp14:editId="4E4EE626">
             <wp:extent cx="7199630" cy="3568065"/>
@@ -5905,7 +6171,6 @@
           <w:szCs w:val="36"/>
           <w:lang w:val="ru-RU"/>
         </w:rPr>
-        <w:lastRenderedPageBreak/>
         <w:t xml:space="preserve">Этап 2. </w:t>
       </w:r>
       <w:r>
@@ -6605,6 +6870,7 @@
                 <w:szCs w:val="28"/>
                 <w:lang w:val="ru-RU"/>
               </w:rPr>
+              <w:lastRenderedPageBreak/>
               <w:t># Создание необходимых каталогов</w:t>
             </w:r>
           </w:p>
@@ -7112,8 +7378,1080 @@
                 <w:szCs w:val="28"/>
                 <w:lang w:val="en-US"/>
               </w:rPr>
+              <w:t>for tarfile in "$LATEST_BACKUP_DIR"/*.tar "$LATEST_BACKUP_DIR"/*.tar.gz "$LATEST_BACKUP_DIR"/*.</w:t>
+            </w:r>
+            <w:proofErr w:type="spellStart"/>
+            <w:r>
+              <w:rPr>
+                <w:rFonts w:ascii="Times New Roman" w:eastAsia="Times New Roman" w:hAnsi="Times New Roman" w:cs="Times New Roman"/>
+                <w:sz w:val="28"/>
+                <w:szCs w:val="28"/>
+                <w:lang w:val="en-US"/>
+              </w:rPr>
+              <w:t>tgz</w:t>
+            </w:r>
+            <w:proofErr w:type="spellEnd"/>
+            <w:r>
+              <w:rPr>
+                <w:rFonts w:ascii="Times New Roman" w:eastAsia="Times New Roman" w:hAnsi="Times New Roman" w:cs="Times New Roman"/>
+                <w:sz w:val="28"/>
+                <w:szCs w:val="28"/>
+                <w:lang w:val="en-US"/>
+              </w:rPr>
+              <w:t>; do</w:t>
+            </w:r>
+          </w:p>
+          <w:p>
+            <w:pPr>
+              <w:rPr>
+                <w:rFonts w:ascii="Times New Roman" w:eastAsia="Times New Roman" w:hAnsi="Times New Roman" w:cs="Times New Roman"/>
+                <w:sz w:val="28"/>
+                <w:szCs w:val="28"/>
+                <w:lang w:val="en-US"/>
+              </w:rPr>
+            </w:pPr>
+            <w:r>
+              <w:rPr>
+                <w:rFonts w:ascii="Times New Roman" w:eastAsia="Times New Roman" w:hAnsi="Times New Roman" w:cs="Times New Roman"/>
+                <w:sz w:val="28"/>
+                <w:szCs w:val="28"/>
+                <w:lang w:val="en-US"/>
+              </w:rPr>
+              <w:t xml:space="preserve">    [ -f "$tarfile</w:t>
+            </w:r>
+            <w:proofErr w:type="gramStart"/>
+            <w:r>
+              <w:rPr>
+                <w:rFonts w:ascii="Times New Roman" w:eastAsia="Times New Roman" w:hAnsi="Times New Roman" w:cs="Times New Roman"/>
+                <w:sz w:val="28"/>
+                <w:szCs w:val="28"/>
+                <w:lang w:val="en-US"/>
+              </w:rPr>
+              <w:t>" ]</w:t>
+            </w:r>
+            <w:proofErr w:type="gramEnd"/>
+            <w:r>
+              <w:rPr>
+                <w:rFonts w:ascii="Times New Roman" w:eastAsia="Times New Roman" w:hAnsi="Times New Roman" w:cs="Times New Roman"/>
+                <w:sz w:val="28"/>
+                <w:szCs w:val="28"/>
+                <w:lang w:val="en-US"/>
+              </w:rPr>
+              <w:t xml:space="preserve"> || continue</w:t>
+            </w:r>
+          </w:p>
+          <w:p>
+            <w:pPr>
+              <w:rPr>
+                <w:rFonts w:ascii="Times New Roman" w:eastAsia="Times New Roman" w:hAnsi="Times New Roman" w:cs="Times New Roman"/>
+                <w:sz w:val="28"/>
+                <w:szCs w:val="28"/>
+                <w:lang w:val="en-US"/>
+              </w:rPr>
+            </w:pPr>
+            <w:r>
+              <w:rPr>
+                <w:rFonts w:ascii="Times New Roman" w:eastAsia="Times New Roman" w:hAnsi="Times New Roman" w:cs="Times New Roman"/>
+                <w:sz w:val="28"/>
+                <w:szCs w:val="28"/>
+                <w:lang w:val="en-US"/>
+              </w:rPr>
+              <w:t xml:space="preserve">    name=$(</w:t>
+            </w:r>
+            <w:proofErr w:type="spellStart"/>
+            <w:r>
+              <w:rPr>
+                <w:rFonts w:ascii="Times New Roman" w:eastAsia="Times New Roman" w:hAnsi="Times New Roman" w:cs="Times New Roman"/>
+                <w:sz w:val="28"/>
+                <w:szCs w:val="28"/>
+                <w:lang w:val="en-US"/>
+              </w:rPr>
+              <w:t>basename</w:t>
+            </w:r>
+            <w:proofErr w:type="spellEnd"/>
+            <w:r>
+              <w:rPr>
+                <w:rFonts w:ascii="Times New Roman" w:eastAsia="Times New Roman" w:hAnsi="Times New Roman" w:cs="Times New Roman"/>
+                <w:sz w:val="28"/>
+                <w:szCs w:val="28"/>
+                <w:lang w:val="en-US"/>
+              </w:rPr>
+              <w:t xml:space="preserve"> "$tarfile")</w:t>
+            </w:r>
+          </w:p>
+          <w:p>
+            <w:pPr>
+              <w:rPr>
+                <w:rFonts w:ascii="Times New Roman" w:eastAsia="Times New Roman" w:hAnsi="Times New Roman" w:cs="Times New Roman"/>
+                <w:sz w:val="28"/>
+                <w:szCs w:val="28"/>
+                <w:lang w:val="en-US"/>
+              </w:rPr>
+            </w:pPr>
+          </w:p>
+          <w:p>
+            <w:pPr>
+              <w:rPr>
+                <w:rFonts w:ascii="Times New Roman" w:eastAsia="Times New Roman" w:hAnsi="Times New Roman" w:cs="Times New Roman"/>
+                <w:sz w:val="28"/>
+                <w:szCs w:val="28"/>
+                <w:lang w:val="ru-RU"/>
+              </w:rPr>
+            </w:pPr>
+            <w:r>
+              <w:rPr>
+                <w:rFonts w:ascii="Times New Roman" w:eastAsia="Times New Roman" w:hAnsi="Times New Roman" w:cs="Times New Roman"/>
+                <w:sz w:val="28"/>
+                <w:szCs w:val="28"/>
+                <w:lang w:val="en-US"/>
+              </w:rPr>
+              <w:t xml:space="preserve">    </w:t>
+            </w:r>
+            <w:r>
+              <w:rPr>
+                <w:rFonts w:ascii="Times New Roman" w:eastAsia="Times New Roman" w:hAnsi="Times New Roman" w:cs="Times New Roman"/>
+                <w:sz w:val="28"/>
+                <w:szCs w:val="28"/>
+                <w:lang w:val="ru-RU"/>
+              </w:rPr>
+              <w:t># Если имя полностью числовое (OID.tar.gz), распаковываем в /</w:t>
+            </w:r>
+            <w:proofErr w:type="spellStart"/>
+            <w:r>
+              <w:rPr>
+                <w:rFonts w:ascii="Times New Roman" w:eastAsia="Times New Roman" w:hAnsi="Times New Roman" w:cs="Times New Roman"/>
+                <w:sz w:val="28"/>
+                <w:szCs w:val="28"/>
+                <w:lang w:val="ru-RU"/>
+              </w:rPr>
+              <w:t>var</w:t>
+            </w:r>
+            <w:proofErr w:type="spellEnd"/>
+            <w:r>
+              <w:rPr>
+                <w:rFonts w:ascii="Times New Roman" w:eastAsia="Times New Roman" w:hAnsi="Times New Roman" w:cs="Times New Roman"/>
+                <w:sz w:val="28"/>
+                <w:szCs w:val="28"/>
+                <w:lang w:val="ru-RU"/>
+              </w:rPr>
+              <w:t>/</w:t>
+            </w:r>
+            <w:proofErr w:type="spellStart"/>
+            <w:r>
+              <w:rPr>
+                <w:rFonts w:ascii="Times New Roman" w:eastAsia="Times New Roman" w:hAnsi="Times New Roman" w:cs="Times New Roman"/>
+                <w:sz w:val="28"/>
+                <w:szCs w:val="28"/>
+                <w:lang w:val="ru-RU"/>
+              </w:rPr>
+              <w:t>db</w:t>
+            </w:r>
+            <w:proofErr w:type="spellEnd"/>
+            <w:r>
+              <w:rPr>
+                <w:rFonts w:ascii="Times New Roman" w:eastAsia="Times New Roman" w:hAnsi="Times New Roman" w:cs="Times New Roman"/>
+                <w:sz w:val="28"/>
+                <w:szCs w:val="28"/>
+                <w:lang w:val="ru-RU"/>
+              </w:rPr>
+              <w:t>/postgres0/&lt;</w:t>
+            </w:r>
+            <w:proofErr w:type="spellStart"/>
+            <w:r>
+              <w:rPr>
+                <w:rFonts w:ascii="Times New Roman" w:eastAsia="Times New Roman" w:hAnsi="Times New Roman" w:cs="Times New Roman"/>
+                <w:sz w:val="28"/>
+                <w:szCs w:val="28"/>
+                <w:lang w:val="ru-RU"/>
+              </w:rPr>
+              <w:t>oid</w:t>
+            </w:r>
+            <w:proofErr w:type="spellEnd"/>
+            <w:r>
+              <w:rPr>
+                <w:rFonts w:ascii="Times New Roman" w:eastAsia="Times New Roman" w:hAnsi="Times New Roman" w:cs="Times New Roman"/>
+                <w:sz w:val="28"/>
+                <w:szCs w:val="28"/>
+                <w:lang w:val="ru-RU"/>
+              </w:rPr>
+              <w:t>&gt;/</w:t>
+            </w:r>
+          </w:p>
+          <w:p>
+            <w:pPr>
+              <w:rPr>
+                <w:rFonts w:ascii="Times New Roman" w:eastAsia="Times New Roman" w:hAnsi="Times New Roman" w:cs="Times New Roman"/>
+                <w:sz w:val="28"/>
+                <w:szCs w:val="28"/>
+                <w:lang w:val="en-US"/>
+              </w:rPr>
+            </w:pPr>
+            <w:r>
+              <w:rPr>
+                <w:rFonts w:ascii="Times New Roman" w:eastAsia="Times New Roman" w:hAnsi="Times New Roman" w:cs="Times New Roman"/>
+                <w:sz w:val="28"/>
+                <w:szCs w:val="28"/>
+                <w:lang w:val="ru-RU"/>
+              </w:rPr>
+              <w:t xml:space="preserve">    </w:t>
+            </w:r>
+            <w:r>
+              <w:rPr>
+                <w:rFonts w:ascii="Times New Roman" w:eastAsia="Times New Roman" w:hAnsi="Times New Roman" w:cs="Times New Roman"/>
+                <w:sz w:val="28"/>
+                <w:szCs w:val="28"/>
+                <w:lang w:val="en-US"/>
+              </w:rPr>
+              <w:t>if [[ "$name" =~ ^([0-</w:t>
+            </w:r>
+            <w:proofErr w:type="gramStart"/>
+            <w:r>
+              <w:rPr>
+                <w:rFonts w:ascii="Times New Roman" w:eastAsia="Times New Roman" w:hAnsi="Times New Roman" w:cs="Times New Roman"/>
+                <w:sz w:val="28"/>
+                <w:szCs w:val="28"/>
+                <w:lang w:val="en-US"/>
+              </w:rPr>
+              <w:t>9]+</w:t>
+            </w:r>
+            <w:proofErr w:type="gramEnd"/>
+            <w:r>
+              <w:rPr>
+                <w:rFonts w:ascii="Times New Roman" w:eastAsia="Times New Roman" w:hAnsi="Times New Roman" w:cs="Times New Roman"/>
+                <w:sz w:val="28"/>
+                <w:szCs w:val="28"/>
+                <w:lang w:val="en-US"/>
+              </w:rPr>
+              <w:t>)\.tar(\.</w:t>
+            </w:r>
+            <w:proofErr w:type="spellStart"/>
+            <w:r>
+              <w:rPr>
+                <w:rFonts w:ascii="Times New Roman" w:eastAsia="Times New Roman" w:hAnsi="Times New Roman" w:cs="Times New Roman"/>
+                <w:sz w:val="28"/>
+                <w:szCs w:val="28"/>
+                <w:lang w:val="en-US"/>
+              </w:rPr>
+              <w:t>gz</w:t>
+            </w:r>
+            <w:proofErr w:type="spellEnd"/>
+            <w:r>
+              <w:rPr>
+                <w:rFonts w:ascii="Times New Roman" w:eastAsia="Times New Roman" w:hAnsi="Times New Roman" w:cs="Times New Roman"/>
+                <w:sz w:val="28"/>
+                <w:szCs w:val="28"/>
+                <w:lang w:val="en-US"/>
+              </w:rPr>
+              <w:t>)?$ ]] || [[ "$name" =~ ^([0-9]+)\.</w:t>
+            </w:r>
+            <w:proofErr w:type="spellStart"/>
+            <w:r>
+              <w:rPr>
+                <w:rFonts w:ascii="Times New Roman" w:eastAsia="Times New Roman" w:hAnsi="Times New Roman" w:cs="Times New Roman"/>
+                <w:sz w:val="28"/>
+                <w:szCs w:val="28"/>
+                <w:lang w:val="en-US"/>
+              </w:rPr>
+              <w:t>tgz</w:t>
+            </w:r>
+            <w:proofErr w:type="spellEnd"/>
+            <w:r>
+              <w:rPr>
+                <w:rFonts w:ascii="Times New Roman" w:eastAsia="Times New Roman" w:hAnsi="Times New Roman" w:cs="Times New Roman"/>
+                <w:sz w:val="28"/>
+                <w:szCs w:val="28"/>
+                <w:lang w:val="en-US"/>
+              </w:rPr>
+              <w:t>$ ]]; then</w:t>
+            </w:r>
+          </w:p>
+          <w:p>
+            <w:pPr>
+              <w:rPr>
+                <w:rFonts w:ascii="Times New Roman" w:eastAsia="Times New Roman" w:hAnsi="Times New Roman" w:cs="Times New Roman"/>
+                <w:sz w:val="28"/>
+                <w:szCs w:val="28"/>
+                <w:lang w:val="en-US"/>
+              </w:rPr>
+            </w:pPr>
+            <w:r>
+              <w:rPr>
+                <w:rFonts w:ascii="Times New Roman" w:eastAsia="Times New Roman" w:hAnsi="Times New Roman" w:cs="Times New Roman"/>
+                <w:sz w:val="28"/>
+                <w:szCs w:val="28"/>
+                <w:lang w:val="en-US"/>
+              </w:rPr>
+              <w:t xml:space="preserve">        if [[ "$name" =~ </w:t>
+            </w:r>
+            <w:proofErr w:type="gramStart"/>
+            <w:r>
+              <w:rPr>
+                <w:rFonts w:ascii="Times New Roman" w:eastAsia="Times New Roman" w:hAnsi="Times New Roman" w:cs="Times New Roman"/>
+                <w:sz w:val="28"/>
+                <w:szCs w:val="28"/>
+                <w:lang w:val="en-US"/>
+              </w:rPr>
+              <w:t>^(</w:t>
+            </w:r>
+            <w:proofErr w:type="gramEnd"/>
+            <w:r>
+              <w:rPr>
+                <w:rFonts w:ascii="Times New Roman" w:eastAsia="Times New Roman" w:hAnsi="Times New Roman" w:cs="Times New Roman"/>
+                <w:sz w:val="28"/>
+                <w:szCs w:val="28"/>
+                <w:lang w:val="en-US"/>
+              </w:rPr>
+              <w:t>[0-9]+) ]]; then</w:t>
+            </w:r>
+          </w:p>
+          <w:p>
+            <w:pPr>
+              <w:rPr>
+                <w:rFonts w:ascii="Times New Roman" w:eastAsia="Times New Roman" w:hAnsi="Times New Roman" w:cs="Times New Roman"/>
+                <w:sz w:val="28"/>
+                <w:szCs w:val="28"/>
+                <w:lang w:val="en-US"/>
+              </w:rPr>
+            </w:pPr>
+            <w:r>
+              <w:rPr>
+                <w:rFonts w:ascii="Times New Roman" w:eastAsia="Times New Roman" w:hAnsi="Times New Roman" w:cs="Times New Roman"/>
+                <w:sz w:val="28"/>
+                <w:szCs w:val="28"/>
+                <w:lang w:val="en-US"/>
+              </w:rPr>
+              <w:t xml:space="preserve">            </w:t>
+            </w:r>
+            <w:proofErr w:type="spellStart"/>
+            <w:r>
+              <w:rPr>
+                <w:rFonts w:ascii="Times New Roman" w:eastAsia="Times New Roman" w:hAnsi="Times New Roman" w:cs="Times New Roman"/>
+                <w:sz w:val="28"/>
+                <w:szCs w:val="28"/>
+                <w:lang w:val="en-US"/>
+              </w:rPr>
+              <w:t>oid</w:t>
+            </w:r>
+            <w:proofErr w:type="spellEnd"/>
+            <w:r>
+              <w:rPr>
+                <w:rFonts w:ascii="Times New Roman" w:eastAsia="Times New Roman" w:hAnsi="Times New Roman" w:cs="Times New Roman"/>
+                <w:sz w:val="28"/>
+                <w:szCs w:val="28"/>
+                <w:lang w:val="en-US"/>
+              </w:rPr>
+              <w:t>="${BASH_</w:t>
+            </w:r>
+            <w:proofErr w:type="gramStart"/>
+            <w:r>
+              <w:rPr>
+                <w:rFonts w:ascii="Times New Roman" w:eastAsia="Times New Roman" w:hAnsi="Times New Roman" w:cs="Times New Roman"/>
+                <w:sz w:val="28"/>
+                <w:szCs w:val="28"/>
+                <w:lang w:val="en-US"/>
+              </w:rPr>
+              <w:t>REMATCH[</w:t>
+            </w:r>
+            <w:proofErr w:type="gramEnd"/>
+            <w:r>
+              <w:rPr>
+                <w:rFonts w:ascii="Times New Roman" w:eastAsia="Times New Roman" w:hAnsi="Times New Roman" w:cs="Times New Roman"/>
+                <w:sz w:val="28"/>
+                <w:szCs w:val="28"/>
+                <w:lang w:val="en-US"/>
+              </w:rPr>
+              <w:t>1]}"</w:t>
+            </w:r>
+          </w:p>
+          <w:p>
+            <w:pPr>
+              <w:rPr>
+                <w:rFonts w:ascii="Times New Roman" w:eastAsia="Times New Roman" w:hAnsi="Times New Roman" w:cs="Times New Roman"/>
+                <w:sz w:val="28"/>
+                <w:szCs w:val="28"/>
+                <w:lang w:val="en-US"/>
+              </w:rPr>
+            </w:pPr>
+            <w:r>
+              <w:rPr>
+                <w:rFonts w:ascii="Times New Roman" w:eastAsia="Times New Roman" w:hAnsi="Times New Roman" w:cs="Times New Roman"/>
+                <w:sz w:val="28"/>
+                <w:szCs w:val="28"/>
+                <w:lang w:val="en-US"/>
+              </w:rPr>
+              <w:t xml:space="preserve">        else</w:t>
+            </w:r>
+          </w:p>
+          <w:p>
+            <w:pPr>
+              <w:rPr>
+                <w:rFonts w:ascii="Times New Roman" w:eastAsia="Times New Roman" w:hAnsi="Times New Roman" w:cs="Times New Roman"/>
+                <w:sz w:val="28"/>
+                <w:szCs w:val="28"/>
+                <w:lang w:val="en-US"/>
+              </w:rPr>
+            </w:pPr>
+            <w:r>
+              <w:rPr>
+                <w:rFonts w:ascii="Times New Roman" w:eastAsia="Times New Roman" w:hAnsi="Times New Roman" w:cs="Times New Roman"/>
+                <w:sz w:val="28"/>
+                <w:szCs w:val="28"/>
+                <w:lang w:val="en-US"/>
+              </w:rPr>
+              <w:t xml:space="preserve">            echo "Skipping unexpected numeric-named file: $name"</w:t>
+            </w:r>
+          </w:p>
+          <w:p>
+            <w:pPr>
+              <w:rPr>
+                <w:rFonts w:ascii="Times New Roman" w:eastAsia="Times New Roman" w:hAnsi="Times New Roman" w:cs="Times New Roman"/>
+                <w:sz w:val="28"/>
+                <w:szCs w:val="28"/>
+                <w:lang w:val="en-US"/>
+              </w:rPr>
+            </w:pPr>
+            <w:r>
+              <w:rPr>
+                <w:rFonts w:ascii="Times New Roman" w:eastAsia="Times New Roman" w:hAnsi="Times New Roman" w:cs="Times New Roman"/>
+                <w:sz w:val="28"/>
+                <w:szCs w:val="28"/>
+                <w:lang w:val="en-US"/>
+              </w:rPr>
+              <w:t xml:space="preserve">            continue</w:t>
+            </w:r>
+          </w:p>
+          <w:p>
+            <w:pPr>
+              <w:rPr>
+                <w:rFonts w:ascii="Times New Roman" w:eastAsia="Times New Roman" w:hAnsi="Times New Roman" w:cs="Times New Roman"/>
+                <w:sz w:val="28"/>
+                <w:szCs w:val="28"/>
+                <w:lang w:val="en-US"/>
+              </w:rPr>
+            </w:pPr>
+            <w:r>
+              <w:rPr>
+                <w:rFonts w:ascii="Times New Roman" w:eastAsia="Times New Roman" w:hAnsi="Times New Roman" w:cs="Times New Roman"/>
+                <w:sz w:val="28"/>
+                <w:szCs w:val="28"/>
+                <w:lang w:val="en-US"/>
+              </w:rPr>
+              <w:t xml:space="preserve">        fi</w:t>
+            </w:r>
+          </w:p>
+          <w:p>
+            <w:pPr>
+              <w:rPr>
+                <w:rFonts w:ascii="Times New Roman" w:eastAsia="Times New Roman" w:hAnsi="Times New Roman" w:cs="Times New Roman"/>
+                <w:sz w:val="28"/>
+                <w:szCs w:val="28"/>
+                <w:lang w:val="en-US"/>
+              </w:rPr>
+            </w:pPr>
+          </w:p>
+          <w:p>
+            <w:pPr>
+              <w:rPr>
+                <w:rFonts w:ascii="Times New Roman" w:eastAsia="Times New Roman" w:hAnsi="Times New Roman" w:cs="Times New Roman"/>
+                <w:sz w:val="28"/>
+                <w:szCs w:val="28"/>
+                <w:lang w:val="en-US"/>
+              </w:rPr>
+            </w:pPr>
+            <w:r>
+              <w:rPr>
+                <w:rFonts w:ascii="Times New Roman" w:eastAsia="Times New Roman" w:hAnsi="Times New Roman" w:cs="Times New Roman"/>
+                <w:sz w:val="28"/>
+                <w:szCs w:val="28"/>
+                <w:lang w:val="en-US"/>
+              </w:rPr>
+              <w:t xml:space="preserve">        </w:t>
+            </w:r>
+            <w:proofErr w:type="spellStart"/>
+            <w:r>
+              <w:rPr>
+                <w:rFonts w:ascii="Times New Roman" w:eastAsia="Times New Roman" w:hAnsi="Times New Roman" w:cs="Times New Roman"/>
+                <w:sz w:val="28"/>
+                <w:szCs w:val="28"/>
+                <w:lang w:val="en-US"/>
+              </w:rPr>
+              <w:t>dest</w:t>
+            </w:r>
+            <w:proofErr w:type="spellEnd"/>
+            <w:r>
+              <w:rPr>
+                <w:rFonts w:ascii="Times New Roman" w:eastAsia="Times New Roman" w:hAnsi="Times New Roman" w:cs="Times New Roman"/>
+                <w:sz w:val="28"/>
+                <w:szCs w:val="28"/>
+                <w:lang w:val="en-US"/>
+              </w:rPr>
+              <w:t>="$TABLESPACE_ROOT/$</w:t>
+            </w:r>
+            <w:proofErr w:type="spellStart"/>
+            <w:r>
+              <w:rPr>
+                <w:rFonts w:ascii="Times New Roman" w:eastAsia="Times New Roman" w:hAnsi="Times New Roman" w:cs="Times New Roman"/>
+                <w:sz w:val="28"/>
+                <w:szCs w:val="28"/>
+                <w:lang w:val="en-US"/>
+              </w:rPr>
+              <w:t>oid</w:t>
+            </w:r>
+            <w:proofErr w:type="spellEnd"/>
+            <w:r>
+              <w:rPr>
+                <w:rFonts w:ascii="Times New Roman" w:eastAsia="Times New Roman" w:hAnsi="Times New Roman" w:cs="Times New Roman"/>
+                <w:sz w:val="28"/>
+                <w:szCs w:val="28"/>
+                <w:lang w:val="en-US"/>
+              </w:rPr>
+              <w:t>"</w:t>
+            </w:r>
+          </w:p>
+          <w:p>
+            <w:pPr>
+              <w:rPr>
+                <w:rFonts w:ascii="Times New Roman" w:eastAsia="Times New Roman" w:hAnsi="Times New Roman" w:cs="Times New Roman"/>
+                <w:sz w:val="28"/>
+                <w:szCs w:val="28"/>
+                <w:lang w:val="en-US"/>
+              </w:rPr>
+            </w:pPr>
+            <w:r>
+              <w:rPr>
+                <w:rFonts w:ascii="Times New Roman" w:eastAsia="Times New Roman" w:hAnsi="Times New Roman" w:cs="Times New Roman"/>
+                <w:sz w:val="28"/>
+                <w:szCs w:val="28"/>
+                <w:lang w:val="en-US"/>
+              </w:rPr>
+              <w:t xml:space="preserve">        echo "Extracting tablespace archive $name -&gt; $</w:t>
+            </w:r>
+            <w:proofErr w:type="spellStart"/>
+            <w:r>
+              <w:rPr>
+                <w:rFonts w:ascii="Times New Roman" w:eastAsia="Times New Roman" w:hAnsi="Times New Roman" w:cs="Times New Roman"/>
+                <w:sz w:val="28"/>
+                <w:szCs w:val="28"/>
+                <w:lang w:val="en-US"/>
+              </w:rPr>
+              <w:t>dest</w:t>
+            </w:r>
+            <w:proofErr w:type="spellEnd"/>
+            <w:r>
+              <w:rPr>
+                <w:rFonts w:ascii="Times New Roman" w:eastAsia="Times New Roman" w:hAnsi="Times New Roman" w:cs="Times New Roman"/>
+                <w:sz w:val="28"/>
+                <w:szCs w:val="28"/>
+                <w:lang w:val="en-US"/>
+              </w:rPr>
+              <w:t>"</w:t>
+            </w:r>
+          </w:p>
+          <w:p>
+            <w:pPr>
+              <w:rPr>
+                <w:rFonts w:ascii="Times New Roman" w:eastAsia="Times New Roman" w:hAnsi="Times New Roman" w:cs="Times New Roman"/>
+                <w:sz w:val="28"/>
+                <w:szCs w:val="28"/>
+                <w:lang w:val="en-US"/>
+              </w:rPr>
+            </w:pPr>
+            <w:r>
+              <w:rPr>
+                <w:rFonts w:ascii="Times New Roman" w:eastAsia="Times New Roman" w:hAnsi="Times New Roman" w:cs="Times New Roman"/>
+                <w:sz w:val="28"/>
+                <w:szCs w:val="28"/>
+                <w:lang w:val="en-US"/>
+              </w:rPr>
+              <w:t xml:space="preserve">        </w:t>
+            </w:r>
+            <w:proofErr w:type="spellStart"/>
+            <w:r>
+              <w:rPr>
+                <w:rFonts w:ascii="Times New Roman" w:eastAsia="Times New Roman" w:hAnsi="Times New Roman" w:cs="Times New Roman"/>
+                <w:sz w:val="28"/>
+                <w:szCs w:val="28"/>
+                <w:lang w:val="en-US"/>
+              </w:rPr>
+              <w:t>mkdir</w:t>
+            </w:r>
+            <w:proofErr w:type="spellEnd"/>
+            <w:r>
+              <w:rPr>
+                <w:rFonts w:ascii="Times New Roman" w:eastAsia="Times New Roman" w:hAnsi="Times New Roman" w:cs="Times New Roman"/>
+                <w:sz w:val="28"/>
+                <w:szCs w:val="28"/>
+                <w:lang w:val="en-US"/>
+              </w:rPr>
+              <w:t xml:space="preserve"> -p "$</w:t>
+            </w:r>
+            <w:proofErr w:type="spellStart"/>
+            <w:r>
+              <w:rPr>
+                <w:rFonts w:ascii="Times New Roman" w:eastAsia="Times New Roman" w:hAnsi="Times New Roman" w:cs="Times New Roman"/>
+                <w:sz w:val="28"/>
+                <w:szCs w:val="28"/>
+                <w:lang w:val="en-US"/>
+              </w:rPr>
+              <w:t>dest</w:t>
+            </w:r>
+            <w:proofErr w:type="spellEnd"/>
+            <w:r>
+              <w:rPr>
+                <w:rFonts w:ascii="Times New Roman" w:eastAsia="Times New Roman" w:hAnsi="Times New Roman" w:cs="Times New Roman"/>
+                <w:sz w:val="28"/>
+                <w:szCs w:val="28"/>
+                <w:lang w:val="en-US"/>
+              </w:rPr>
+              <w:t>"</w:t>
+            </w:r>
+          </w:p>
+          <w:p>
+            <w:pPr>
+              <w:rPr>
+                <w:rFonts w:ascii="Times New Roman" w:eastAsia="Times New Roman" w:hAnsi="Times New Roman" w:cs="Times New Roman"/>
+                <w:sz w:val="28"/>
+                <w:szCs w:val="28"/>
+                <w:lang w:val="en-US"/>
+              </w:rPr>
+            </w:pPr>
+          </w:p>
+          <w:p>
+            <w:pPr>
+              <w:rPr>
+                <w:rFonts w:ascii="Times New Roman" w:eastAsia="Times New Roman" w:hAnsi="Times New Roman" w:cs="Times New Roman"/>
+                <w:sz w:val="28"/>
+                <w:szCs w:val="28"/>
+                <w:lang w:val="en-US"/>
+              </w:rPr>
+            </w:pPr>
+            <w:r>
+              <w:rPr>
+                <w:rFonts w:ascii="Times New Roman" w:eastAsia="Times New Roman" w:hAnsi="Times New Roman" w:cs="Times New Roman"/>
+                <w:sz w:val="28"/>
+                <w:szCs w:val="28"/>
+                <w:lang w:val="en-US"/>
+              </w:rPr>
+              <w:t xml:space="preserve">        if [[ "$tarfile" == </w:t>
+            </w:r>
+            <w:proofErr w:type="gramStart"/>
+            <w:r>
+              <w:rPr>
+                <w:rFonts w:ascii="Times New Roman" w:eastAsia="Times New Roman" w:hAnsi="Times New Roman" w:cs="Times New Roman"/>
+                <w:sz w:val="28"/>
+                <w:szCs w:val="28"/>
+                <w:lang w:val="en-US"/>
+              </w:rPr>
+              <w:t>*.</w:t>
+            </w:r>
+            <w:proofErr w:type="spellStart"/>
+            <w:r>
+              <w:rPr>
+                <w:rFonts w:ascii="Times New Roman" w:eastAsia="Times New Roman" w:hAnsi="Times New Roman" w:cs="Times New Roman"/>
+                <w:sz w:val="28"/>
+                <w:szCs w:val="28"/>
+                <w:lang w:val="en-US"/>
+              </w:rPr>
+              <w:t>gz</w:t>
+            </w:r>
+            <w:proofErr w:type="spellEnd"/>
+            <w:r>
+              <w:rPr>
+                <w:rFonts w:ascii="Times New Roman" w:eastAsia="Times New Roman" w:hAnsi="Times New Roman" w:cs="Times New Roman"/>
+                <w:sz w:val="28"/>
+                <w:szCs w:val="28"/>
+                <w:lang w:val="en-US"/>
+              </w:rPr>
+              <w:t xml:space="preserve"> ]</w:t>
+            </w:r>
+            <w:proofErr w:type="gramEnd"/>
+            <w:r>
+              <w:rPr>
+                <w:rFonts w:ascii="Times New Roman" w:eastAsia="Times New Roman" w:hAnsi="Times New Roman" w:cs="Times New Roman"/>
+                <w:sz w:val="28"/>
+                <w:szCs w:val="28"/>
+                <w:lang w:val="en-US"/>
+              </w:rPr>
+              <w:t>] || [[ "$tarfile" == *.</w:t>
+            </w:r>
+            <w:proofErr w:type="spellStart"/>
+            <w:r>
+              <w:rPr>
+                <w:rFonts w:ascii="Times New Roman" w:eastAsia="Times New Roman" w:hAnsi="Times New Roman" w:cs="Times New Roman"/>
+                <w:sz w:val="28"/>
+                <w:szCs w:val="28"/>
+                <w:lang w:val="en-US"/>
+              </w:rPr>
+              <w:t>tgz</w:t>
+            </w:r>
+            <w:proofErr w:type="spellEnd"/>
+            <w:r>
+              <w:rPr>
+                <w:rFonts w:ascii="Times New Roman" w:eastAsia="Times New Roman" w:hAnsi="Times New Roman" w:cs="Times New Roman"/>
+                <w:sz w:val="28"/>
+                <w:szCs w:val="28"/>
+                <w:lang w:val="en-US"/>
+              </w:rPr>
+              <w:t xml:space="preserve"> ]]; then</w:t>
+            </w:r>
+          </w:p>
+          <w:p>
+            <w:pPr>
+              <w:rPr>
+                <w:rFonts w:ascii="Times New Roman" w:eastAsia="Times New Roman" w:hAnsi="Times New Roman" w:cs="Times New Roman"/>
+                <w:sz w:val="28"/>
+                <w:szCs w:val="28"/>
+                <w:lang w:val="en-US"/>
+              </w:rPr>
+            </w:pPr>
+            <w:r>
+              <w:rPr>
+                <w:rFonts w:ascii="Times New Roman" w:eastAsia="Times New Roman" w:hAnsi="Times New Roman" w:cs="Times New Roman"/>
+                <w:sz w:val="28"/>
+                <w:szCs w:val="28"/>
+                <w:lang w:val="en-US"/>
+              </w:rPr>
+              <w:t xml:space="preserve">            tar -</w:t>
+            </w:r>
+            <w:proofErr w:type="spellStart"/>
+            <w:r>
+              <w:rPr>
+                <w:rFonts w:ascii="Times New Roman" w:eastAsia="Times New Roman" w:hAnsi="Times New Roman" w:cs="Times New Roman"/>
+                <w:sz w:val="28"/>
+                <w:szCs w:val="28"/>
+                <w:lang w:val="en-US"/>
+              </w:rPr>
+              <w:t>xzf</w:t>
+            </w:r>
+            <w:proofErr w:type="spellEnd"/>
+            <w:r>
+              <w:rPr>
+                <w:rFonts w:ascii="Times New Roman" w:eastAsia="Times New Roman" w:hAnsi="Times New Roman" w:cs="Times New Roman"/>
+                <w:sz w:val="28"/>
+                <w:szCs w:val="28"/>
+                <w:lang w:val="en-US"/>
+              </w:rPr>
+              <w:t xml:space="preserve"> "$tarfile" -C "$</w:t>
+            </w:r>
+            <w:proofErr w:type="spellStart"/>
+            <w:r>
+              <w:rPr>
+                <w:rFonts w:ascii="Times New Roman" w:eastAsia="Times New Roman" w:hAnsi="Times New Roman" w:cs="Times New Roman"/>
+                <w:sz w:val="28"/>
+                <w:szCs w:val="28"/>
+                <w:lang w:val="en-US"/>
+              </w:rPr>
+              <w:t>dest</w:t>
+            </w:r>
+            <w:proofErr w:type="spellEnd"/>
+            <w:r>
+              <w:rPr>
+                <w:rFonts w:ascii="Times New Roman" w:eastAsia="Times New Roman" w:hAnsi="Times New Roman" w:cs="Times New Roman"/>
+                <w:sz w:val="28"/>
+                <w:szCs w:val="28"/>
+                <w:lang w:val="en-US"/>
+              </w:rPr>
+              <w:t>"</w:t>
+            </w:r>
+          </w:p>
+          <w:p>
+            <w:pPr>
+              <w:rPr>
+                <w:rFonts w:ascii="Times New Roman" w:eastAsia="Times New Roman" w:hAnsi="Times New Roman" w:cs="Times New Roman"/>
+                <w:sz w:val="28"/>
+                <w:szCs w:val="28"/>
+                <w:lang w:val="en-US"/>
+              </w:rPr>
+            </w:pPr>
+            <w:r>
+              <w:rPr>
+                <w:rFonts w:ascii="Times New Roman" w:eastAsia="Times New Roman" w:hAnsi="Times New Roman" w:cs="Times New Roman"/>
+                <w:sz w:val="28"/>
+                <w:szCs w:val="28"/>
+                <w:lang w:val="en-US"/>
+              </w:rPr>
+              <w:t xml:space="preserve">        else</w:t>
+            </w:r>
+          </w:p>
+          <w:p>
+            <w:pPr>
+              <w:rPr>
+                <w:rFonts w:ascii="Times New Roman" w:eastAsia="Times New Roman" w:hAnsi="Times New Roman" w:cs="Times New Roman"/>
+                <w:sz w:val="28"/>
+                <w:szCs w:val="28"/>
+                <w:lang w:val="en-US"/>
+              </w:rPr>
+            </w:pPr>
+            <w:r>
+              <w:rPr>
+                <w:rFonts w:ascii="Times New Roman" w:eastAsia="Times New Roman" w:hAnsi="Times New Roman" w:cs="Times New Roman"/>
+                <w:sz w:val="28"/>
+                <w:szCs w:val="28"/>
+                <w:lang w:val="en-US"/>
+              </w:rPr>
+              <w:t xml:space="preserve">            tar -</w:t>
+            </w:r>
+            <w:proofErr w:type="spellStart"/>
+            <w:r>
+              <w:rPr>
+                <w:rFonts w:ascii="Times New Roman" w:eastAsia="Times New Roman" w:hAnsi="Times New Roman" w:cs="Times New Roman"/>
+                <w:sz w:val="28"/>
+                <w:szCs w:val="28"/>
+                <w:lang w:val="en-US"/>
+              </w:rPr>
+              <w:t>xf</w:t>
+            </w:r>
+            <w:proofErr w:type="spellEnd"/>
+            <w:r>
+              <w:rPr>
+                <w:rFonts w:ascii="Times New Roman" w:eastAsia="Times New Roman" w:hAnsi="Times New Roman" w:cs="Times New Roman"/>
+                <w:sz w:val="28"/>
+                <w:szCs w:val="28"/>
+                <w:lang w:val="en-US"/>
+              </w:rPr>
+              <w:t xml:space="preserve"> "$tarfile" -C "$</w:t>
+            </w:r>
+            <w:proofErr w:type="spellStart"/>
+            <w:r>
+              <w:rPr>
+                <w:rFonts w:ascii="Times New Roman" w:eastAsia="Times New Roman" w:hAnsi="Times New Roman" w:cs="Times New Roman"/>
+                <w:sz w:val="28"/>
+                <w:szCs w:val="28"/>
+                <w:lang w:val="en-US"/>
+              </w:rPr>
+              <w:t>dest</w:t>
+            </w:r>
+            <w:proofErr w:type="spellEnd"/>
+            <w:r>
+              <w:rPr>
+                <w:rFonts w:ascii="Times New Roman" w:eastAsia="Times New Roman" w:hAnsi="Times New Roman" w:cs="Times New Roman"/>
+                <w:sz w:val="28"/>
+                <w:szCs w:val="28"/>
+                <w:lang w:val="en-US"/>
+              </w:rPr>
+              <w:t>"</w:t>
+            </w:r>
+          </w:p>
+          <w:p>
+            <w:pPr>
+              <w:rPr>
+                <w:rFonts w:ascii="Times New Roman" w:eastAsia="Times New Roman" w:hAnsi="Times New Roman" w:cs="Times New Roman"/>
+                <w:sz w:val="28"/>
+                <w:szCs w:val="28"/>
+                <w:lang w:val="en-US"/>
+              </w:rPr>
+            </w:pPr>
+            <w:r>
+              <w:rPr>
+                <w:rFonts w:ascii="Times New Roman" w:eastAsia="Times New Roman" w:hAnsi="Times New Roman" w:cs="Times New Roman"/>
+                <w:sz w:val="28"/>
+                <w:szCs w:val="28"/>
+                <w:lang w:val="en-US"/>
+              </w:rPr>
+              <w:t xml:space="preserve">        fi</w:t>
+            </w:r>
+          </w:p>
+          <w:p>
+            <w:pPr>
+              <w:rPr>
+                <w:rFonts w:ascii="Times New Roman" w:eastAsia="Times New Roman" w:hAnsi="Times New Roman" w:cs="Times New Roman"/>
+                <w:sz w:val="28"/>
+                <w:szCs w:val="28"/>
+                <w:lang w:val="en-US"/>
+              </w:rPr>
+            </w:pPr>
+            <w:r>
+              <w:rPr>
+                <w:rFonts w:ascii="Times New Roman" w:eastAsia="Times New Roman" w:hAnsi="Times New Roman" w:cs="Times New Roman"/>
+                <w:sz w:val="28"/>
+                <w:szCs w:val="28"/>
+                <w:lang w:val="en-US"/>
+              </w:rPr>
+              <w:t xml:space="preserve">    else</w:t>
+            </w:r>
+          </w:p>
+          <w:p>
+            <w:pPr>
+              <w:rPr>
+                <w:rFonts w:ascii="Times New Roman" w:eastAsia="Times New Roman" w:hAnsi="Times New Roman" w:cs="Times New Roman"/>
+                <w:sz w:val="28"/>
+                <w:szCs w:val="28"/>
+                <w:lang w:val="en-US"/>
+              </w:rPr>
+            </w:pPr>
+            <w:r>
+              <w:rPr>
+                <w:rFonts w:ascii="Times New Roman" w:eastAsia="Times New Roman" w:hAnsi="Times New Roman" w:cs="Times New Roman"/>
+                <w:sz w:val="28"/>
+                <w:szCs w:val="28"/>
+                <w:lang w:val="en-US"/>
+              </w:rPr>
+              <w:t xml:space="preserve">        # </w:t>
+            </w:r>
+            <w:r>
+              <w:rPr>
+                <w:rFonts w:ascii="Times New Roman" w:eastAsia="Times New Roman" w:hAnsi="Times New Roman" w:cs="Times New Roman"/>
+                <w:sz w:val="28"/>
+                <w:szCs w:val="28"/>
+                <w:lang w:val="ru-RU"/>
+              </w:rPr>
+              <w:t>Для</w:t>
+            </w:r>
+            <w:r>
+              <w:rPr>
+                <w:rFonts w:ascii="Times New Roman" w:eastAsia="Times New Roman" w:hAnsi="Times New Roman" w:cs="Times New Roman"/>
+                <w:sz w:val="28"/>
+                <w:szCs w:val="28"/>
+                <w:lang w:val="en-US"/>
+              </w:rPr>
+              <w:t xml:space="preserve"> </w:t>
+            </w:r>
+            <w:r>
+              <w:rPr>
+                <w:rFonts w:ascii="Times New Roman" w:eastAsia="Times New Roman" w:hAnsi="Times New Roman" w:cs="Times New Roman"/>
+                <w:sz w:val="28"/>
+                <w:szCs w:val="28"/>
+                <w:lang w:val="ru-RU"/>
+              </w:rPr>
+              <w:t>остальных</w:t>
+            </w:r>
+            <w:r>
+              <w:rPr>
+                <w:rFonts w:ascii="Times New Roman" w:eastAsia="Times New Roman" w:hAnsi="Times New Roman" w:cs="Times New Roman"/>
+                <w:sz w:val="28"/>
+                <w:szCs w:val="28"/>
+                <w:lang w:val="en-US"/>
+              </w:rPr>
+              <w:t xml:space="preserve"> (base.tar.gz, pg_wal.tar.gz </w:t>
+            </w:r>
+            <w:r>
+              <w:rPr>
+                <w:rFonts w:ascii="Times New Roman" w:eastAsia="Times New Roman" w:hAnsi="Times New Roman" w:cs="Times New Roman"/>
+                <w:sz w:val="28"/>
+                <w:szCs w:val="28"/>
+                <w:lang w:val="ru-RU"/>
+              </w:rPr>
+              <w:t>и</w:t>
+            </w:r>
+            <w:r>
+              <w:rPr>
+                <w:rFonts w:ascii="Times New Roman" w:eastAsia="Times New Roman" w:hAnsi="Times New Roman" w:cs="Times New Roman"/>
+                <w:sz w:val="28"/>
+                <w:szCs w:val="28"/>
+                <w:lang w:val="en-US"/>
+              </w:rPr>
+              <w:t xml:space="preserve"> </w:t>
+            </w:r>
+            <w:r>
+              <w:rPr>
+                <w:rFonts w:ascii="Times New Roman" w:eastAsia="Times New Roman" w:hAnsi="Times New Roman" w:cs="Times New Roman"/>
+                <w:sz w:val="28"/>
+                <w:szCs w:val="28"/>
+                <w:lang w:val="ru-RU"/>
+              </w:rPr>
+              <w:t>т</w:t>
+            </w:r>
+            <w:r>
+              <w:rPr>
+                <w:rFonts w:ascii="Times New Roman" w:eastAsia="Times New Roman" w:hAnsi="Times New Roman" w:cs="Times New Roman"/>
+                <w:sz w:val="28"/>
+                <w:szCs w:val="28"/>
+                <w:lang w:val="en-US"/>
+              </w:rPr>
+              <w:t>.</w:t>
+            </w:r>
+            <w:r>
+              <w:rPr>
+                <w:rFonts w:ascii="Times New Roman" w:eastAsia="Times New Roman" w:hAnsi="Times New Roman" w:cs="Times New Roman"/>
+                <w:sz w:val="28"/>
+                <w:szCs w:val="28"/>
+                <w:lang w:val="ru-RU"/>
+              </w:rPr>
+              <w:t>п</w:t>
+            </w:r>
+            <w:r>
+              <w:rPr>
+                <w:rFonts w:ascii="Times New Roman" w:eastAsia="Times New Roman" w:hAnsi="Times New Roman" w:cs="Times New Roman"/>
+                <w:sz w:val="28"/>
+                <w:szCs w:val="28"/>
+                <w:lang w:val="en-US"/>
+              </w:rPr>
+              <w:t xml:space="preserve">.) — </w:t>
+            </w:r>
+            <w:r>
+              <w:rPr>
+                <w:rFonts w:ascii="Times New Roman" w:eastAsia="Times New Roman" w:hAnsi="Times New Roman" w:cs="Times New Roman"/>
+                <w:sz w:val="28"/>
+                <w:szCs w:val="28"/>
+                <w:lang w:val="ru-RU"/>
+              </w:rPr>
+              <w:t>распакуем</w:t>
+            </w:r>
+            <w:r>
+              <w:rPr>
+                <w:rFonts w:ascii="Times New Roman" w:eastAsia="Times New Roman" w:hAnsi="Times New Roman" w:cs="Times New Roman"/>
+                <w:sz w:val="28"/>
+                <w:szCs w:val="28"/>
+                <w:lang w:val="en-US"/>
+              </w:rPr>
+              <w:t xml:space="preserve"> </w:t>
+            </w:r>
+            <w:r>
+              <w:rPr>
+                <w:rFonts w:ascii="Times New Roman" w:eastAsia="Times New Roman" w:hAnsi="Times New Roman" w:cs="Times New Roman"/>
+                <w:sz w:val="28"/>
+                <w:szCs w:val="28"/>
+                <w:lang w:val="ru-RU"/>
+              </w:rPr>
+              <w:t>в</w:t>
+            </w:r>
+            <w:r>
+              <w:rPr>
+                <w:rFonts w:ascii="Times New Roman" w:eastAsia="Times New Roman" w:hAnsi="Times New Roman" w:cs="Times New Roman"/>
+                <w:sz w:val="28"/>
+                <w:szCs w:val="28"/>
+                <w:lang w:val="en-US"/>
+              </w:rPr>
+              <w:t xml:space="preserve"> RECOVERY_DIR</w:t>
+            </w:r>
+          </w:p>
+          <w:p>
+            <w:pPr>
+              <w:rPr>
+                <w:rFonts w:ascii="Times New Roman" w:eastAsia="Times New Roman" w:hAnsi="Times New Roman" w:cs="Times New Roman"/>
+                <w:sz w:val="28"/>
+                <w:szCs w:val="28"/>
+                <w:lang w:val="en-US"/>
+              </w:rPr>
+            </w:pPr>
+            <w:r>
+              <w:rPr>
+                <w:rFonts w:ascii="Times New Roman" w:eastAsia="Times New Roman" w:hAnsi="Times New Roman" w:cs="Times New Roman"/>
+                <w:sz w:val="28"/>
+                <w:szCs w:val="28"/>
+                <w:lang w:val="en-US"/>
+              </w:rPr>
+              <w:t xml:space="preserve">        echo "Unpacking $name -&gt; $RECOVERY_DIR"</w:t>
+            </w:r>
+          </w:p>
+          <w:p>
+            <w:pPr>
+              <w:rPr>
+                <w:rFonts w:ascii="Times New Roman" w:eastAsia="Times New Roman" w:hAnsi="Times New Roman" w:cs="Times New Roman"/>
+                <w:sz w:val="28"/>
+                <w:szCs w:val="28"/>
+                <w:lang w:val="en-US"/>
+              </w:rPr>
+            </w:pPr>
+            <w:r>
+              <w:rPr>
+                <w:rFonts w:ascii="Times New Roman" w:eastAsia="Times New Roman" w:hAnsi="Times New Roman" w:cs="Times New Roman"/>
+                <w:sz w:val="28"/>
+                <w:szCs w:val="28"/>
+                <w:lang w:val="en-US"/>
+              </w:rPr>
               <w:lastRenderedPageBreak/>
-              <w:t>for tarfile in "$LATEST_BACKUP_DIR"/*.tar "$LATEST_BACKUP_DIR"/*.tar.gz "$LATEST_BACKUP_DIR"/*.</w:t>
+              <w:t xml:space="preserve">        </w:t>
             </w:r>
             <w:proofErr w:type="spellStart"/>
             <w:r>
@@ -7123,6 +8461,95 @@
                 <w:szCs w:val="28"/>
                 <w:lang w:val="en-US"/>
               </w:rPr>
+              <w:t>mkdir</w:t>
+            </w:r>
+            <w:proofErr w:type="spellEnd"/>
+            <w:r>
+              <w:rPr>
+                <w:rFonts w:ascii="Times New Roman" w:eastAsia="Times New Roman" w:hAnsi="Times New Roman" w:cs="Times New Roman"/>
+                <w:sz w:val="28"/>
+                <w:szCs w:val="28"/>
+                <w:lang w:val="en-US"/>
+              </w:rPr>
+              <w:t xml:space="preserve"> -p "$RECOVERY_DIR"</w:t>
+            </w:r>
+          </w:p>
+          <w:p>
+            <w:pPr>
+              <w:rPr>
+                <w:rFonts w:ascii="Times New Roman" w:eastAsia="Times New Roman" w:hAnsi="Times New Roman" w:cs="Times New Roman"/>
+                <w:sz w:val="28"/>
+                <w:szCs w:val="28"/>
+                <w:lang w:val="en-US"/>
+              </w:rPr>
+            </w:pPr>
+          </w:p>
+          <w:p>
+            <w:pPr>
+              <w:rPr>
+                <w:rFonts w:ascii="Times New Roman" w:eastAsia="Times New Roman" w:hAnsi="Times New Roman" w:cs="Times New Roman"/>
+                <w:sz w:val="28"/>
+                <w:szCs w:val="28"/>
+                <w:lang w:val="en-US"/>
+              </w:rPr>
+            </w:pPr>
+            <w:r>
+              <w:rPr>
+                <w:rFonts w:ascii="Times New Roman" w:eastAsia="Times New Roman" w:hAnsi="Times New Roman" w:cs="Times New Roman"/>
+                <w:sz w:val="28"/>
+                <w:szCs w:val="28"/>
+                <w:lang w:val="en-US"/>
+              </w:rPr>
+              <w:t xml:space="preserve">        if [[ "$tarfile" == </w:t>
+            </w:r>
+            <w:proofErr w:type="gramStart"/>
+            <w:r>
+              <w:rPr>
+                <w:rFonts w:ascii="Times New Roman" w:eastAsia="Times New Roman" w:hAnsi="Times New Roman" w:cs="Times New Roman"/>
+                <w:sz w:val="28"/>
+                <w:szCs w:val="28"/>
+                <w:lang w:val="en-US"/>
+              </w:rPr>
+              <w:t>*.</w:t>
+            </w:r>
+            <w:proofErr w:type="spellStart"/>
+            <w:r>
+              <w:rPr>
+                <w:rFonts w:ascii="Times New Roman" w:eastAsia="Times New Roman" w:hAnsi="Times New Roman" w:cs="Times New Roman"/>
+                <w:sz w:val="28"/>
+                <w:szCs w:val="28"/>
+                <w:lang w:val="en-US"/>
+              </w:rPr>
+              <w:t>gz</w:t>
+            </w:r>
+            <w:proofErr w:type="spellEnd"/>
+            <w:r>
+              <w:rPr>
+                <w:rFonts w:ascii="Times New Roman" w:eastAsia="Times New Roman" w:hAnsi="Times New Roman" w:cs="Times New Roman"/>
+                <w:sz w:val="28"/>
+                <w:szCs w:val="28"/>
+                <w:lang w:val="en-US"/>
+              </w:rPr>
+              <w:t xml:space="preserve"> ]</w:t>
+            </w:r>
+            <w:proofErr w:type="gramEnd"/>
+            <w:r>
+              <w:rPr>
+                <w:rFonts w:ascii="Times New Roman" w:eastAsia="Times New Roman" w:hAnsi="Times New Roman" w:cs="Times New Roman"/>
+                <w:sz w:val="28"/>
+                <w:szCs w:val="28"/>
+                <w:lang w:val="en-US"/>
+              </w:rPr>
+              <w:t>] || [[ "$tarfile" == *.</w:t>
+            </w:r>
+            <w:proofErr w:type="spellStart"/>
+            <w:r>
+              <w:rPr>
+                <w:rFonts w:ascii="Times New Roman" w:eastAsia="Times New Roman" w:hAnsi="Times New Roman" w:cs="Times New Roman"/>
+                <w:sz w:val="28"/>
+                <w:szCs w:val="28"/>
+                <w:lang w:val="en-US"/>
+              </w:rPr>
               <w:t>tgz</w:t>
             </w:r>
             <w:proofErr w:type="spellEnd"/>
@@ -7133,26 +8560,338 @@
                 <w:szCs w:val="28"/>
                 <w:lang w:val="en-US"/>
               </w:rPr>
-              <w:t>; do</w:t>
-            </w:r>
-          </w:p>
-          <w:p>
-            <w:pPr>
-              <w:rPr>
-                <w:rFonts w:ascii="Times New Roman" w:eastAsia="Times New Roman" w:hAnsi="Times New Roman" w:cs="Times New Roman"/>
-                <w:sz w:val="28"/>
-                <w:szCs w:val="28"/>
-                <w:lang w:val="en-US"/>
-              </w:rPr>
-            </w:pPr>
-            <w:r>
-              <w:rPr>
-                <w:rFonts w:ascii="Times New Roman" w:eastAsia="Times New Roman" w:hAnsi="Times New Roman" w:cs="Times New Roman"/>
-                <w:sz w:val="28"/>
-                <w:szCs w:val="28"/>
-                <w:lang w:val="en-US"/>
-              </w:rPr>
-              <w:t xml:space="preserve">    [ -f "$tarfile</w:t>
+              <w:t xml:space="preserve"> ]]; then</w:t>
+            </w:r>
+          </w:p>
+          <w:p>
+            <w:pPr>
+              <w:rPr>
+                <w:rFonts w:ascii="Times New Roman" w:eastAsia="Times New Roman" w:hAnsi="Times New Roman" w:cs="Times New Roman"/>
+                <w:sz w:val="28"/>
+                <w:szCs w:val="28"/>
+                <w:lang w:val="en-US"/>
+              </w:rPr>
+            </w:pPr>
+            <w:r>
+              <w:rPr>
+                <w:rFonts w:ascii="Times New Roman" w:eastAsia="Times New Roman" w:hAnsi="Times New Roman" w:cs="Times New Roman"/>
+                <w:sz w:val="28"/>
+                <w:szCs w:val="28"/>
+                <w:lang w:val="en-US"/>
+              </w:rPr>
+              <w:t xml:space="preserve">            tar -</w:t>
+            </w:r>
+            <w:proofErr w:type="spellStart"/>
+            <w:r>
+              <w:rPr>
+                <w:rFonts w:ascii="Times New Roman" w:eastAsia="Times New Roman" w:hAnsi="Times New Roman" w:cs="Times New Roman"/>
+                <w:sz w:val="28"/>
+                <w:szCs w:val="28"/>
+                <w:lang w:val="en-US"/>
+              </w:rPr>
+              <w:t>xzf</w:t>
+            </w:r>
+            <w:proofErr w:type="spellEnd"/>
+            <w:r>
+              <w:rPr>
+                <w:rFonts w:ascii="Times New Roman" w:eastAsia="Times New Roman" w:hAnsi="Times New Roman" w:cs="Times New Roman"/>
+                <w:sz w:val="28"/>
+                <w:szCs w:val="28"/>
+                <w:lang w:val="en-US"/>
+              </w:rPr>
+              <w:t xml:space="preserve"> "$tarfile" -C "$RECOVERY_DIR"</w:t>
+            </w:r>
+          </w:p>
+          <w:p>
+            <w:pPr>
+              <w:rPr>
+                <w:rFonts w:ascii="Times New Roman" w:eastAsia="Times New Roman" w:hAnsi="Times New Roman" w:cs="Times New Roman"/>
+                <w:sz w:val="28"/>
+                <w:szCs w:val="28"/>
+                <w:lang w:val="en-US"/>
+              </w:rPr>
+            </w:pPr>
+            <w:r>
+              <w:rPr>
+                <w:rFonts w:ascii="Times New Roman" w:eastAsia="Times New Roman" w:hAnsi="Times New Roman" w:cs="Times New Roman"/>
+                <w:sz w:val="28"/>
+                <w:szCs w:val="28"/>
+                <w:lang w:val="en-US"/>
+              </w:rPr>
+              <w:t xml:space="preserve">        else</w:t>
+            </w:r>
+          </w:p>
+          <w:p>
+            <w:pPr>
+              <w:rPr>
+                <w:rFonts w:ascii="Times New Roman" w:eastAsia="Times New Roman" w:hAnsi="Times New Roman" w:cs="Times New Roman"/>
+                <w:sz w:val="28"/>
+                <w:szCs w:val="28"/>
+                <w:lang w:val="en-US"/>
+              </w:rPr>
+            </w:pPr>
+            <w:r>
+              <w:rPr>
+                <w:rFonts w:ascii="Times New Roman" w:eastAsia="Times New Roman" w:hAnsi="Times New Roman" w:cs="Times New Roman"/>
+                <w:sz w:val="28"/>
+                <w:szCs w:val="28"/>
+                <w:lang w:val="en-US"/>
+              </w:rPr>
+              <w:t xml:space="preserve">            tar -</w:t>
+            </w:r>
+            <w:proofErr w:type="spellStart"/>
+            <w:r>
+              <w:rPr>
+                <w:rFonts w:ascii="Times New Roman" w:eastAsia="Times New Roman" w:hAnsi="Times New Roman" w:cs="Times New Roman"/>
+                <w:sz w:val="28"/>
+                <w:szCs w:val="28"/>
+                <w:lang w:val="en-US"/>
+              </w:rPr>
+              <w:t>xf</w:t>
+            </w:r>
+            <w:proofErr w:type="spellEnd"/>
+            <w:r>
+              <w:rPr>
+                <w:rFonts w:ascii="Times New Roman" w:eastAsia="Times New Roman" w:hAnsi="Times New Roman" w:cs="Times New Roman"/>
+                <w:sz w:val="28"/>
+                <w:szCs w:val="28"/>
+                <w:lang w:val="en-US"/>
+              </w:rPr>
+              <w:t xml:space="preserve"> "$tarfile" -C "$RECOVERY_DIR"</w:t>
+            </w:r>
+          </w:p>
+          <w:p>
+            <w:pPr>
+              <w:rPr>
+                <w:rFonts w:ascii="Times New Roman" w:eastAsia="Times New Roman" w:hAnsi="Times New Roman" w:cs="Times New Roman"/>
+                <w:sz w:val="28"/>
+                <w:szCs w:val="28"/>
+                <w:lang w:val="ru-RU"/>
+              </w:rPr>
+            </w:pPr>
+            <w:r>
+              <w:rPr>
+                <w:rFonts w:ascii="Times New Roman" w:eastAsia="Times New Roman" w:hAnsi="Times New Roman" w:cs="Times New Roman"/>
+                <w:sz w:val="28"/>
+                <w:szCs w:val="28"/>
+                <w:lang w:val="en-US"/>
+              </w:rPr>
+              <w:t xml:space="preserve">        </w:t>
+            </w:r>
+            <w:proofErr w:type="spellStart"/>
+            <w:r>
+              <w:rPr>
+                <w:rFonts w:ascii="Times New Roman" w:eastAsia="Times New Roman" w:hAnsi="Times New Roman" w:cs="Times New Roman"/>
+                <w:sz w:val="28"/>
+                <w:szCs w:val="28"/>
+                <w:lang w:val="ru-RU"/>
+              </w:rPr>
+              <w:t>fi</w:t>
+            </w:r>
+            <w:proofErr w:type="spellEnd"/>
+          </w:p>
+          <w:p>
+            <w:pPr>
+              <w:rPr>
+                <w:rFonts w:ascii="Times New Roman" w:eastAsia="Times New Roman" w:hAnsi="Times New Roman" w:cs="Times New Roman"/>
+                <w:sz w:val="28"/>
+                <w:szCs w:val="28"/>
+                <w:lang w:val="ru-RU"/>
+              </w:rPr>
+            </w:pPr>
+            <w:r>
+              <w:rPr>
+                <w:rFonts w:ascii="Times New Roman" w:eastAsia="Times New Roman" w:hAnsi="Times New Roman" w:cs="Times New Roman"/>
+                <w:sz w:val="28"/>
+                <w:szCs w:val="28"/>
+                <w:lang w:val="ru-RU"/>
+              </w:rPr>
+              <w:t xml:space="preserve">    </w:t>
+            </w:r>
+            <w:proofErr w:type="spellStart"/>
+            <w:r>
+              <w:rPr>
+                <w:rFonts w:ascii="Times New Roman" w:eastAsia="Times New Roman" w:hAnsi="Times New Roman" w:cs="Times New Roman"/>
+                <w:sz w:val="28"/>
+                <w:szCs w:val="28"/>
+                <w:lang w:val="ru-RU"/>
+              </w:rPr>
+              <w:t>fi</w:t>
+            </w:r>
+            <w:proofErr w:type="spellEnd"/>
+          </w:p>
+          <w:p>
+            <w:pPr>
+              <w:rPr>
+                <w:rFonts w:ascii="Times New Roman" w:eastAsia="Times New Roman" w:hAnsi="Times New Roman" w:cs="Times New Roman"/>
+                <w:sz w:val="28"/>
+                <w:szCs w:val="28"/>
+                <w:lang w:val="ru-RU"/>
+              </w:rPr>
+            </w:pPr>
+            <w:proofErr w:type="spellStart"/>
+            <w:r>
+              <w:rPr>
+                <w:rFonts w:ascii="Times New Roman" w:eastAsia="Times New Roman" w:hAnsi="Times New Roman" w:cs="Times New Roman"/>
+                <w:sz w:val="28"/>
+                <w:szCs w:val="28"/>
+                <w:lang w:val="ru-RU"/>
+              </w:rPr>
+              <w:t>done</w:t>
+            </w:r>
+            <w:proofErr w:type="spellEnd"/>
+          </w:p>
+          <w:p>
+            <w:pPr>
+              <w:rPr>
+                <w:rFonts w:ascii="Times New Roman" w:eastAsia="Times New Roman" w:hAnsi="Times New Roman" w:cs="Times New Roman"/>
+                <w:sz w:val="28"/>
+                <w:szCs w:val="28"/>
+                <w:lang w:val="ru-RU"/>
+              </w:rPr>
+            </w:pPr>
+          </w:p>
+          <w:p>
+            <w:pPr>
+              <w:rPr>
+                <w:rFonts w:ascii="Times New Roman" w:eastAsia="Times New Roman" w:hAnsi="Times New Roman" w:cs="Times New Roman"/>
+                <w:sz w:val="28"/>
+                <w:szCs w:val="28"/>
+                <w:lang w:val="ru-RU"/>
+              </w:rPr>
+            </w:pPr>
+            <w:proofErr w:type="spellStart"/>
+            <w:r>
+              <w:rPr>
+                <w:rFonts w:ascii="Times New Roman" w:eastAsia="Times New Roman" w:hAnsi="Times New Roman" w:cs="Times New Roman"/>
+                <w:sz w:val="28"/>
+                <w:szCs w:val="28"/>
+                <w:lang w:val="ru-RU"/>
+              </w:rPr>
+              <w:t>shopt</w:t>
+            </w:r>
+            <w:proofErr w:type="spellEnd"/>
+            <w:r>
+              <w:rPr>
+                <w:rFonts w:ascii="Times New Roman" w:eastAsia="Times New Roman" w:hAnsi="Times New Roman" w:cs="Times New Roman"/>
+                <w:sz w:val="28"/>
+                <w:szCs w:val="28"/>
+                <w:lang w:val="ru-RU"/>
+              </w:rPr>
+              <w:t xml:space="preserve"> -u </w:t>
+            </w:r>
+            <w:proofErr w:type="spellStart"/>
+            <w:r>
+              <w:rPr>
+                <w:rFonts w:ascii="Times New Roman" w:eastAsia="Times New Roman" w:hAnsi="Times New Roman" w:cs="Times New Roman"/>
+                <w:sz w:val="28"/>
+                <w:szCs w:val="28"/>
+                <w:lang w:val="ru-RU"/>
+              </w:rPr>
+              <w:t>nullglob</w:t>
+            </w:r>
+            <w:proofErr w:type="spellEnd"/>
+            <w:r>
+              <w:rPr>
+                <w:rFonts w:ascii="Times New Roman" w:eastAsia="Times New Roman" w:hAnsi="Times New Roman" w:cs="Times New Roman"/>
+                <w:sz w:val="28"/>
+                <w:szCs w:val="28"/>
+                <w:lang w:val="ru-RU"/>
+              </w:rPr>
+              <w:t xml:space="preserve">   # Возвращаем стандартное поведение</w:t>
+            </w:r>
+          </w:p>
+          <w:p>
+            <w:pPr>
+              <w:rPr>
+                <w:rFonts w:ascii="Times New Roman" w:eastAsia="Times New Roman" w:hAnsi="Times New Roman" w:cs="Times New Roman"/>
+                <w:sz w:val="28"/>
+                <w:szCs w:val="28"/>
+                <w:lang w:val="ru-RU"/>
+              </w:rPr>
+            </w:pPr>
+          </w:p>
+          <w:p>
+            <w:pPr>
+              <w:rPr>
+                <w:rFonts w:ascii="Times New Roman" w:eastAsia="Times New Roman" w:hAnsi="Times New Roman" w:cs="Times New Roman"/>
+                <w:sz w:val="28"/>
+                <w:szCs w:val="28"/>
+                <w:lang w:val="en-US"/>
+              </w:rPr>
+            </w:pPr>
+            <w:r>
+              <w:rPr>
+                <w:rFonts w:ascii="Times New Roman" w:eastAsia="Times New Roman" w:hAnsi="Times New Roman" w:cs="Times New Roman"/>
+                <w:sz w:val="28"/>
+                <w:szCs w:val="28"/>
+                <w:lang w:val="en-US"/>
+              </w:rPr>
+              <w:t xml:space="preserve"># </w:t>
+            </w:r>
+            <w:r>
+              <w:rPr>
+                <w:rFonts w:ascii="Times New Roman" w:eastAsia="Times New Roman" w:hAnsi="Times New Roman" w:cs="Times New Roman"/>
+                <w:sz w:val="28"/>
+                <w:szCs w:val="28"/>
+                <w:lang w:val="ru-RU"/>
+              </w:rPr>
+              <w:t>Копирование</w:t>
+            </w:r>
+            <w:r>
+              <w:rPr>
+                <w:rFonts w:ascii="Times New Roman" w:eastAsia="Times New Roman" w:hAnsi="Times New Roman" w:cs="Times New Roman"/>
+                <w:sz w:val="28"/>
+                <w:szCs w:val="28"/>
+                <w:lang w:val="en-US"/>
+              </w:rPr>
+              <w:t xml:space="preserve"> </w:t>
+            </w:r>
+            <w:r>
+              <w:rPr>
+                <w:rFonts w:ascii="Times New Roman" w:eastAsia="Times New Roman" w:hAnsi="Times New Roman" w:cs="Times New Roman"/>
+                <w:sz w:val="28"/>
+                <w:szCs w:val="28"/>
+                <w:lang w:val="ru-RU"/>
+              </w:rPr>
+              <w:t>несжатых</w:t>
+            </w:r>
+            <w:r>
+              <w:rPr>
+                <w:rFonts w:ascii="Times New Roman" w:eastAsia="Times New Roman" w:hAnsi="Times New Roman" w:cs="Times New Roman"/>
+                <w:sz w:val="28"/>
+                <w:szCs w:val="28"/>
+                <w:lang w:val="en-US"/>
+              </w:rPr>
+              <w:t xml:space="preserve"> </w:t>
+            </w:r>
+            <w:r>
+              <w:rPr>
+                <w:rFonts w:ascii="Times New Roman" w:eastAsia="Times New Roman" w:hAnsi="Times New Roman" w:cs="Times New Roman"/>
+                <w:sz w:val="28"/>
+                <w:szCs w:val="28"/>
+                <w:lang w:val="ru-RU"/>
+              </w:rPr>
+              <w:t>файлов</w:t>
+            </w:r>
+          </w:p>
+          <w:p>
+            <w:pPr>
+              <w:rPr>
+                <w:rFonts w:ascii="Times New Roman" w:eastAsia="Times New Roman" w:hAnsi="Times New Roman" w:cs="Times New Roman"/>
+                <w:sz w:val="28"/>
+                <w:szCs w:val="28"/>
+                <w:lang w:val="en-US"/>
+              </w:rPr>
+            </w:pPr>
+            <w:r>
+              <w:rPr>
+                <w:rFonts w:ascii="Times New Roman" w:eastAsia="Times New Roman" w:hAnsi="Times New Roman" w:cs="Times New Roman"/>
+                <w:sz w:val="28"/>
+                <w:szCs w:val="28"/>
+                <w:lang w:val="en-US"/>
+              </w:rPr>
+              <w:t>if [ -d "$LATEST_BACKUP_DIR/base</w:t>
             </w:r>
             <w:proofErr w:type="gramStart"/>
             <w:r>
@@ -7172,172 +8911,177 @@
                 <w:szCs w:val="28"/>
                 <w:lang w:val="en-US"/>
               </w:rPr>
-              <w:t xml:space="preserve"> || continue</w:t>
-            </w:r>
-          </w:p>
-          <w:p>
-            <w:pPr>
-              <w:rPr>
-                <w:rFonts w:ascii="Times New Roman" w:eastAsia="Times New Roman" w:hAnsi="Times New Roman" w:cs="Times New Roman"/>
-                <w:sz w:val="28"/>
-                <w:szCs w:val="28"/>
-                <w:lang w:val="en-US"/>
-              </w:rPr>
-            </w:pPr>
-            <w:r>
-              <w:rPr>
-                <w:rFonts w:ascii="Times New Roman" w:eastAsia="Times New Roman" w:hAnsi="Times New Roman" w:cs="Times New Roman"/>
-                <w:sz w:val="28"/>
-                <w:szCs w:val="28"/>
-                <w:lang w:val="en-US"/>
-              </w:rPr>
-              <w:t xml:space="preserve">    name=$(</w:t>
-            </w:r>
+              <w:t xml:space="preserve"> || [ -d "$LATEST_BACKUP_DIR/global" ]; then</w:t>
+            </w:r>
+          </w:p>
+          <w:p>
+            <w:pPr>
+              <w:rPr>
+                <w:rFonts w:ascii="Times New Roman" w:eastAsia="Times New Roman" w:hAnsi="Times New Roman" w:cs="Times New Roman"/>
+                <w:sz w:val="28"/>
+                <w:szCs w:val="28"/>
+                <w:lang w:val="en-US"/>
+              </w:rPr>
+            </w:pPr>
+            <w:r>
+              <w:rPr>
+                <w:rFonts w:ascii="Times New Roman" w:eastAsia="Times New Roman" w:hAnsi="Times New Roman" w:cs="Times New Roman"/>
+                <w:sz w:val="28"/>
+                <w:szCs w:val="28"/>
+                <w:lang w:val="en-US"/>
+              </w:rPr>
+              <w:t xml:space="preserve">    echo "Copying uncompressed files from backup directory to $RECOVERY_DIR"</w:t>
+            </w:r>
+          </w:p>
+          <w:p>
+            <w:pPr>
+              <w:rPr>
+                <w:rFonts w:ascii="Times New Roman" w:eastAsia="Times New Roman" w:hAnsi="Times New Roman" w:cs="Times New Roman"/>
+                <w:sz w:val="28"/>
+                <w:szCs w:val="28"/>
+                <w:lang w:val="en-US"/>
+              </w:rPr>
+            </w:pPr>
+            <w:r>
+              <w:rPr>
+                <w:rFonts w:ascii="Times New Roman" w:eastAsia="Times New Roman" w:hAnsi="Times New Roman" w:cs="Times New Roman"/>
+                <w:sz w:val="28"/>
+                <w:szCs w:val="28"/>
+                <w:lang w:val="en-US"/>
+              </w:rPr>
+              <w:t xml:space="preserve">    cp -r "$LATEST_BACKUP_DIR"/* "$RECOVERY_DIR"/ || true</w:t>
+            </w:r>
+          </w:p>
+          <w:p>
+            <w:pPr>
+              <w:rPr>
+                <w:rFonts w:ascii="Times New Roman" w:eastAsia="Times New Roman" w:hAnsi="Times New Roman" w:cs="Times New Roman"/>
+                <w:sz w:val="28"/>
+                <w:szCs w:val="28"/>
+                <w:lang w:val="ru-RU"/>
+              </w:rPr>
+            </w:pPr>
             <w:proofErr w:type="spellStart"/>
             <w:r>
               <w:rPr>
                 <w:rFonts w:ascii="Times New Roman" w:eastAsia="Times New Roman" w:hAnsi="Times New Roman" w:cs="Times New Roman"/>
                 <w:sz w:val="28"/>
                 <w:szCs w:val="28"/>
-                <w:lang w:val="en-US"/>
-              </w:rPr>
-              <w:t>basename</w:t>
+                <w:lang w:val="ru-RU"/>
+              </w:rPr>
+              <w:t>fi</w:t>
             </w:r>
             <w:proofErr w:type="spellEnd"/>
-            <w:r>
-              <w:rPr>
-                <w:rFonts w:ascii="Times New Roman" w:eastAsia="Times New Roman" w:hAnsi="Times New Roman" w:cs="Times New Roman"/>
-                <w:sz w:val="28"/>
-                <w:szCs w:val="28"/>
-                <w:lang w:val="en-US"/>
-              </w:rPr>
-              <w:t xml:space="preserve"> "$tarfile")</w:t>
-            </w:r>
-          </w:p>
-          <w:p>
-            <w:pPr>
-              <w:rPr>
-                <w:rFonts w:ascii="Times New Roman" w:eastAsia="Times New Roman" w:hAnsi="Times New Roman" w:cs="Times New Roman"/>
-                <w:sz w:val="28"/>
-                <w:szCs w:val="28"/>
-                <w:lang w:val="en-US"/>
-              </w:rPr>
-            </w:pPr>
-          </w:p>
-          <w:p>
-            <w:pPr>
-              <w:rPr>
-                <w:rFonts w:ascii="Times New Roman" w:eastAsia="Times New Roman" w:hAnsi="Times New Roman" w:cs="Times New Roman"/>
-                <w:sz w:val="28"/>
-                <w:szCs w:val="28"/>
-                <w:lang w:val="ru-RU"/>
-              </w:rPr>
-            </w:pPr>
-            <w:r>
-              <w:rPr>
-                <w:rFonts w:ascii="Times New Roman" w:eastAsia="Times New Roman" w:hAnsi="Times New Roman" w:cs="Times New Roman"/>
-                <w:sz w:val="28"/>
-                <w:szCs w:val="28"/>
-                <w:lang w:val="en-US"/>
-              </w:rPr>
-              <w:t xml:space="preserve">    </w:t>
-            </w:r>
-            <w:r>
-              <w:rPr>
-                <w:rFonts w:ascii="Times New Roman" w:eastAsia="Times New Roman" w:hAnsi="Times New Roman" w:cs="Times New Roman"/>
-                <w:sz w:val="28"/>
-                <w:szCs w:val="28"/>
-                <w:lang w:val="ru-RU"/>
-              </w:rPr>
-              <w:t># Если имя полностью числовое (OID.tar.gz), распаковываем в /</w:t>
-            </w:r>
-            <w:proofErr w:type="spellStart"/>
-            <w:r>
-              <w:rPr>
-                <w:rFonts w:ascii="Times New Roman" w:eastAsia="Times New Roman" w:hAnsi="Times New Roman" w:cs="Times New Roman"/>
-                <w:sz w:val="28"/>
-                <w:szCs w:val="28"/>
-                <w:lang w:val="ru-RU"/>
-              </w:rPr>
-              <w:t>var</w:t>
-            </w:r>
-            <w:proofErr w:type="spellEnd"/>
-            <w:r>
-              <w:rPr>
-                <w:rFonts w:ascii="Times New Roman" w:eastAsia="Times New Roman" w:hAnsi="Times New Roman" w:cs="Times New Roman"/>
-                <w:sz w:val="28"/>
-                <w:szCs w:val="28"/>
-                <w:lang w:val="ru-RU"/>
-              </w:rPr>
-              <w:t>/</w:t>
-            </w:r>
-            <w:proofErr w:type="spellStart"/>
-            <w:r>
-              <w:rPr>
-                <w:rFonts w:ascii="Times New Roman" w:eastAsia="Times New Roman" w:hAnsi="Times New Roman" w:cs="Times New Roman"/>
-                <w:sz w:val="28"/>
-                <w:szCs w:val="28"/>
-                <w:lang w:val="ru-RU"/>
-              </w:rPr>
-              <w:t>db</w:t>
-            </w:r>
-            <w:proofErr w:type="spellEnd"/>
-            <w:r>
-              <w:rPr>
-                <w:rFonts w:ascii="Times New Roman" w:eastAsia="Times New Roman" w:hAnsi="Times New Roman" w:cs="Times New Roman"/>
-                <w:sz w:val="28"/>
-                <w:szCs w:val="28"/>
-                <w:lang w:val="ru-RU"/>
-              </w:rPr>
-              <w:t>/postgres0/&lt;</w:t>
-            </w:r>
-            <w:proofErr w:type="spellStart"/>
-            <w:r>
-              <w:rPr>
-                <w:rFonts w:ascii="Times New Roman" w:eastAsia="Times New Roman" w:hAnsi="Times New Roman" w:cs="Times New Roman"/>
-                <w:sz w:val="28"/>
-                <w:szCs w:val="28"/>
-                <w:lang w:val="ru-RU"/>
-              </w:rPr>
-              <w:t>oid</w:t>
-            </w:r>
-            <w:proofErr w:type="spellEnd"/>
-            <w:r>
-              <w:rPr>
-                <w:rFonts w:ascii="Times New Roman" w:eastAsia="Times New Roman" w:hAnsi="Times New Roman" w:cs="Times New Roman"/>
-                <w:sz w:val="28"/>
-                <w:szCs w:val="28"/>
-                <w:lang w:val="ru-RU"/>
-              </w:rPr>
-              <w:t>&gt;/</w:t>
-            </w:r>
-          </w:p>
-          <w:p>
-            <w:pPr>
-              <w:rPr>
-                <w:rFonts w:ascii="Times New Roman" w:eastAsia="Times New Roman" w:hAnsi="Times New Roman" w:cs="Times New Roman"/>
-                <w:sz w:val="28"/>
-                <w:szCs w:val="28"/>
-                <w:lang w:val="en-US"/>
-              </w:rPr>
-            </w:pPr>
-            <w:r>
-              <w:rPr>
-                <w:rFonts w:ascii="Times New Roman" w:eastAsia="Times New Roman" w:hAnsi="Times New Roman" w:cs="Times New Roman"/>
-                <w:sz w:val="28"/>
-                <w:szCs w:val="28"/>
-                <w:lang w:val="ru-RU"/>
-              </w:rPr>
-              <w:t xml:space="preserve">    </w:t>
-            </w:r>
-            <w:r>
-              <w:rPr>
-                <w:rFonts w:ascii="Times New Roman" w:eastAsia="Times New Roman" w:hAnsi="Times New Roman" w:cs="Times New Roman"/>
-                <w:sz w:val="28"/>
-                <w:szCs w:val="28"/>
-                <w:lang w:val="en-US"/>
-              </w:rPr>
-              <w:t>if [[ "$name" =~ ^([0-</w:t>
+          </w:p>
+          <w:p>
+            <w:pPr>
+              <w:rPr>
+                <w:rFonts w:ascii="Times New Roman" w:eastAsia="Times New Roman" w:hAnsi="Times New Roman" w:cs="Times New Roman"/>
+                <w:sz w:val="28"/>
+                <w:szCs w:val="28"/>
+                <w:lang w:val="ru-RU"/>
+              </w:rPr>
+            </w:pPr>
+          </w:p>
+          <w:p>
+            <w:pPr>
+              <w:rPr>
+                <w:rFonts w:ascii="Times New Roman" w:eastAsia="Times New Roman" w:hAnsi="Times New Roman" w:cs="Times New Roman"/>
+                <w:sz w:val="28"/>
+                <w:szCs w:val="28"/>
+                <w:lang w:val="ru-RU"/>
+              </w:rPr>
+            </w:pPr>
+            <w:r>
+              <w:rPr>
+                <w:rFonts w:ascii="Times New Roman" w:eastAsia="Times New Roman" w:hAnsi="Times New Roman" w:cs="Times New Roman"/>
+                <w:sz w:val="28"/>
+                <w:szCs w:val="28"/>
+                <w:lang w:val="ru-RU"/>
+              </w:rPr>
+              <w:t># Установка прав владельца</w:t>
+            </w:r>
+          </w:p>
+          <w:p>
+            <w:pPr>
+              <w:rPr>
+                <w:rFonts w:ascii="Times New Roman" w:eastAsia="Times New Roman" w:hAnsi="Times New Roman" w:cs="Times New Roman"/>
+                <w:sz w:val="28"/>
+                <w:szCs w:val="28"/>
+                <w:lang w:val="en-US"/>
+              </w:rPr>
+            </w:pPr>
+            <w:r>
+              <w:rPr>
+                <w:rFonts w:ascii="Times New Roman" w:eastAsia="Times New Roman" w:hAnsi="Times New Roman" w:cs="Times New Roman"/>
+                <w:sz w:val="28"/>
+                <w:szCs w:val="28"/>
+                <w:lang w:val="en-US"/>
+              </w:rPr>
+              <w:t>if</w:t>
+            </w:r>
+            <w:r>
+              <w:rPr>
+                <w:rFonts w:ascii="Times New Roman" w:eastAsia="Times New Roman" w:hAnsi="Times New Roman" w:cs="Times New Roman"/>
+                <w:sz w:val="28"/>
+                <w:szCs w:val="28"/>
+                <w:lang w:val="en-US"/>
+              </w:rPr>
+              <w:t xml:space="preserve"> [ "$(</w:t>
+            </w:r>
+            <w:r>
+              <w:rPr>
+                <w:rFonts w:ascii="Times New Roman" w:eastAsia="Times New Roman" w:hAnsi="Times New Roman" w:cs="Times New Roman"/>
+                <w:sz w:val="28"/>
+                <w:szCs w:val="28"/>
+                <w:lang w:val="en-US"/>
+              </w:rPr>
+              <w:t>id</w:t>
+            </w:r>
+            <w:r>
+              <w:rPr>
+                <w:rFonts w:ascii="Times New Roman" w:eastAsia="Times New Roman" w:hAnsi="Times New Roman" w:cs="Times New Roman"/>
+                <w:sz w:val="28"/>
+                <w:szCs w:val="28"/>
+                <w:lang w:val="en-US"/>
+              </w:rPr>
+              <w:t xml:space="preserve"> -</w:t>
+            </w:r>
+            <w:r>
+              <w:rPr>
+                <w:rFonts w:ascii="Times New Roman" w:eastAsia="Times New Roman" w:hAnsi="Times New Roman" w:cs="Times New Roman"/>
+                <w:sz w:val="28"/>
+                <w:szCs w:val="28"/>
+                <w:lang w:val="en-US"/>
+              </w:rPr>
+              <w:t>u</w:t>
+            </w:r>
+            <w:r>
+              <w:rPr>
+                <w:rFonts w:ascii="Times New Roman" w:eastAsia="Times New Roman" w:hAnsi="Times New Roman" w:cs="Times New Roman"/>
+                <w:sz w:val="28"/>
+                <w:szCs w:val="28"/>
+                <w:lang w:val="en-US"/>
+              </w:rPr>
+              <w:t>)" -</w:t>
+            </w:r>
+            <w:r>
+              <w:rPr>
+                <w:rFonts w:ascii="Times New Roman" w:eastAsia="Times New Roman" w:hAnsi="Times New Roman" w:cs="Times New Roman"/>
+                <w:sz w:val="28"/>
+                <w:szCs w:val="28"/>
+                <w:lang w:val="en-US"/>
+              </w:rPr>
+              <w:t>eq</w:t>
+            </w:r>
+            <w:r>
+              <w:rPr>
+                <w:rFonts w:ascii="Times New Roman" w:eastAsia="Times New Roman" w:hAnsi="Times New Roman" w:cs="Times New Roman"/>
+                <w:sz w:val="28"/>
+                <w:szCs w:val="28"/>
+                <w:lang w:val="en-US"/>
+              </w:rPr>
+              <w:t xml:space="preserve"> </w:t>
             </w:r>
             <w:proofErr w:type="gramStart"/>
             <w:r>
@@ -7347,7 +9091,7 @@
                 <w:szCs w:val="28"/>
                 <w:lang w:val="en-US"/>
               </w:rPr>
-              <w:t>9]+</w:t>
+              <w:t>0 ]</w:t>
             </w:r>
             <w:proofErr w:type="gramEnd"/>
             <w:r>
@@ -7357,1484 +9101,6 @@
                 <w:szCs w:val="28"/>
                 <w:lang w:val="en-US"/>
               </w:rPr>
-              <w:t>)\.tar(\.</w:t>
-            </w:r>
-            <w:proofErr w:type="spellStart"/>
-            <w:r>
-              <w:rPr>
-                <w:rFonts w:ascii="Times New Roman" w:eastAsia="Times New Roman" w:hAnsi="Times New Roman" w:cs="Times New Roman"/>
-                <w:sz w:val="28"/>
-                <w:szCs w:val="28"/>
-                <w:lang w:val="en-US"/>
-              </w:rPr>
-              <w:t>gz</w:t>
-            </w:r>
-            <w:proofErr w:type="spellEnd"/>
-            <w:r>
-              <w:rPr>
-                <w:rFonts w:ascii="Times New Roman" w:eastAsia="Times New Roman" w:hAnsi="Times New Roman" w:cs="Times New Roman"/>
-                <w:sz w:val="28"/>
-                <w:szCs w:val="28"/>
-                <w:lang w:val="en-US"/>
-              </w:rPr>
-              <w:t>)?$ ]] || [[ "$name" =~ ^([0-9]+)\.</w:t>
-            </w:r>
-            <w:proofErr w:type="spellStart"/>
-            <w:r>
-              <w:rPr>
-                <w:rFonts w:ascii="Times New Roman" w:eastAsia="Times New Roman" w:hAnsi="Times New Roman" w:cs="Times New Roman"/>
-                <w:sz w:val="28"/>
-                <w:szCs w:val="28"/>
-                <w:lang w:val="en-US"/>
-              </w:rPr>
-              <w:t>tgz</w:t>
-            </w:r>
-            <w:proofErr w:type="spellEnd"/>
-            <w:r>
-              <w:rPr>
-                <w:rFonts w:ascii="Times New Roman" w:eastAsia="Times New Roman" w:hAnsi="Times New Roman" w:cs="Times New Roman"/>
-                <w:sz w:val="28"/>
-                <w:szCs w:val="28"/>
-                <w:lang w:val="en-US"/>
-              </w:rPr>
-              <w:t>$ ]]; then</w:t>
-            </w:r>
-          </w:p>
-          <w:p>
-            <w:pPr>
-              <w:rPr>
-                <w:rFonts w:ascii="Times New Roman" w:eastAsia="Times New Roman" w:hAnsi="Times New Roman" w:cs="Times New Roman"/>
-                <w:sz w:val="28"/>
-                <w:szCs w:val="28"/>
-                <w:lang w:val="en-US"/>
-              </w:rPr>
-            </w:pPr>
-            <w:r>
-              <w:rPr>
-                <w:rFonts w:ascii="Times New Roman" w:eastAsia="Times New Roman" w:hAnsi="Times New Roman" w:cs="Times New Roman"/>
-                <w:sz w:val="28"/>
-                <w:szCs w:val="28"/>
-                <w:lang w:val="en-US"/>
-              </w:rPr>
-              <w:t xml:space="preserve">        if [[ "$name" =~ </w:t>
-            </w:r>
-            <w:proofErr w:type="gramStart"/>
-            <w:r>
-              <w:rPr>
-                <w:rFonts w:ascii="Times New Roman" w:eastAsia="Times New Roman" w:hAnsi="Times New Roman" w:cs="Times New Roman"/>
-                <w:sz w:val="28"/>
-                <w:szCs w:val="28"/>
-                <w:lang w:val="en-US"/>
-              </w:rPr>
-              <w:t>^(</w:t>
-            </w:r>
-            <w:proofErr w:type="gramEnd"/>
-            <w:r>
-              <w:rPr>
-                <w:rFonts w:ascii="Times New Roman" w:eastAsia="Times New Roman" w:hAnsi="Times New Roman" w:cs="Times New Roman"/>
-                <w:sz w:val="28"/>
-                <w:szCs w:val="28"/>
-                <w:lang w:val="en-US"/>
-              </w:rPr>
-              <w:t>[0-9]+) ]]; then</w:t>
-            </w:r>
-          </w:p>
-          <w:p>
-            <w:pPr>
-              <w:rPr>
-                <w:rFonts w:ascii="Times New Roman" w:eastAsia="Times New Roman" w:hAnsi="Times New Roman" w:cs="Times New Roman"/>
-                <w:sz w:val="28"/>
-                <w:szCs w:val="28"/>
-                <w:lang w:val="en-US"/>
-              </w:rPr>
-            </w:pPr>
-            <w:r>
-              <w:rPr>
-                <w:rFonts w:ascii="Times New Roman" w:eastAsia="Times New Roman" w:hAnsi="Times New Roman" w:cs="Times New Roman"/>
-                <w:sz w:val="28"/>
-                <w:szCs w:val="28"/>
-                <w:lang w:val="en-US"/>
-              </w:rPr>
-              <w:t xml:space="preserve">            </w:t>
-            </w:r>
-            <w:proofErr w:type="spellStart"/>
-            <w:r>
-              <w:rPr>
-                <w:rFonts w:ascii="Times New Roman" w:eastAsia="Times New Roman" w:hAnsi="Times New Roman" w:cs="Times New Roman"/>
-                <w:sz w:val="28"/>
-                <w:szCs w:val="28"/>
-                <w:lang w:val="en-US"/>
-              </w:rPr>
-              <w:t>oid</w:t>
-            </w:r>
-            <w:proofErr w:type="spellEnd"/>
-            <w:r>
-              <w:rPr>
-                <w:rFonts w:ascii="Times New Roman" w:eastAsia="Times New Roman" w:hAnsi="Times New Roman" w:cs="Times New Roman"/>
-                <w:sz w:val="28"/>
-                <w:szCs w:val="28"/>
-                <w:lang w:val="en-US"/>
-              </w:rPr>
-              <w:t>="${BASH_</w:t>
-            </w:r>
-            <w:proofErr w:type="gramStart"/>
-            <w:r>
-              <w:rPr>
-                <w:rFonts w:ascii="Times New Roman" w:eastAsia="Times New Roman" w:hAnsi="Times New Roman" w:cs="Times New Roman"/>
-                <w:sz w:val="28"/>
-                <w:szCs w:val="28"/>
-                <w:lang w:val="en-US"/>
-              </w:rPr>
-              <w:t>REMATCH[</w:t>
-            </w:r>
-            <w:proofErr w:type="gramEnd"/>
-            <w:r>
-              <w:rPr>
-                <w:rFonts w:ascii="Times New Roman" w:eastAsia="Times New Roman" w:hAnsi="Times New Roman" w:cs="Times New Roman"/>
-                <w:sz w:val="28"/>
-                <w:szCs w:val="28"/>
-                <w:lang w:val="en-US"/>
-              </w:rPr>
-              <w:t>1]}"</w:t>
-            </w:r>
-          </w:p>
-          <w:p>
-            <w:pPr>
-              <w:rPr>
-                <w:rFonts w:ascii="Times New Roman" w:eastAsia="Times New Roman" w:hAnsi="Times New Roman" w:cs="Times New Roman"/>
-                <w:sz w:val="28"/>
-                <w:szCs w:val="28"/>
-                <w:lang w:val="en-US"/>
-              </w:rPr>
-            </w:pPr>
-            <w:r>
-              <w:rPr>
-                <w:rFonts w:ascii="Times New Roman" w:eastAsia="Times New Roman" w:hAnsi="Times New Roman" w:cs="Times New Roman"/>
-                <w:sz w:val="28"/>
-                <w:szCs w:val="28"/>
-                <w:lang w:val="en-US"/>
-              </w:rPr>
-              <w:t xml:space="preserve">        else</w:t>
-            </w:r>
-          </w:p>
-          <w:p>
-            <w:pPr>
-              <w:rPr>
-                <w:rFonts w:ascii="Times New Roman" w:eastAsia="Times New Roman" w:hAnsi="Times New Roman" w:cs="Times New Roman"/>
-                <w:sz w:val="28"/>
-                <w:szCs w:val="28"/>
-                <w:lang w:val="en-US"/>
-              </w:rPr>
-            </w:pPr>
-            <w:r>
-              <w:rPr>
-                <w:rFonts w:ascii="Times New Roman" w:eastAsia="Times New Roman" w:hAnsi="Times New Roman" w:cs="Times New Roman"/>
-                <w:sz w:val="28"/>
-                <w:szCs w:val="28"/>
-                <w:lang w:val="en-US"/>
-              </w:rPr>
-              <w:t xml:space="preserve">            echo "Skipping unexpected numeric-named file: $name"</w:t>
-            </w:r>
-          </w:p>
-          <w:p>
-            <w:pPr>
-              <w:rPr>
-                <w:rFonts w:ascii="Times New Roman" w:eastAsia="Times New Roman" w:hAnsi="Times New Roman" w:cs="Times New Roman"/>
-                <w:sz w:val="28"/>
-                <w:szCs w:val="28"/>
-                <w:lang w:val="en-US"/>
-              </w:rPr>
-            </w:pPr>
-            <w:r>
-              <w:rPr>
-                <w:rFonts w:ascii="Times New Roman" w:eastAsia="Times New Roman" w:hAnsi="Times New Roman" w:cs="Times New Roman"/>
-                <w:sz w:val="28"/>
-                <w:szCs w:val="28"/>
-                <w:lang w:val="en-US"/>
-              </w:rPr>
-              <w:t xml:space="preserve">            continue</w:t>
-            </w:r>
-          </w:p>
-          <w:p>
-            <w:pPr>
-              <w:rPr>
-                <w:rFonts w:ascii="Times New Roman" w:eastAsia="Times New Roman" w:hAnsi="Times New Roman" w:cs="Times New Roman"/>
-                <w:sz w:val="28"/>
-                <w:szCs w:val="28"/>
-                <w:lang w:val="en-US"/>
-              </w:rPr>
-            </w:pPr>
-            <w:r>
-              <w:rPr>
-                <w:rFonts w:ascii="Times New Roman" w:eastAsia="Times New Roman" w:hAnsi="Times New Roman" w:cs="Times New Roman"/>
-                <w:sz w:val="28"/>
-                <w:szCs w:val="28"/>
-                <w:lang w:val="en-US"/>
-              </w:rPr>
-              <w:t xml:space="preserve">        fi</w:t>
-            </w:r>
-          </w:p>
-          <w:p>
-            <w:pPr>
-              <w:rPr>
-                <w:rFonts w:ascii="Times New Roman" w:eastAsia="Times New Roman" w:hAnsi="Times New Roman" w:cs="Times New Roman"/>
-                <w:sz w:val="28"/>
-                <w:szCs w:val="28"/>
-                <w:lang w:val="en-US"/>
-              </w:rPr>
-            </w:pPr>
-          </w:p>
-          <w:p>
-            <w:pPr>
-              <w:rPr>
-                <w:rFonts w:ascii="Times New Roman" w:eastAsia="Times New Roman" w:hAnsi="Times New Roman" w:cs="Times New Roman"/>
-                <w:sz w:val="28"/>
-                <w:szCs w:val="28"/>
-                <w:lang w:val="en-US"/>
-              </w:rPr>
-            </w:pPr>
-            <w:r>
-              <w:rPr>
-                <w:rFonts w:ascii="Times New Roman" w:eastAsia="Times New Roman" w:hAnsi="Times New Roman" w:cs="Times New Roman"/>
-                <w:sz w:val="28"/>
-                <w:szCs w:val="28"/>
-                <w:lang w:val="en-US"/>
-              </w:rPr>
-              <w:t xml:space="preserve">        </w:t>
-            </w:r>
-            <w:proofErr w:type="spellStart"/>
-            <w:r>
-              <w:rPr>
-                <w:rFonts w:ascii="Times New Roman" w:eastAsia="Times New Roman" w:hAnsi="Times New Roman" w:cs="Times New Roman"/>
-                <w:sz w:val="28"/>
-                <w:szCs w:val="28"/>
-                <w:lang w:val="en-US"/>
-              </w:rPr>
-              <w:t>dest</w:t>
-            </w:r>
-            <w:proofErr w:type="spellEnd"/>
-            <w:r>
-              <w:rPr>
-                <w:rFonts w:ascii="Times New Roman" w:eastAsia="Times New Roman" w:hAnsi="Times New Roman" w:cs="Times New Roman"/>
-                <w:sz w:val="28"/>
-                <w:szCs w:val="28"/>
-                <w:lang w:val="en-US"/>
-              </w:rPr>
-              <w:t>="$TABLESPACE_ROOT/$</w:t>
-            </w:r>
-            <w:proofErr w:type="spellStart"/>
-            <w:r>
-              <w:rPr>
-                <w:rFonts w:ascii="Times New Roman" w:eastAsia="Times New Roman" w:hAnsi="Times New Roman" w:cs="Times New Roman"/>
-                <w:sz w:val="28"/>
-                <w:szCs w:val="28"/>
-                <w:lang w:val="en-US"/>
-              </w:rPr>
-              <w:t>oid</w:t>
-            </w:r>
-            <w:proofErr w:type="spellEnd"/>
-            <w:r>
-              <w:rPr>
-                <w:rFonts w:ascii="Times New Roman" w:eastAsia="Times New Roman" w:hAnsi="Times New Roman" w:cs="Times New Roman"/>
-                <w:sz w:val="28"/>
-                <w:szCs w:val="28"/>
-                <w:lang w:val="en-US"/>
-              </w:rPr>
-              <w:t>"</w:t>
-            </w:r>
-          </w:p>
-          <w:p>
-            <w:pPr>
-              <w:rPr>
-                <w:rFonts w:ascii="Times New Roman" w:eastAsia="Times New Roman" w:hAnsi="Times New Roman" w:cs="Times New Roman"/>
-                <w:sz w:val="28"/>
-                <w:szCs w:val="28"/>
-                <w:lang w:val="en-US"/>
-              </w:rPr>
-            </w:pPr>
-            <w:r>
-              <w:rPr>
-                <w:rFonts w:ascii="Times New Roman" w:eastAsia="Times New Roman" w:hAnsi="Times New Roman" w:cs="Times New Roman"/>
-                <w:sz w:val="28"/>
-                <w:szCs w:val="28"/>
-                <w:lang w:val="en-US"/>
-              </w:rPr>
-              <w:t xml:space="preserve">        echo "Extracting tablespace archive $name -&gt; $</w:t>
-            </w:r>
-            <w:proofErr w:type="spellStart"/>
-            <w:r>
-              <w:rPr>
-                <w:rFonts w:ascii="Times New Roman" w:eastAsia="Times New Roman" w:hAnsi="Times New Roman" w:cs="Times New Roman"/>
-                <w:sz w:val="28"/>
-                <w:szCs w:val="28"/>
-                <w:lang w:val="en-US"/>
-              </w:rPr>
-              <w:t>dest</w:t>
-            </w:r>
-            <w:proofErr w:type="spellEnd"/>
-            <w:r>
-              <w:rPr>
-                <w:rFonts w:ascii="Times New Roman" w:eastAsia="Times New Roman" w:hAnsi="Times New Roman" w:cs="Times New Roman"/>
-                <w:sz w:val="28"/>
-                <w:szCs w:val="28"/>
-                <w:lang w:val="en-US"/>
-              </w:rPr>
-              <w:t>"</w:t>
-            </w:r>
-          </w:p>
-          <w:p>
-            <w:pPr>
-              <w:rPr>
-                <w:rFonts w:ascii="Times New Roman" w:eastAsia="Times New Roman" w:hAnsi="Times New Roman" w:cs="Times New Roman"/>
-                <w:sz w:val="28"/>
-                <w:szCs w:val="28"/>
-                <w:lang w:val="en-US"/>
-              </w:rPr>
-            </w:pPr>
-            <w:r>
-              <w:rPr>
-                <w:rFonts w:ascii="Times New Roman" w:eastAsia="Times New Roman" w:hAnsi="Times New Roman" w:cs="Times New Roman"/>
-                <w:sz w:val="28"/>
-                <w:szCs w:val="28"/>
-                <w:lang w:val="en-US"/>
-              </w:rPr>
-              <w:t xml:space="preserve">        </w:t>
-            </w:r>
-            <w:proofErr w:type="spellStart"/>
-            <w:r>
-              <w:rPr>
-                <w:rFonts w:ascii="Times New Roman" w:eastAsia="Times New Roman" w:hAnsi="Times New Roman" w:cs="Times New Roman"/>
-                <w:sz w:val="28"/>
-                <w:szCs w:val="28"/>
-                <w:lang w:val="en-US"/>
-              </w:rPr>
-              <w:t>mkdir</w:t>
-            </w:r>
-            <w:proofErr w:type="spellEnd"/>
-            <w:r>
-              <w:rPr>
-                <w:rFonts w:ascii="Times New Roman" w:eastAsia="Times New Roman" w:hAnsi="Times New Roman" w:cs="Times New Roman"/>
-                <w:sz w:val="28"/>
-                <w:szCs w:val="28"/>
-                <w:lang w:val="en-US"/>
-              </w:rPr>
-              <w:t xml:space="preserve"> -p "$</w:t>
-            </w:r>
-            <w:proofErr w:type="spellStart"/>
-            <w:r>
-              <w:rPr>
-                <w:rFonts w:ascii="Times New Roman" w:eastAsia="Times New Roman" w:hAnsi="Times New Roman" w:cs="Times New Roman"/>
-                <w:sz w:val="28"/>
-                <w:szCs w:val="28"/>
-                <w:lang w:val="en-US"/>
-              </w:rPr>
-              <w:t>dest</w:t>
-            </w:r>
-            <w:proofErr w:type="spellEnd"/>
-            <w:r>
-              <w:rPr>
-                <w:rFonts w:ascii="Times New Roman" w:eastAsia="Times New Roman" w:hAnsi="Times New Roman" w:cs="Times New Roman"/>
-                <w:sz w:val="28"/>
-                <w:szCs w:val="28"/>
-                <w:lang w:val="en-US"/>
-              </w:rPr>
-              <w:t>"</w:t>
-            </w:r>
-          </w:p>
-          <w:p>
-            <w:pPr>
-              <w:rPr>
-                <w:rFonts w:ascii="Times New Roman" w:eastAsia="Times New Roman" w:hAnsi="Times New Roman" w:cs="Times New Roman"/>
-                <w:sz w:val="28"/>
-                <w:szCs w:val="28"/>
-                <w:lang w:val="en-US"/>
-              </w:rPr>
-            </w:pPr>
-          </w:p>
-          <w:p>
-            <w:pPr>
-              <w:rPr>
-                <w:rFonts w:ascii="Times New Roman" w:eastAsia="Times New Roman" w:hAnsi="Times New Roman" w:cs="Times New Roman"/>
-                <w:sz w:val="28"/>
-                <w:szCs w:val="28"/>
-                <w:lang w:val="en-US"/>
-              </w:rPr>
-            </w:pPr>
-            <w:r>
-              <w:rPr>
-                <w:rFonts w:ascii="Times New Roman" w:eastAsia="Times New Roman" w:hAnsi="Times New Roman" w:cs="Times New Roman"/>
-                <w:sz w:val="28"/>
-                <w:szCs w:val="28"/>
-                <w:lang w:val="en-US"/>
-              </w:rPr>
-              <w:t xml:space="preserve">        if [[ "$tarfile" == </w:t>
-            </w:r>
-            <w:proofErr w:type="gramStart"/>
-            <w:r>
-              <w:rPr>
-                <w:rFonts w:ascii="Times New Roman" w:eastAsia="Times New Roman" w:hAnsi="Times New Roman" w:cs="Times New Roman"/>
-                <w:sz w:val="28"/>
-                <w:szCs w:val="28"/>
-                <w:lang w:val="en-US"/>
-              </w:rPr>
-              <w:t>*.</w:t>
-            </w:r>
-            <w:proofErr w:type="spellStart"/>
-            <w:r>
-              <w:rPr>
-                <w:rFonts w:ascii="Times New Roman" w:eastAsia="Times New Roman" w:hAnsi="Times New Roman" w:cs="Times New Roman"/>
-                <w:sz w:val="28"/>
-                <w:szCs w:val="28"/>
-                <w:lang w:val="en-US"/>
-              </w:rPr>
-              <w:t>gz</w:t>
-            </w:r>
-            <w:proofErr w:type="spellEnd"/>
-            <w:r>
-              <w:rPr>
-                <w:rFonts w:ascii="Times New Roman" w:eastAsia="Times New Roman" w:hAnsi="Times New Roman" w:cs="Times New Roman"/>
-                <w:sz w:val="28"/>
-                <w:szCs w:val="28"/>
-                <w:lang w:val="en-US"/>
-              </w:rPr>
-              <w:t xml:space="preserve"> ]</w:t>
-            </w:r>
-            <w:proofErr w:type="gramEnd"/>
-            <w:r>
-              <w:rPr>
-                <w:rFonts w:ascii="Times New Roman" w:eastAsia="Times New Roman" w:hAnsi="Times New Roman" w:cs="Times New Roman"/>
-                <w:sz w:val="28"/>
-                <w:szCs w:val="28"/>
-                <w:lang w:val="en-US"/>
-              </w:rPr>
-              <w:t>] || [[ "$tarfile" == *.</w:t>
-            </w:r>
-            <w:proofErr w:type="spellStart"/>
-            <w:r>
-              <w:rPr>
-                <w:rFonts w:ascii="Times New Roman" w:eastAsia="Times New Roman" w:hAnsi="Times New Roman" w:cs="Times New Roman"/>
-                <w:sz w:val="28"/>
-                <w:szCs w:val="28"/>
-                <w:lang w:val="en-US"/>
-              </w:rPr>
-              <w:t>tgz</w:t>
-            </w:r>
-            <w:proofErr w:type="spellEnd"/>
-            <w:r>
-              <w:rPr>
-                <w:rFonts w:ascii="Times New Roman" w:eastAsia="Times New Roman" w:hAnsi="Times New Roman" w:cs="Times New Roman"/>
-                <w:sz w:val="28"/>
-                <w:szCs w:val="28"/>
-                <w:lang w:val="en-US"/>
-              </w:rPr>
-              <w:t xml:space="preserve"> ]]; then</w:t>
-            </w:r>
-          </w:p>
-          <w:p>
-            <w:pPr>
-              <w:rPr>
-                <w:rFonts w:ascii="Times New Roman" w:eastAsia="Times New Roman" w:hAnsi="Times New Roman" w:cs="Times New Roman"/>
-                <w:sz w:val="28"/>
-                <w:szCs w:val="28"/>
-                <w:lang w:val="en-US"/>
-              </w:rPr>
-            </w:pPr>
-            <w:r>
-              <w:rPr>
-                <w:rFonts w:ascii="Times New Roman" w:eastAsia="Times New Roman" w:hAnsi="Times New Roman" w:cs="Times New Roman"/>
-                <w:sz w:val="28"/>
-                <w:szCs w:val="28"/>
-                <w:lang w:val="en-US"/>
-              </w:rPr>
-              <w:t xml:space="preserve">            tar -</w:t>
-            </w:r>
-            <w:proofErr w:type="spellStart"/>
-            <w:r>
-              <w:rPr>
-                <w:rFonts w:ascii="Times New Roman" w:eastAsia="Times New Roman" w:hAnsi="Times New Roman" w:cs="Times New Roman"/>
-                <w:sz w:val="28"/>
-                <w:szCs w:val="28"/>
-                <w:lang w:val="en-US"/>
-              </w:rPr>
-              <w:t>xzf</w:t>
-            </w:r>
-            <w:proofErr w:type="spellEnd"/>
-            <w:r>
-              <w:rPr>
-                <w:rFonts w:ascii="Times New Roman" w:eastAsia="Times New Roman" w:hAnsi="Times New Roman" w:cs="Times New Roman"/>
-                <w:sz w:val="28"/>
-                <w:szCs w:val="28"/>
-                <w:lang w:val="en-US"/>
-              </w:rPr>
-              <w:t xml:space="preserve"> "$tarfile" -C "$</w:t>
-            </w:r>
-            <w:proofErr w:type="spellStart"/>
-            <w:r>
-              <w:rPr>
-                <w:rFonts w:ascii="Times New Roman" w:eastAsia="Times New Roman" w:hAnsi="Times New Roman" w:cs="Times New Roman"/>
-                <w:sz w:val="28"/>
-                <w:szCs w:val="28"/>
-                <w:lang w:val="en-US"/>
-              </w:rPr>
-              <w:t>dest</w:t>
-            </w:r>
-            <w:proofErr w:type="spellEnd"/>
-            <w:r>
-              <w:rPr>
-                <w:rFonts w:ascii="Times New Roman" w:eastAsia="Times New Roman" w:hAnsi="Times New Roman" w:cs="Times New Roman"/>
-                <w:sz w:val="28"/>
-                <w:szCs w:val="28"/>
-                <w:lang w:val="en-US"/>
-              </w:rPr>
-              <w:t>"</w:t>
-            </w:r>
-          </w:p>
-          <w:p>
-            <w:pPr>
-              <w:rPr>
-                <w:rFonts w:ascii="Times New Roman" w:eastAsia="Times New Roman" w:hAnsi="Times New Roman" w:cs="Times New Roman"/>
-                <w:sz w:val="28"/>
-                <w:szCs w:val="28"/>
-                <w:lang w:val="en-US"/>
-              </w:rPr>
-            </w:pPr>
-            <w:r>
-              <w:rPr>
-                <w:rFonts w:ascii="Times New Roman" w:eastAsia="Times New Roman" w:hAnsi="Times New Roman" w:cs="Times New Roman"/>
-                <w:sz w:val="28"/>
-                <w:szCs w:val="28"/>
-                <w:lang w:val="en-US"/>
-              </w:rPr>
-              <w:t xml:space="preserve">        else</w:t>
-            </w:r>
-          </w:p>
-          <w:p>
-            <w:pPr>
-              <w:rPr>
-                <w:rFonts w:ascii="Times New Roman" w:eastAsia="Times New Roman" w:hAnsi="Times New Roman" w:cs="Times New Roman"/>
-                <w:sz w:val="28"/>
-                <w:szCs w:val="28"/>
-                <w:lang w:val="en-US"/>
-              </w:rPr>
-            </w:pPr>
-            <w:r>
-              <w:rPr>
-                <w:rFonts w:ascii="Times New Roman" w:eastAsia="Times New Roman" w:hAnsi="Times New Roman" w:cs="Times New Roman"/>
-                <w:sz w:val="28"/>
-                <w:szCs w:val="28"/>
-                <w:lang w:val="en-US"/>
-              </w:rPr>
-              <w:t xml:space="preserve">            tar -</w:t>
-            </w:r>
-            <w:proofErr w:type="spellStart"/>
-            <w:r>
-              <w:rPr>
-                <w:rFonts w:ascii="Times New Roman" w:eastAsia="Times New Roman" w:hAnsi="Times New Roman" w:cs="Times New Roman"/>
-                <w:sz w:val="28"/>
-                <w:szCs w:val="28"/>
-                <w:lang w:val="en-US"/>
-              </w:rPr>
-              <w:t>xf</w:t>
-            </w:r>
-            <w:proofErr w:type="spellEnd"/>
-            <w:r>
-              <w:rPr>
-                <w:rFonts w:ascii="Times New Roman" w:eastAsia="Times New Roman" w:hAnsi="Times New Roman" w:cs="Times New Roman"/>
-                <w:sz w:val="28"/>
-                <w:szCs w:val="28"/>
-                <w:lang w:val="en-US"/>
-              </w:rPr>
-              <w:t xml:space="preserve"> "$tarfile" -C "$</w:t>
-            </w:r>
-            <w:proofErr w:type="spellStart"/>
-            <w:r>
-              <w:rPr>
-                <w:rFonts w:ascii="Times New Roman" w:eastAsia="Times New Roman" w:hAnsi="Times New Roman" w:cs="Times New Roman"/>
-                <w:sz w:val="28"/>
-                <w:szCs w:val="28"/>
-                <w:lang w:val="en-US"/>
-              </w:rPr>
-              <w:t>dest</w:t>
-            </w:r>
-            <w:proofErr w:type="spellEnd"/>
-            <w:r>
-              <w:rPr>
-                <w:rFonts w:ascii="Times New Roman" w:eastAsia="Times New Roman" w:hAnsi="Times New Roman" w:cs="Times New Roman"/>
-                <w:sz w:val="28"/>
-                <w:szCs w:val="28"/>
-                <w:lang w:val="en-US"/>
-              </w:rPr>
-              <w:t>"</w:t>
-            </w:r>
-          </w:p>
-          <w:p>
-            <w:pPr>
-              <w:rPr>
-                <w:rFonts w:ascii="Times New Roman" w:eastAsia="Times New Roman" w:hAnsi="Times New Roman" w:cs="Times New Roman"/>
-                <w:sz w:val="28"/>
-                <w:szCs w:val="28"/>
-                <w:lang w:val="en-US"/>
-              </w:rPr>
-            </w:pPr>
-            <w:r>
-              <w:rPr>
-                <w:rFonts w:ascii="Times New Roman" w:eastAsia="Times New Roman" w:hAnsi="Times New Roman" w:cs="Times New Roman"/>
-                <w:sz w:val="28"/>
-                <w:szCs w:val="28"/>
-                <w:lang w:val="en-US"/>
-              </w:rPr>
-              <w:t xml:space="preserve">        fi</w:t>
-            </w:r>
-          </w:p>
-          <w:p>
-            <w:pPr>
-              <w:rPr>
-                <w:rFonts w:ascii="Times New Roman" w:eastAsia="Times New Roman" w:hAnsi="Times New Roman" w:cs="Times New Roman"/>
-                <w:sz w:val="28"/>
-                <w:szCs w:val="28"/>
-                <w:lang w:val="en-US"/>
-              </w:rPr>
-            </w:pPr>
-            <w:r>
-              <w:rPr>
-                <w:rFonts w:ascii="Times New Roman" w:eastAsia="Times New Roman" w:hAnsi="Times New Roman" w:cs="Times New Roman"/>
-                <w:sz w:val="28"/>
-                <w:szCs w:val="28"/>
-                <w:lang w:val="en-US"/>
-              </w:rPr>
-              <w:t xml:space="preserve">    else</w:t>
-            </w:r>
-          </w:p>
-          <w:p>
-            <w:pPr>
-              <w:rPr>
-                <w:rFonts w:ascii="Times New Roman" w:eastAsia="Times New Roman" w:hAnsi="Times New Roman" w:cs="Times New Roman"/>
-                <w:sz w:val="28"/>
-                <w:szCs w:val="28"/>
-                <w:lang w:val="en-US"/>
-              </w:rPr>
-            </w:pPr>
-            <w:r>
-              <w:rPr>
-                <w:rFonts w:ascii="Times New Roman" w:eastAsia="Times New Roman" w:hAnsi="Times New Roman" w:cs="Times New Roman"/>
-                <w:sz w:val="28"/>
-                <w:szCs w:val="28"/>
-                <w:lang w:val="en-US"/>
-              </w:rPr>
-              <w:t xml:space="preserve">        # </w:t>
-            </w:r>
-            <w:r>
-              <w:rPr>
-                <w:rFonts w:ascii="Times New Roman" w:eastAsia="Times New Roman" w:hAnsi="Times New Roman" w:cs="Times New Roman"/>
-                <w:sz w:val="28"/>
-                <w:szCs w:val="28"/>
-                <w:lang w:val="ru-RU"/>
-              </w:rPr>
-              <w:t>Для</w:t>
-            </w:r>
-            <w:r>
-              <w:rPr>
-                <w:rFonts w:ascii="Times New Roman" w:eastAsia="Times New Roman" w:hAnsi="Times New Roman" w:cs="Times New Roman"/>
-                <w:sz w:val="28"/>
-                <w:szCs w:val="28"/>
-                <w:lang w:val="en-US"/>
-              </w:rPr>
-              <w:t xml:space="preserve"> </w:t>
-            </w:r>
-            <w:r>
-              <w:rPr>
-                <w:rFonts w:ascii="Times New Roman" w:eastAsia="Times New Roman" w:hAnsi="Times New Roman" w:cs="Times New Roman"/>
-                <w:sz w:val="28"/>
-                <w:szCs w:val="28"/>
-                <w:lang w:val="ru-RU"/>
-              </w:rPr>
-              <w:t>остальных</w:t>
-            </w:r>
-            <w:r>
-              <w:rPr>
-                <w:rFonts w:ascii="Times New Roman" w:eastAsia="Times New Roman" w:hAnsi="Times New Roman" w:cs="Times New Roman"/>
-                <w:sz w:val="28"/>
-                <w:szCs w:val="28"/>
-                <w:lang w:val="en-US"/>
-              </w:rPr>
-              <w:t xml:space="preserve"> (base.tar.gz, pg_wal.tar.gz </w:t>
-            </w:r>
-            <w:r>
-              <w:rPr>
-                <w:rFonts w:ascii="Times New Roman" w:eastAsia="Times New Roman" w:hAnsi="Times New Roman" w:cs="Times New Roman"/>
-                <w:sz w:val="28"/>
-                <w:szCs w:val="28"/>
-                <w:lang w:val="ru-RU"/>
-              </w:rPr>
-              <w:t>и</w:t>
-            </w:r>
-            <w:r>
-              <w:rPr>
-                <w:rFonts w:ascii="Times New Roman" w:eastAsia="Times New Roman" w:hAnsi="Times New Roman" w:cs="Times New Roman"/>
-                <w:sz w:val="28"/>
-                <w:szCs w:val="28"/>
-                <w:lang w:val="en-US"/>
-              </w:rPr>
-              <w:t xml:space="preserve"> </w:t>
-            </w:r>
-            <w:r>
-              <w:rPr>
-                <w:rFonts w:ascii="Times New Roman" w:eastAsia="Times New Roman" w:hAnsi="Times New Roman" w:cs="Times New Roman"/>
-                <w:sz w:val="28"/>
-                <w:szCs w:val="28"/>
-                <w:lang w:val="ru-RU"/>
-              </w:rPr>
-              <w:t>т</w:t>
-            </w:r>
-            <w:r>
-              <w:rPr>
-                <w:rFonts w:ascii="Times New Roman" w:eastAsia="Times New Roman" w:hAnsi="Times New Roman" w:cs="Times New Roman"/>
-                <w:sz w:val="28"/>
-                <w:szCs w:val="28"/>
-                <w:lang w:val="en-US"/>
-              </w:rPr>
-              <w:t>.</w:t>
-            </w:r>
-            <w:r>
-              <w:rPr>
-                <w:rFonts w:ascii="Times New Roman" w:eastAsia="Times New Roman" w:hAnsi="Times New Roman" w:cs="Times New Roman"/>
-                <w:sz w:val="28"/>
-                <w:szCs w:val="28"/>
-                <w:lang w:val="ru-RU"/>
-              </w:rPr>
-              <w:t>п</w:t>
-            </w:r>
-            <w:r>
-              <w:rPr>
-                <w:rFonts w:ascii="Times New Roman" w:eastAsia="Times New Roman" w:hAnsi="Times New Roman" w:cs="Times New Roman"/>
-                <w:sz w:val="28"/>
-                <w:szCs w:val="28"/>
-                <w:lang w:val="en-US"/>
-              </w:rPr>
-              <w:t xml:space="preserve">.) — </w:t>
-            </w:r>
-            <w:r>
-              <w:rPr>
-                <w:rFonts w:ascii="Times New Roman" w:eastAsia="Times New Roman" w:hAnsi="Times New Roman" w:cs="Times New Roman"/>
-                <w:sz w:val="28"/>
-                <w:szCs w:val="28"/>
-                <w:lang w:val="ru-RU"/>
-              </w:rPr>
-              <w:t>распакуем</w:t>
-            </w:r>
-            <w:r>
-              <w:rPr>
-                <w:rFonts w:ascii="Times New Roman" w:eastAsia="Times New Roman" w:hAnsi="Times New Roman" w:cs="Times New Roman"/>
-                <w:sz w:val="28"/>
-                <w:szCs w:val="28"/>
-                <w:lang w:val="en-US"/>
-              </w:rPr>
-              <w:t xml:space="preserve"> </w:t>
-            </w:r>
-            <w:r>
-              <w:rPr>
-                <w:rFonts w:ascii="Times New Roman" w:eastAsia="Times New Roman" w:hAnsi="Times New Roman" w:cs="Times New Roman"/>
-                <w:sz w:val="28"/>
-                <w:szCs w:val="28"/>
-                <w:lang w:val="ru-RU"/>
-              </w:rPr>
-              <w:t>в</w:t>
-            </w:r>
-            <w:r>
-              <w:rPr>
-                <w:rFonts w:ascii="Times New Roman" w:eastAsia="Times New Roman" w:hAnsi="Times New Roman" w:cs="Times New Roman"/>
-                <w:sz w:val="28"/>
-                <w:szCs w:val="28"/>
-                <w:lang w:val="en-US"/>
-              </w:rPr>
-              <w:t xml:space="preserve"> RECOVERY_DIR</w:t>
-            </w:r>
-          </w:p>
-          <w:p>
-            <w:pPr>
-              <w:rPr>
-                <w:rFonts w:ascii="Times New Roman" w:eastAsia="Times New Roman" w:hAnsi="Times New Roman" w:cs="Times New Roman"/>
-                <w:sz w:val="28"/>
-                <w:szCs w:val="28"/>
-                <w:lang w:val="en-US"/>
-              </w:rPr>
-            </w:pPr>
-            <w:r>
-              <w:rPr>
-                <w:rFonts w:ascii="Times New Roman" w:eastAsia="Times New Roman" w:hAnsi="Times New Roman" w:cs="Times New Roman"/>
-                <w:sz w:val="28"/>
-                <w:szCs w:val="28"/>
-                <w:lang w:val="en-US"/>
-              </w:rPr>
-              <w:t xml:space="preserve">        echo "Unpacking $name -&gt; $RECOVERY_DIR"</w:t>
-            </w:r>
-          </w:p>
-          <w:p>
-            <w:pPr>
-              <w:rPr>
-                <w:rFonts w:ascii="Times New Roman" w:eastAsia="Times New Roman" w:hAnsi="Times New Roman" w:cs="Times New Roman"/>
-                <w:sz w:val="28"/>
-                <w:szCs w:val="28"/>
-                <w:lang w:val="en-US"/>
-              </w:rPr>
-            </w:pPr>
-            <w:r>
-              <w:rPr>
-                <w:rFonts w:ascii="Times New Roman" w:eastAsia="Times New Roman" w:hAnsi="Times New Roman" w:cs="Times New Roman"/>
-                <w:sz w:val="28"/>
-                <w:szCs w:val="28"/>
-                <w:lang w:val="en-US"/>
-              </w:rPr>
-              <w:t xml:space="preserve">        </w:t>
-            </w:r>
-            <w:proofErr w:type="spellStart"/>
-            <w:r>
-              <w:rPr>
-                <w:rFonts w:ascii="Times New Roman" w:eastAsia="Times New Roman" w:hAnsi="Times New Roman" w:cs="Times New Roman"/>
-                <w:sz w:val="28"/>
-                <w:szCs w:val="28"/>
-                <w:lang w:val="en-US"/>
-              </w:rPr>
-              <w:t>mkdir</w:t>
-            </w:r>
-            <w:proofErr w:type="spellEnd"/>
-            <w:r>
-              <w:rPr>
-                <w:rFonts w:ascii="Times New Roman" w:eastAsia="Times New Roman" w:hAnsi="Times New Roman" w:cs="Times New Roman"/>
-                <w:sz w:val="28"/>
-                <w:szCs w:val="28"/>
-                <w:lang w:val="en-US"/>
-              </w:rPr>
-              <w:t xml:space="preserve"> -p "$RECOVERY_DIR"</w:t>
-            </w:r>
-          </w:p>
-          <w:p>
-            <w:pPr>
-              <w:rPr>
-                <w:rFonts w:ascii="Times New Roman" w:eastAsia="Times New Roman" w:hAnsi="Times New Roman" w:cs="Times New Roman"/>
-                <w:sz w:val="28"/>
-                <w:szCs w:val="28"/>
-                <w:lang w:val="en-US"/>
-              </w:rPr>
-            </w:pPr>
-          </w:p>
-          <w:p>
-            <w:pPr>
-              <w:rPr>
-                <w:rFonts w:ascii="Times New Roman" w:eastAsia="Times New Roman" w:hAnsi="Times New Roman" w:cs="Times New Roman"/>
-                <w:sz w:val="28"/>
-                <w:szCs w:val="28"/>
-                <w:lang w:val="en-US"/>
-              </w:rPr>
-            </w:pPr>
-            <w:r>
-              <w:rPr>
-                <w:rFonts w:ascii="Times New Roman" w:eastAsia="Times New Roman" w:hAnsi="Times New Roman" w:cs="Times New Roman"/>
-                <w:sz w:val="28"/>
-                <w:szCs w:val="28"/>
-                <w:lang w:val="en-US"/>
-              </w:rPr>
-              <w:t xml:space="preserve">        if [[ "$tarfile" == </w:t>
-            </w:r>
-            <w:proofErr w:type="gramStart"/>
-            <w:r>
-              <w:rPr>
-                <w:rFonts w:ascii="Times New Roman" w:eastAsia="Times New Roman" w:hAnsi="Times New Roman" w:cs="Times New Roman"/>
-                <w:sz w:val="28"/>
-                <w:szCs w:val="28"/>
-                <w:lang w:val="en-US"/>
-              </w:rPr>
-              <w:t>*.</w:t>
-            </w:r>
-            <w:proofErr w:type="spellStart"/>
-            <w:r>
-              <w:rPr>
-                <w:rFonts w:ascii="Times New Roman" w:eastAsia="Times New Roman" w:hAnsi="Times New Roman" w:cs="Times New Roman"/>
-                <w:sz w:val="28"/>
-                <w:szCs w:val="28"/>
-                <w:lang w:val="en-US"/>
-              </w:rPr>
-              <w:t>gz</w:t>
-            </w:r>
-            <w:proofErr w:type="spellEnd"/>
-            <w:r>
-              <w:rPr>
-                <w:rFonts w:ascii="Times New Roman" w:eastAsia="Times New Roman" w:hAnsi="Times New Roman" w:cs="Times New Roman"/>
-                <w:sz w:val="28"/>
-                <w:szCs w:val="28"/>
-                <w:lang w:val="en-US"/>
-              </w:rPr>
-              <w:t xml:space="preserve"> ]</w:t>
-            </w:r>
-            <w:proofErr w:type="gramEnd"/>
-            <w:r>
-              <w:rPr>
-                <w:rFonts w:ascii="Times New Roman" w:eastAsia="Times New Roman" w:hAnsi="Times New Roman" w:cs="Times New Roman"/>
-                <w:sz w:val="28"/>
-                <w:szCs w:val="28"/>
-                <w:lang w:val="en-US"/>
-              </w:rPr>
-              <w:t>] || [[ "$tarfile" == *.</w:t>
-            </w:r>
-            <w:proofErr w:type="spellStart"/>
-            <w:r>
-              <w:rPr>
-                <w:rFonts w:ascii="Times New Roman" w:eastAsia="Times New Roman" w:hAnsi="Times New Roman" w:cs="Times New Roman"/>
-                <w:sz w:val="28"/>
-                <w:szCs w:val="28"/>
-                <w:lang w:val="en-US"/>
-              </w:rPr>
-              <w:t>tgz</w:t>
-            </w:r>
-            <w:proofErr w:type="spellEnd"/>
-            <w:r>
-              <w:rPr>
-                <w:rFonts w:ascii="Times New Roman" w:eastAsia="Times New Roman" w:hAnsi="Times New Roman" w:cs="Times New Roman"/>
-                <w:sz w:val="28"/>
-                <w:szCs w:val="28"/>
-                <w:lang w:val="en-US"/>
-              </w:rPr>
-              <w:t xml:space="preserve"> ]]; then</w:t>
-            </w:r>
-          </w:p>
-          <w:p>
-            <w:pPr>
-              <w:rPr>
-                <w:rFonts w:ascii="Times New Roman" w:eastAsia="Times New Roman" w:hAnsi="Times New Roman" w:cs="Times New Roman"/>
-                <w:sz w:val="28"/>
-                <w:szCs w:val="28"/>
-                <w:lang w:val="en-US"/>
-              </w:rPr>
-            </w:pPr>
-            <w:r>
-              <w:rPr>
-                <w:rFonts w:ascii="Times New Roman" w:eastAsia="Times New Roman" w:hAnsi="Times New Roman" w:cs="Times New Roman"/>
-                <w:sz w:val="28"/>
-                <w:szCs w:val="28"/>
-                <w:lang w:val="en-US"/>
-              </w:rPr>
-              <w:t xml:space="preserve">            tar -</w:t>
-            </w:r>
-            <w:proofErr w:type="spellStart"/>
-            <w:r>
-              <w:rPr>
-                <w:rFonts w:ascii="Times New Roman" w:eastAsia="Times New Roman" w:hAnsi="Times New Roman" w:cs="Times New Roman"/>
-                <w:sz w:val="28"/>
-                <w:szCs w:val="28"/>
-                <w:lang w:val="en-US"/>
-              </w:rPr>
-              <w:t>xzf</w:t>
-            </w:r>
-            <w:proofErr w:type="spellEnd"/>
-            <w:r>
-              <w:rPr>
-                <w:rFonts w:ascii="Times New Roman" w:eastAsia="Times New Roman" w:hAnsi="Times New Roman" w:cs="Times New Roman"/>
-                <w:sz w:val="28"/>
-                <w:szCs w:val="28"/>
-                <w:lang w:val="en-US"/>
-              </w:rPr>
-              <w:t xml:space="preserve"> "$tarfile" -C "$RECOVERY_DIR"</w:t>
-            </w:r>
-          </w:p>
-          <w:p>
-            <w:pPr>
-              <w:rPr>
-                <w:rFonts w:ascii="Times New Roman" w:eastAsia="Times New Roman" w:hAnsi="Times New Roman" w:cs="Times New Roman"/>
-                <w:sz w:val="28"/>
-                <w:szCs w:val="28"/>
-                <w:lang w:val="en-US"/>
-              </w:rPr>
-            </w:pPr>
-            <w:r>
-              <w:rPr>
-                <w:rFonts w:ascii="Times New Roman" w:eastAsia="Times New Roman" w:hAnsi="Times New Roman" w:cs="Times New Roman"/>
-                <w:sz w:val="28"/>
-                <w:szCs w:val="28"/>
-                <w:lang w:val="en-US"/>
-              </w:rPr>
-              <w:t xml:space="preserve">        else</w:t>
-            </w:r>
-          </w:p>
-          <w:p>
-            <w:pPr>
-              <w:rPr>
-                <w:rFonts w:ascii="Times New Roman" w:eastAsia="Times New Roman" w:hAnsi="Times New Roman" w:cs="Times New Roman"/>
-                <w:sz w:val="28"/>
-                <w:szCs w:val="28"/>
-                <w:lang w:val="en-US"/>
-              </w:rPr>
-            </w:pPr>
-            <w:r>
-              <w:rPr>
-                <w:rFonts w:ascii="Times New Roman" w:eastAsia="Times New Roman" w:hAnsi="Times New Roman" w:cs="Times New Roman"/>
-                <w:sz w:val="28"/>
-                <w:szCs w:val="28"/>
-                <w:lang w:val="en-US"/>
-              </w:rPr>
-              <w:t xml:space="preserve">            tar -</w:t>
-            </w:r>
-            <w:proofErr w:type="spellStart"/>
-            <w:r>
-              <w:rPr>
-                <w:rFonts w:ascii="Times New Roman" w:eastAsia="Times New Roman" w:hAnsi="Times New Roman" w:cs="Times New Roman"/>
-                <w:sz w:val="28"/>
-                <w:szCs w:val="28"/>
-                <w:lang w:val="en-US"/>
-              </w:rPr>
-              <w:t>xf</w:t>
-            </w:r>
-            <w:proofErr w:type="spellEnd"/>
-            <w:r>
-              <w:rPr>
-                <w:rFonts w:ascii="Times New Roman" w:eastAsia="Times New Roman" w:hAnsi="Times New Roman" w:cs="Times New Roman"/>
-                <w:sz w:val="28"/>
-                <w:szCs w:val="28"/>
-                <w:lang w:val="en-US"/>
-              </w:rPr>
-              <w:t xml:space="preserve"> "$tarfile" -C "$RECOVERY_DIR"</w:t>
-            </w:r>
-          </w:p>
-          <w:p>
-            <w:pPr>
-              <w:rPr>
-                <w:rFonts w:ascii="Times New Roman" w:eastAsia="Times New Roman" w:hAnsi="Times New Roman" w:cs="Times New Roman"/>
-                <w:sz w:val="28"/>
-                <w:szCs w:val="28"/>
-                <w:lang w:val="ru-RU"/>
-              </w:rPr>
-            </w:pPr>
-            <w:r>
-              <w:rPr>
-                <w:rFonts w:ascii="Times New Roman" w:eastAsia="Times New Roman" w:hAnsi="Times New Roman" w:cs="Times New Roman"/>
-                <w:sz w:val="28"/>
-                <w:szCs w:val="28"/>
-                <w:lang w:val="en-US"/>
-              </w:rPr>
-              <w:t xml:space="preserve">        </w:t>
-            </w:r>
-            <w:proofErr w:type="spellStart"/>
-            <w:r>
-              <w:rPr>
-                <w:rFonts w:ascii="Times New Roman" w:eastAsia="Times New Roman" w:hAnsi="Times New Roman" w:cs="Times New Roman"/>
-                <w:sz w:val="28"/>
-                <w:szCs w:val="28"/>
-                <w:lang w:val="ru-RU"/>
-              </w:rPr>
-              <w:t>fi</w:t>
-            </w:r>
-            <w:proofErr w:type="spellEnd"/>
-          </w:p>
-          <w:p>
-            <w:pPr>
-              <w:rPr>
-                <w:rFonts w:ascii="Times New Roman" w:eastAsia="Times New Roman" w:hAnsi="Times New Roman" w:cs="Times New Roman"/>
-                <w:sz w:val="28"/>
-                <w:szCs w:val="28"/>
-                <w:lang w:val="ru-RU"/>
-              </w:rPr>
-            </w:pPr>
-            <w:r>
-              <w:rPr>
-                <w:rFonts w:ascii="Times New Roman" w:eastAsia="Times New Roman" w:hAnsi="Times New Roman" w:cs="Times New Roman"/>
-                <w:sz w:val="28"/>
-                <w:szCs w:val="28"/>
-                <w:lang w:val="ru-RU"/>
-              </w:rPr>
-              <w:t xml:space="preserve">    </w:t>
-            </w:r>
-            <w:proofErr w:type="spellStart"/>
-            <w:r>
-              <w:rPr>
-                <w:rFonts w:ascii="Times New Roman" w:eastAsia="Times New Roman" w:hAnsi="Times New Roman" w:cs="Times New Roman"/>
-                <w:sz w:val="28"/>
-                <w:szCs w:val="28"/>
-                <w:lang w:val="ru-RU"/>
-              </w:rPr>
-              <w:t>fi</w:t>
-            </w:r>
-            <w:proofErr w:type="spellEnd"/>
-          </w:p>
-          <w:p>
-            <w:pPr>
-              <w:rPr>
-                <w:rFonts w:ascii="Times New Roman" w:eastAsia="Times New Roman" w:hAnsi="Times New Roman" w:cs="Times New Roman"/>
-                <w:sz w:val="28"/>
-                <w:szCs w:val="28"/>
-                <w:lang w:val="ru-RU"/>
-              </w:rPr>
-            </w:pPr>
-            <w:proofErr w:type="spellStart"/>
-            <w:r>
-              <w:rPr>
-                <w:rFonts w:ascii="Times New Roman" w:eastAsia="Times New Roman" w:hAnsi="Times New Roman" w:cs="Times New Roman"/>
-                <w:sz w:val="28"/>
-                <w:szCs w:val="28"/>
-                <w:lang w:val="ru-RU"/>
-              </w:rPr>
-              <w:t>done</w:t>
-            </w:r>
-            <w:proofErr w:type="spellEnd"/>
-          </w:p>
-          <w:p>
-            <w:pPr>
-              <w:rPr>
-                <w:rFonts w:ascii="Times New Roman" w:eastAsia="Times New Roman" w:hAnsi="Times New Roman" w:cs="Times New Roman"/>
-                <w:sz w:val="28"/>
-                <w:szCs w:val="28"/>
-                <w:lang w:val="ru-RU"/>
-              </w:rPr>
-            </w:pPr>
-          </w:p>
-          <w:p>
-            <w:pPr>
-              <w:rPr>
-                <w:rFonts w:ascii="Times New Roman" w:eastAsia="Times New Roman" w:hAnsi="Times New Roman" w:cs="Times New Roman"/>
-                <w:sz w:val="28"/>
-                <w:szCs w:val="28"/>
-                <w:lang w:val="ru-RU"/>
-              </w:rPr>
-            </w:pPr>
-            <w:proofErr w:type="spellStart"/>
-            <w:r>
-              <w:rPr>
-                <w:rFonts w:ascii="Times New Roman" w:eastAsia="Times New Roman" w:hAnsi="Times New Roman" w:cs="Times New Roman"/>
-                <w:sz w:val="28"/>
-                <w:szCs w:val="28"/>
-                <w:lang w:val="ru-RU"/>
-              </w:rPr>
-              <w:t>shopt</w:t>
-            </w:r>
-            <w:proofErr w:type="spellEnd"/>
-            <w:r>
-              <w:rPr>
-                <w:rFonts w:ascii="Times New Roman" w:eastAsia="Times New Roman" w:hAnsi="Times New Roman" w:cs="Times New Roman"/>
-                <w:sz w:val="28"/>
-                <w:szCs w:val="28"/>
-                <w:lang w:val="ru-RU"/>
-              </w:rPr>
-              <w:t xml:space="preserve"> -u </w:t>
-            </w:r>
-            <w:proofErr w:type="spellStart"/>
-            <w:r>
-              <w:rPr>
-                <w:rFonts w:ascii="Times New Roman" w:eastAsia="Times New Roman" w:hAnsi="Times New Roman" w:cs="Times New Roman"/>
-                <w:sz w:val="28"/>
-                <w:szCs w:val="28"/>
-                <w:lang w:val="ru-RU"/>
-              </w:rPr>
-              <w:t>nullglob</w:t>
-            </w:r>
-            <w:proofErr w:type="spellEnd"/>
-            <w:r>
-              <w:rPr>
-                <w:rFonts w:ascii="Times New Roman" w:eastAsia="Times New Roman" w:hAnsi="Times New Roman" w:cs="Times New Roman"/>
-                <w:sz w:val="28"/>
-                <w:szCs w:val="28"/>
-                <w:lang w:val="ru-RU"/>
-              </w:rPr>
-              <w:t xml:space="preserve">   # Возвращаем стандартное поведение</w:t>
-            </w:r>
-          </w:p>
-          <w:p>
-            <w:pPr>
-              <w:rPr>
-                <w:rFonts w:ascii="Times New Roman" w:eastAsia="Times New Roman" w:hAnsi="Times New Roman" w:cs="Times New Roman"/>
-                <w:sz w:val="28"/>
-                <w:szCs w:val="28"/>
-                <w:lang w:val="ru-RU"/>
-              </w:rPr>
-            </w:pPr>
-          </w:p>
-          <w:p>
-            <w:pPr>
-              <w:rPr>
-                <w:rFonts w:ascii="Times New Roman" w:eastAsia="Times New Roman" w:hAnsi="Times New Roman" w:cs="Times New Roman"/>
-                <w:sz w:val="28"/>
-                <w:szCs w:val="28"/>
-                <w:lang w:val="en-US"/>
-              </w:rPr>
-            </w:pPr>
-            <w:r>
-              <w:rPr>
-                <w:rFonts w:ascii="Times New Roman" w:eastAsia="Times New Roman" w:hAnsi="Times New Roman" w:cs="Times New Roman"/>
-                <w:sz w:val="28"/>
-                <w:szCs w:val="28"/>
-                <w:lang w:val="en-US"/>
-              </w:rPr>
-              <w:t xml:space="preserve"># </w:t>
-            </w:r>
-            <w:r>
-              <w:rPr>
-                <w:rFonts w:ascii="Times New Roman" w:eastAsia="Times New Roman" w:hAnsi="Times New Roman" w:cs="Times New Roman"/>
-                <w:sz w:val="28"/>
-                <w:szCs w:val="28"/>
-                <w:lang w:val="ru-RU"/>
-              </w:rPr>
-              <w:t>Копирование</w:t>
-            </w:r>
-            <w:r>
-              <w:rPr>
-                <w:rFonts w:ascii="Times New Roman" w:eastAsia="Times New Roman" w:hAnsi="Times New Roman" w:cs="Times New Roman"/>
-                <w:sz w:val="28"/>
-                <w:szCs w:val="28"/>
-                <w:lang w:val="en-US"/>
-              </w:rPr>
-              <w:t xml:space="preserve"> </w:t>
-            </w:r>
-            <w:r>
-              <w:rPr>
-                <w:rFonts w:ascii="Times New Roman" w:eastAsia="Times New Roman" w:hAnsi="Times New Roman" w:cs="Times New Roman"/>
-                <w:sz w:val="28"/>
-                <w:szCs w:val="28"/>
-                <w:lang w:val="ru-RU"/>
-              </w:rPr>
-              <w:t>несжатых</w:t>
-            </w:r>
-            <w:r>
-              <w:rPr>
-                <w:rFonts w:ascii="Times New Roman" w:eastAsia="Times New Roman" w:hAnsi="Times New Roman" w:cs="Times New Roman"/>
-                <w:sz w:val="28"/>
-                <w:szCs w:val="28"/>
-                <w:lang w:val="en-US"/>
-              </w:rPr>
-              <w:t xml:space="preserve"> </w:t>
-            </w:r>
-            <w:r>
-              <w:rPr>
-                <w:rFonts w:ascii="Times New Roman" w:eastAsia="Times New Roman" w:hAnsi="Times New Roman" w:cs="Times New Roman"/>
-                <w:sz w:val="28"/>
-                <w:szCs w:val="28"/>
-                <w:lang w:val="ru-RU"/>
-              </w:rPr>
-              <w:t>файлов</w:t>
-            </w:r>
-          </w:p>
-          <w:p>
-            <w:pPr>
-              <w:rPr>
-                <w:rFonts w:ascii="Times New Roman" w:eastAsia="Times New Roman" w:hAnsi="Times New Roman" w:cs="Times New Roman"/>
-                <w:sz w:val="28"/>
-                <w:szCs w:val="28"/>
-                <w:lang w:val="en-US"/>
-              </w:rPr>
-            </w:pPr>
-            <w:r>
-              <w:rPr>
-                <w:rFonts w:ascii="Times New Roman" w:eastAsia="Times New Roman" w:hAnsi="Times New Roman" w:cs="Times New Roman"/>
-                <w:sz w:val="28"/>
-                <w:szCs w:val="28"/>
-                <w:lang w:val="en-US"/>
-              </w:rPr>
-              <w:t>if [ -d "$LATEST_BACKUP_DIR/base</w:t>
-            </w:r>
-            <w:proofErr w:type="gramStart"/>
-            <w:r>
-              <w:rPr>
-                <w:rFonts w:ascii="Times New Roman" w:eastAsia="Times New Roman" w:hAnsi="Times New Roman" w:cs="Times New Roman"/>
-                <w:sz w:val="28"/>
-                <w:szCs w:val="28"/>
-                <w:lang w:val="en-US"/>
-              </w:rPr>
-              <w:t>" ]</w:t>
-            </w:r>
-            <w:proofErr w:type="gramEnd"/>
-            <w:r>
-              <w:rPr>
-                <w:rFonts w:ascii="Times New Roman" w:eastAsia="Times New Roman" w:hAnsi="Times New Roman" w:cs="Times New Roman"/>
-                <w:sz w:val="28"/>
-                <w:szCs w:val="28"/>
-                <w:lang w:val="en-US"/>
-              </w:rPr>
-              <w:t xml:space="preserve"> || [ -d "$LATEST_BACKUP_DIR/global" ]; then</w:t>
-            </w:r>
-          </w:p>
-          <w:p>
-            <w:pPr>
-              <w:rPr>
-                <w:rFonts w:ascii="Times New Roman" w:eastAsia="Times New Roman" w:hAnsi="Times New Roman" w:cs="Times New Roman"/>
-                <w:sz w:val="28"/>
-                <w:szCs w:val="28"/>
-                <w:lang w:val="en-US"/>
-              </w:rPr>
-            </w:pPr>
-            <w:r>
-              <w:rPr>
-                <w:rFonts w:ascii="Times New Roman" w:eastAsia="Times New Roman" w:hAnsi="Times New Roman" w:cs="Times New Roman"/>
-                <w:sz w:val="28"/>
-                <w:szCs w:val="28"/>
-                <w:lang w:val="en-US"/>
-              </w:rPr>
-              <w:t xml:space="preserve">    echo "Copying uncompressed files from backup directory to $RECOVERY_DIR"</w:t>
-            </w:r>
-          </w:p>
-          <w:p>
-            <w:pPr>
-              <w:rPr>
-                <w:rFonts w:ascii="Times New Roman" w:eastAsia="Times New Roman" w:hAnsi="Times New Roman" w:cs="Times New Roman"/>
-                <w:sz w:val="28"/>
-                <w:szCs w:val="28"/>
-                <w:lang w:val="en-US"/>
-              </w:rPr>
-            </w:pPr>
-            <w:r>
-              <w:rPr>
-                <w:rFonts w:ascii="Times New Roman" w:eastAsia="Times New Roman" w:hAnsi="Times New Roman" w:cs="Times New Roman"/>
-                <w:sz w:val="28"/>
-                <w:szCs w:val="28"/>
-                <w:lang w:val="en-US"/>
-              </w:rPr>
-              <w:t xml:space="preserve">    cp -r "$LATEST_BACKUP_DIR"/* "$RECOVERY_DIR"/ || true</w:t>
-            </w:r>
-          </w:p>
-          <w:p>
-            <w:pPr>
-              <w:rPr>
-                <w:rFonts w:ascii="Times New Roman" w:eastAsia="Times New Roman" w:hAnsi="Times New Roman" w:cs="Times New Roman"/>
-                <w:sz w:val="28"/>
-                <w:szCs w:val="28"/>
-                <w:lang w:val="ru-RU"/>
-              </w:rPr>
-            </w:pPr>
-            <w:proofErr w:type="spellStart"/>
-            <w:r>
-              <w:rPr>
-                <w:rFonts w:ascii="Times New Roman" w:eastAsia="Times New Roman" w:hAnsi="Times New Roman" w:cs="Times New Roman"/>
-                <w:sz w:val="28"/>
-                <w:szCs w:val="28"/>
-                <w:lang w:val="ru-RU"/>
-              </w:rPr>
-              <w:t>fi</w:t>
-            </w:r>
-            <w:proofErr w:type="spellEnd"/>
-          </w:p>
-          <w:p>
-            <w:pPr>
-              <w:rPr>
-                <w:rFonts w:ascii="Times New Roman" w:eastAsia="Times New Roman" w:hAnsi="Times New Roman" w:cs="Times New Roman"/>
-                <w:sz w:val="28"/>
-                <w:szCs w:val="28"/>
-                <w:lang w:val="ru-RU"/>
-              </w:rPr>
-            </w:pPr>
-          </w:p>
-          <w:p>
-            <w:pPr>
-              <w:rPr>
-                <w:rFonts w:ascii="Times New Roman" w:eastAsia="Times New Roman" w:hAnsi="Times New Roman" w:cs="Times New Roman"/>
-                <w:sz w:val="28"/>
-                <w:szCs w:val="28"/>
-                <w:lang w:val="ru-RU"/>
-              </w:rPr>
-            </w:pPr>
-            <w:r>
-              <w:rPr>
-                <w:rFonts w:ascii="Times New Roman" w:eastAsia="Times New Roman" w:hAnsi="Times New Roman" w:cs="Times New Roman"/>
-                <w:sz w:val="28"/>
-                <w:szCs w:val="28"/>
-                <w:lang w:val="ru-RU"/>
-              </w:rPr>
-              <w:t># Установка прав владельца</w:t>
-            </w:r>
-          </w:p>
-          <w:p>
-            <w:pPr>
-              <w:rPr>
-                <w:rFonts w:ascii="Times New Roman" w:eastAsia="Times New Roman" w:hAnsi="Times New Roman" w:cs="Times New Roman"/>
-                <w:sz w:val="28"/>
-                <w:szCs w:val="28"/>
-                <w:lang w:val="ru-RU"/>
-              </w:rPr>
-            </w:pPr>
-            <w:r>
-              <w:rPr>
-                <w:rFonts w:ascii="Times New Roman" w:eastAsia="Times New Roman" w:hAnsi="Times New Roman" w:cs="Times New Roman"/>
-                <w:sz w:val="28"/>
-                <w:szCs w:val="28"/>
-                <w:lang w:val="en-US"/>
-              </w:rPr>
-              <w:t>if</w:t>
-            </w:r>
-            <w:r>
-              <w:rPr>
-                <w:rFonts w:ascii="Times New Roman" w:eastAsia="Times New Roman" w:hAnsi="Times New Roman" w:cs="Times New Roman"/>
-                <w:sz w:val="28"/>
-                <w:szCs w:val="28"/>
-                <w:lang w:val="ru-RU"/>
-              </w:rPr>
-              <w:t xml:space="preserve"> [ "$(</w:t>
-            </w:r>
-            <w:r>
-              <w:rPr>
-                <w:rFonts w:ascii="Times New Roman" w:eastAsia="Times New Roman" w:hAnsi="Times New Roman" w:cs="Times New Roman"/>
-                <w:sz w:val="28"/>
-                <w:szCs w:val="28"/>
-                <w:lang w:val="en-US"/>
-              </w:rPr>
-              <w:t>id</w:t>
-            </w:r>
-            <w:r>
-              <w:rPr>
-                <w:rFonts w:ascii="Times New Roman" w:eastAsia="Times New Roman" w:hAnsi="Times New Roman" w:cs="Times New Roman"/>
-                <w:sz w:val="28"/>
-                <w:szCs w:val="28"/>
-                <w:lang w:val="ru-RU"/>
-              </w:rPr>
-              <w:t xml:space="preserve"> -</w:t>
-            </w:r>
-            <w:r>
-              <w:rPr>
-                <w:rFonts w:ascii="Times New Roman" w:eastAsia="Times New Roman" w:hAnsi="Times New Roman" w:cs="Times New Roman"/>
-                <w:sz w:val="28"/>
-                <w:szCs w:val="28"/>
-                <w:lang w:val="en-US"/>
-              </w:rPr>
-              <w:t>u</w:t>
-            </w:r>
-            <w:r>
-              <w:rPr>
-                <w:rFonts w:ascii="Times New Roman" w:eastAsia="Times New Roman" w:hAnsi="Times New Roman" w:cs="Times New Roman"/>
-                <w:sz w:val="28"/>
-                <w:szCs w:val="28"/>
-                <w:lang w:val="ru-RU"/>
-              </w:rPr>
-              <w:t>)" -</w:t>
-            </w:r>
-            <w:r>
-              <w:rPr>
-                <w:rFonts w:ascii="Times New Roman" w:eastAsia="Times New Roman" w:hAnsi="Times New Roman" w:cs="Times New Roman"/>
-                <w:sz w:val="28"/>
-                <w:szCs w:val="28"/>
-                <w:lang w:val="en-US"/>
-              </w:rPr>
-              <w:t>eq</w:t>
-            </w:r>
-            <w:r>
-              <w:rPr>
-                <w:rFonts w:ascii="Times New Roman" w:eastAsia="Times New Roman" w:hAnsi="Times New Roman" w:cs="Times New Roman"/>
-                <w:sz w:val="28"/>
-                <w:szCs w:val="28"/>
-                <w:lang w:val="ru-RU"/>
-              </w:rPr>
-              <w:t xml:space="preserve"> </w:t>
-            </w:r>
-            <w:proofErr w:type="gramStart"/>
-            <w:r>
-              <w:rPr>
-                <w:rFonts w:ascii="Times New Roman" w:eastAsia="Times New Roman" w:hAnsi="Times New Roman" w:cs="Times New Roman"/>
-                <w:sz w:val="28"/>
-                <w:szCs w:val="28"/>
-                <w:lang w:val="ru-RU"/>
-              </w:rPr>
-              <w:t>0 ]</w:t>
-            </w:r>
-            <w:proofErr w:type="gramEnd"/>
-            <w:r>
-              <w:rPr>
-                <w:rFonts w:ascii="Times New Roman" w:eastAsia="Times New Roman" w:hAnsi="Times New Roman" w:cs="Times New Roman"/>
-                <w:sz w:val="28"/>
-                <w:szCs w:val="28"/>
-                <w:lang w:val="ru-RU"/>
-              </w:rPr>
               <w:t xml:space="preserve">; </w:t>
             </w:r>
             <w:r>
@@ -8861,7 +9127,7 @@
                 <w:rFonts w:ascii="Times New Roman" w:eastAsia="Times New Roman" w:hAnsi="Times New Roman" w:cs="Times New Roman"/>
                 <w:sz w:val="28"/>
                 <w:szCs w:val="28"/>
-                <w:lang w:val="ru-RU"/>
+                <w:lang w:val="en-US"/>
               </w:rPr>
               <w:t xml:space="preserve">    </w:t>
             </w:r>
@@ -10509,7 +10775,6 @@
           <w:szCs w:val="24"/>
           <w:lang w:val="ru-RU"/>
         </w:rPr>
-        <w:lastRenderedPageBreak/>
         <w:t>Пытаемся запустить сервер</w:t>
       </w:r>
       <w:r>
@@ -11213,6 +11478,7 @@
               <w:rPr>
                 <w:lang w:val="en-US"/>
               </w:rPr>
+              <w:lastRenderedPageBreak/>
               <w:br/>
             </w:r>
             <w:r>
@@ -11872,7 +12138,6 @@
           <w:szCs w:val="24"/>
           <w:lang w:val="ru-RU"/>
         </w:rPr>
-        <w:lastRenderedPageBreak/>
         <w:t>Запуск сервера на восстановленных данных</w:t>
       </w:r>
     </w:p>
@@ -12319,6 +12584,7 @@
                 <w:rFonts w:ascii="Times New Roman" w:hAnsi="Times New Roman" w:cs="Times New Roman"/>
                 <w:lang w:val="en-US"/>
               </w:rPr>
+              <w:lastRenderedPageBreak/>
               <w:t xml:space="preserve">-- </w:t>
             </w:r>
             <w:r>
@@ -13343,6 +13609,7 @@
           <w:rFonts w:ascii="Times New Roman" w:hAnsi="Times New Roman" w:cs="Times New Roman"/>
           <w:color w:val="000000" w:themeColor="text1"/>
         </w:rPr>
+        <w:lastRenderedPageBreak/>
         <w:t>Проверим</w:t>
       </w:r>
       <w:proofErr w:type="spellEnd"/>
@@ -13639,7 +13906,7 @@
               <w:rPr>
                 <w:rFonts w:ascii="Times New Roman" w:hAnsi="Times New Roman" w:cs="Times New Roman"/>
                 <w:color w:val="000000" w:themeColor="text1"/>
-                <w:lang w:val="en-US"/>
+                <w:lang w:val="ru-RU"/>
               </w:rPr>
             </w:pPr>
             <w:r>
@@ -13655,7 +13922,7 @@
               <w:rPr>
                 <w:rFonts w:ascii="Times New Roman" w:hAnsi="Times New Roman" w:cs="Times New Roman"/>
                 <w:color w:val="000000" w:themeColor="text1"/>
-                <w:lang w:val="en-US"/>
+                <w:lang w:val="ru-RU"/>
               </w:rPr>
               <w:t xml:space="preserve">2 </w:t>
             </w:r>
@@ -13663,7 +13930,7 @@
               <w:rPr>
                 <w:rFonts w:ascii="Times New Roman" w:hAnsi="Times New Roman" w:cs="Times New Roman"/>
                 <w:color w:val="000000" w:themeColor="text1"/>
-                <w:lang w:val="en-US"/>
+                <w:lang w:val="ru-RU"/>
               </w:rPr>
               <w:t xml:space="preserve"> </w:t>
             </w:r>
@@ -13671,7 +13938,7 @@
               <w:rPr>
                 <w:rFonts w:ascii="Times New Roman" w:hAnsi="Times New Roman" w:cs="Times New Roman"/>
                 <w:color w:val="000000" w:themeColor="text1"/>
-                <w:lang w:val="en-US"/>
+                <w:lang w:val="ru-RU"/>
               </w:rPr>
               <w:t>|</w:t>
             </w:r>
@@ -13680,7 +13947,7 @@
               <w:rPr>
                 <w:rFonts w:ascii="Times New Roman" w:hAnsi="Times New Roman" w:cs="Times New Roman"/>
                 <w:color w:val="000000" w:themeColor="text1"/>
-                <w:lang w:val="en-US"/>
+                <w:lang w:val="ru-RU"/>
               </w:rPr>
               <w:t xml:space="preserve"> </w:t>
             </w:r>
@@ -13696,7 +13963,7 @@
               <w:rPr>
                 <w:rFonts w:ascii="Times New Roman" w:hAnsi="Times New Roman" w:cs="Times New Roman"/>
                 <w:color w:val="000000" w:themeColor="text1"/>
-                <w:lang w:val="en-US"/>
+                <w:lang w:val="ru-RU"/>
               </w:rPr>
               <w:t xml:space="preserve">2 </w:t>
             </w:r>
@@ -13704,7 +13971,7 @@
               <w:rPr>
                 <w:rFonts w:ascii="Times New Roman" w:hAnsi="Times New Roman" w:cs="Times New Roman"/>
                 <w:color w:val="000000" w:themeColor="text1"/>
-                <w:lang w:val="en-US"/>
+                <w:lang w:val="ru-RU"/>
               </w:rPr>
               <w:t xml:space="preserve"> </w:t>
             </w:r>
@@ -13712,7 +13979,7 @@
               <w:rPr>
                 <w:rFonts w:ascii="Times New Roman" w:hAnsi="Times New Roman" w:cs="Times New Roman"/>
                 <w:color w:val="000000" w:themeColor="text1"/>
-                <w:lang w:val="en-US"/>
+                <w:lang w:val="ru-RU"/>
               </w:rPr>
               <w:t xml:space="preserve">| </w:t>
             </w:r>
@@ -13728,7 +13995,7 @@
               <w:rPr>
                 <w:rFonts w:ascii="Times New Roman" w:hAnsi="Times New Roman" w:cs="Times New Roman"/>
                 <w:color w:val="000000" w:themeColor="text1"/>
-                <w:lang w:val="en-US"/>
+                <w:lang w:val="ru-RU"/>
               </w:rPr>
               <w:t>2</w:t>
             </w:r>
@@ -13738,14 +14005,14 @@
               <w:rPr>
                 <w:rFonts w:ascii="Times New Roman" w:hAnsi="Times New Roman" w:cs="Times New Roman"/>
                 <w:color w:val="000000" w:themeColor="text1"/>
-                <w:lang w:val="en-US"/>
+                <w:lang w:val="ru-RU"/>
               </w:rPr>
             </w:pPr>
             <w:r>
               <w:rPr>
                 <w:rFonts w:ascii="Times New Roman" w:hAnsi="Times New Roman" w:cs="Times New Roman"/>
                 <w:color w:val="000000" w:themeColor="text1"/>
-                <w:lang w:val="en-US"/>
+                <w:lang w:val="ru-RU"/>
               </w:rPr>
               <w:t xml:space="preserve">  </w:t>
             </w:r>
@@ -13754,7 +14021,7 @@
               <w:rPr>
                 <w:rFonts w:ascii="Times New Roman" w:hAnsi="Times New Roman" w:cs="Times New Roman"/>
                 <w:color w:val="000000" w:themeColor="text1"/>
-                <w:lang w:val="en-US"/>
+                <w:lang w:val="ru-RU"/>
               </w:rPr>
               <w:t xml:space="preserve">3 </w:t>
             </w:r>
@@ -13762,7 +14029,7 @@
               <w:rPr>
                 <w:rFonts w:ascii="Times New Roman" w:hAnsi="Times New Roman" w:cs="Times New Roman"/>
                 <w:color w:val="000000" w:themeColor="text1"/>
-                <w:lang w:val="en-US"/>
+                <w:lang w:val="ru-RU"/>
               </w:rPr>
               <w:t xml:space="preserve"> </w:t>
             </w:r>
@@ -13770,7 +14037,7 @@
               <w:rPr>
                 <w:rFonts w:ascii="Times New Roman" w:hAnsi="Times New Roman" w:cs="Times New Roman"/>
                 <w:color w:val="000000" w:themeColor="text1"/>
-                <w:lang w:val="en-US"/>
+                <w:lang w:val="ru-RU"/>
               </w:rPr>
               <w:t>|</w:t>
             </w:r>
@@ -13779,7 +14046,7 @@
               <w:rPr>
                 <w:rFonts w:ascii="Times New Roman" w:hAnsi="Times New Roman" w:cs="Times New Roman"/>
                 <w:color w:val="000000" w:themeColor="text1"/>
-                <w:lang w:val="en-US"/>
+                <w:lang w:val="ru-RU"/>
               </w:rPr>
               <w:t xml:space="preserve"> </w:t>
             </w:r>
@@ -13795,7 +14062,7 @@
               <w:rPr>
                 <w:rFonts w:ascii="Times New Roman" w:hAnsi="Times New Roman" w:cs="Times New Roman"/>
                 <w:color w:val="000000" w:themeColor="text1"/>
-                <w:lang w:val="en-US"/>
+                <w:lang w:val="ru-RU"/>
               </w:rPr>
               <w:t xml:space="preserve">3 </w:t>
             </w:r>
@@ -13803,7 +14070,7 @@
               <w:rPr>
                 <w:rFonts w:ascii="Times New Roman" w:hAnsi="Times New Roman" w:cs="Times New Roman"/>
                 <w:color w:val="000000" w:themeColor="text1"/>
-                <w:lang w:val="en-US"/>
+                <w:lang w:val="ru-RU"/>
               </w:rPr>
               <w:t xml:space="preserve"> </w:t>
             </w:r>
@@ -13811,7 +14078,7 @@
               <w:rPr>
                 <w:rFonts w:ascii="Times New Roman" w:hAnsi="Times New Roman" w:cs="Times New Roman"/>
                 <w:color w:val="000000" w:themeColor="text1"/>
-                <w:lang w:val="en-US"/>
+                <w:lang w:val="ru-RU"/>
               </w:rPr>
               <w:t xml:space="preserve">| </w:t>
             </w:r>
@@ -13827,7 +14094,7 @@
               <w:rPr>
                 <w:rFonts w:ascii="Times New Roman" w:hAnsi="Times New Roman" w:cs="Times New Roman"/>
                 <w:color w:val="000000" w:themeColor="text1"/>
-                <w:lang w:val="en-US"/>
+                <w:lang w:val="ru-RU"/>
               </w:rPr>
               <w:t>3</w:t>
             </w:r>
@@ -13844,7 +14111,7 @@
               <w:rPr>
                 <w:rFonts w:ascii="Times New Roman" w:hAnsi="Times New Roman" w:cs="Times New Roman"/>
                 <w:color w:val="000000" w:themeColor="text1"/>
-                <w:lang w:val="en-US"/>
+                <w:lang w:val="ru-RU"/>
               </w:rPr>
               <w:t xml:space="preserve">   </w:t>
             </w:r>
@@ -13852,7 +14119,7 @@
               <w:rPr>
                 <w:rFonts w:ascii="Times New Roman" w:hAnsi="Times New Roman" w:cs="Times New Roman"/>
                 <w:color w:val="000000" w:themeColor="text1"/>
-                <w:lang w:val="en-US"/>
+                <w:lang w:val="ru-RU"/>
               </w:rPr>
               <w:t xml:space="preserve"> </w:t>
             </w:r>
@@ -13860,7 +14127,7 @@
               <w:rPr>
                 <w:rFonts w:ascii="Times New Roman" w:hAnsi="Times New Roman" w:cs="Times New Roman"/>
                 <w:color w:val="000000" w:themeColor="text1"/>
-                <w:lang w:val="en-US"/>
+                <w:lang w:val="ru-RU"/>
               </w:rPr>
               <w:t xml:space="preserve"> </w:t>
             </w:r>
@@ -13868,7 +14135,7 @@
               <w:rPr>
                 <w:rFonts w:ascii="Times New Roman" w:hAnsi="Times New Roman" w:cs="Times New Roman"/>
                 <w:color w:val="000000" w:themeColor="text1"/>
-                <w:lang w:val="en-US"/>
+                <w:lang w:val="ru-RU"/>
               </w:rPr>
               <w:t xml:space="preserve"> </w:t>
             </w:r>
@@ -14207,7 +14474,6 @@
                 <w:color w:val="000000" w:themeColor="text1"/>
                 <w:lang w:val="en-US"/>
               </w:rPr>
-              <w:lastRenderedPageBreak/>
               <w:t xml:space="preserve">-- </w:t>
             </w:r>
             <w:r>
@@ -17543,7 +17809,6 @@
   <w:style w:type="character" w:default="1" w:styleId="a0">
     <w:name w:val="Default Paragraph Font"/>
     <w:uiPriority w:val="1"/>
-    <w:semiHidden/>
     <w:unhideWhenUsed/>
   </w:style>
   <w:style w:type="table" w:default="1" w:styleId="a1">
@@ -18424,28 +18689,28 @@
 </file>
 
 <file path=customXml/item1.xml><?xml version="1.0" encoding="utf-8"?>
-<b:Sources xmlns:b="http://schemas.openxmlformats.org/officeDocument/2006/bibliography" xmlns="http://schemas.openxmlformats.org/officeDocument/2006/bibliography" SelectedStyle="\APASixthEditionOfficeOnline.xsl" StyleName="APA" Version="6"/>
-</file>
-
-<file path=customXml/item2.xml><?xml version="1.0" encoding="utf-8"?>
 <go:gDocsCustomXmlDataStorage xmlns:go="http://customooxmlschemas.google.com/" xmlns:r="http://schemas.openxmlformats.org/officeDocument/2006/relationships" uri="GoogleDocsCustomDataVersion2">
   <go:docsCustomData xmlns:go="http://customooxmlschemas.google.com/" roundtripDataSignature="AMtx7mjwruTx+Vn/MDAX/44QgQzc+AP2Ag==">CgMxLjAaHwoBMBIaChgICVIUChJ0YWJsZS44OTd0NXlmdTg0cWQaHwoBMRIaChgICVIUChJ0YWJsZS5kczg1cWF0bWl6dm4yDmguMWR4YmM5MTJqNXNhMg5oLnR1aDlyZ2JhaGY0ZDIOaC5nM3g0NWQ4ZmVpZWk4AHIhMUNmRUxpcVc2YnEwSHB1aWZkcDJZSzFENklNNzV4Q3k3</go:docsCustomData>
 </go:gDocsCustomXmlDataStorage>
 </file>
 
-<file path=customXml/itemProps1.xml><?xml version="1.0" encoding="utf-8"?>
-<ds:datastoreItem xmlns:ds="http://schemas.openxmlformats.org/officeDocument/2006/customXml" ds:itemID="{34F984A3-66A3-43B7-A0AA-61F4BAE2E3FF}">
-  <ds:schemaRefs>
-    <ds:schemaRef ds:uri="http://schemas.openxmlformats.org/officeDocument/2006/bibliography"/>
-  </ds:schemaRefs>
-</ds:datastoreItem>
+<file path=customXml/item2.xml><?xml version="1.0" encoding="utf-8"?>
+<b:Sources xmlns:b="http://schemas.openxmlformats.org/officeDocument/2006/bibliography" xmlns="http://schemas.openxmlformats.org/officeDocument/2006/bibliography" SelectedStyle="\APASixthEditionOfficeOnline.xsl" StyleName="APA" Version="6"/>
 </file>
 
-<file path=customXml/itemProps2.xml><?xml version="1.0" encoding="utf-8"?>
+<file path=customXml/itemProps1.xml><?xml version="1.0" encoding="utf-8"?>
 <ds:datastoreItem xmlns:ds="http://schemas.openxmlformats.org/officeDocument/2006/customXml" ds:itemID="{11111111-1234-1234-1234-123412341234}">
   <ds:schemaRefs>
     <ds:schemaRef ds:uri="http://customooxmlschemas.google.com/"/>
     <ds:schemaRef ds:uri="http://schemas.openxmlformats.org/officeDocument/2006/relationships"/>
   </ds:schemaRefs>
 </ds:datastoreItem>
+</file>
+
+<file path=customXml/itemProps2.xml><?xml version="1.0" encoding="utf-8"?>
+<ds:datastoreItem xmlns:ds="http://schemas.openxmlformats.org/officeDocument/2006/customXml" ds:itemID="{34F984A3-66A3-43B7-A0AA-61F4BAE2E3FF}">
+  <ds:schemaRefs>
+    <ds:schemaRef ds:uri="http://schemas.openxmlformats.org/officeDocument/2006/bibliography"/>
+  </ds:schemaRefs>
+</ds:datastoreItem>
 </file>
</xml_diff>